<commit_message>
Podziel bibliografię na sekcje: Literatura / Akty prawne / Netografia
- Literatura: 84 pozycje (alfabetycznie)
- Akty prawne: 3 pozycje (chronologicznie)
- Netografia: 7 pozycji (alfabetycznie)
- nagłówki sekcji pogrubione, Times New Roman 12 bez zmian
</commit_message>
<xml_diff>
--- a/praca-magisterska/Bibliografia_poprawiona.docx
+++ b/praca-magisterska/Bibliografia_poprawiona.docx
@@ -4,7 +4,7 @@
   <w:body>
     <w:p>
       <w:pPr>
-        <w:spacing w:after="360" w:line="360" w:lineRule="auto"/>
+        <w:spacing w:line="360" w:lineRule="auto" w:after="360"/>
         <w:jc w:val="center"/>
       </w:pPr>
       <w:r>
@@ -15,6 +15,22 @@
           <w:sz w:val="24"/>
         </w:rPr>
         <w:t>Bibliografia</w:t>
+      </w:r>
+    </w:p>
+    <w:p>
+      <w:pPr>
+        <w:keepNext/>
+        <w:spacing w:line="360" w:lineRule="auto" w:before="0" w:after="240"/>
+        <w:jc w:val="left"/>
+      </w:pPr>
+      <w:r>
+        <w:rPr>
+          <w:rFonts w:ascii="Times New Roman" w:hAnsi="Times New Roman" w:cs="Times New Roman" w:eastAsia="Times New Roman"/>
+          <w:b/>
+          <w:i w:val="0"/>
+          <w:sz w:val="24"/>
+        </w:rPr>
+        <w:t>Literatura</w:t>
       </w:r>
     </w:p>
     <w:p>
@@ -26,6 +42,7 @@
       <w:r>
         <w:rPr>
           <w:rFonts w:ascii="Times New Roman" w:hAnsi="Times New Roman" w:cs="Times New Roman" w:eastAsia="Times New Roman"/>
+          <w:b w:val="0"/>
           <w:i w:val="0"/>
           <w:sz w:val="24"/>
         </w:rPr>
@@ -34,6 +51,7 @@
       <w:r>
         <w:rPr>
           <w:rFonts w:ascii="Times New Roman" w:hAnsi="Times New Roman" w:cs="Times New Roman" w:eastAsia="Times New Roman"/>
+          <w:b w:val="0"/>
           <w:i/>
           <w:sz w:val="24"/>
         </w:rPr>
@@ -42,6 +60,7 @@
       <w:r>
         <w:rPr>
           <w:rFonts w:ascii="Times New Roman" w:hAnsi="Times New Roman" w:cs="Times New Roman" w:eastAsia="Times New Roman"/>
+          <w:b w:val="0"/>
           <w:i w:val="0"/>
           <w:sz w:val="24"/>
         </w:rPr>
@@ -57,6 +76,7 @@
       <w:r>
         <w:rPr>
           <w:rFonts w:ascii="Times New Roman" w:hAnsi="Times New Roman" w:cs="Times New Roman" w:eastAsia="Times New Roman"/>
+          <w:b w:val="0"/>
           <w:i w:val="0"/>
           <w:sz w:val="24"/>
         </w:rPr>
@@ -65,6 +85,7 @@
       <w:r>
         <w:rPr>
           <w:rFonts w:ascii="Times New Roman" w:hAnsi="Times New Roman" w:cs="Times New Roman" w:eastAsia="Times New Roman"/>
+          <w:b w:val="0"/>
           <w:i/>
           <w:sz w:val="24"/>
         </w:rPr>
@@ -73,6 +94,7 @@
       <w:r>
         <w:rPr>
           <w:rFonts w:ascii="Times New Roman" w:hAnsi="Times New Roman" w:cs="Times New Roman" w:eastAsia="Times New Roman"/>
+          <w:b w:val="0"/>
           <w:i w:val="0"/>
           <w:sz w:val="24"/>
         </w:rPr>
@@ -88,6 +110,7 @@
       <w:r>
         <w:rPr>
           <w:rFonts w:ascii="Times New Roman" w:hAnsi="Times New Roman" w:cs="Times New Roman" w:eastAsia="Times New Roman"/>
+          <w:b w:val="0"/>
           <w:i w:val="0"/>
           <w:sz w:val="24"/>
         </w:rPr>
@@ -96,6 +119,7 @@
       <w:r>
         <w:rPr>
           <w:rFonts w:ascii="Times New Roman" w:hAnsi="Times New Roman" w:cs="Times New Roman" w:eastAsia="Times New Roman"/>
+          <w:b w:val="0"/>
           <w:i/>
           <w:sz w:val="24"/>
         </w:rPr>
@@ -104,6 +128,7 @@
       <w:r>
         <w:rPr>
           <w:rFonts w:ascii="Times New Roman" w:hAnsi="Times New Roman" w:cs="Times New Roman" w:eastAsia="Times New Roman"/>
+          <w:b w:val="0"/>
           <w:i w:val="0"/>
           <w:sz w:val="24"/>
         </w:rPr>
@@ -119,6 +144,7 @@
       <w:r>
         <w:rPr>
           <w:rFonts w:ascii="Times New Roman" w:hAnsi="Times New Roman" w:cs="Times New Roman" w:eastAsia="Times New Roman"/>
+          <w:b w:val="0"/>
           <w:i w:val="0"/>
           <w:sz w:val="24"/>
         </w:rPr>
@@ -127,6 +153,7 @@
       <w:r>
         <w:rPr>
           <w:rFonts w:ascii="Times New Roman" w:hAnsi="Times New Roman" w:cs="Times New Roman" w:eastAsia="Times New Roman"/>
+          <w:b w:val="0"/>
           <w:i/>
           <w:sz w:val="24"/>
         </w:rPr>
@@ -135,6 +162,7 @@
       <w:r>
         <w:rPr>
           <w:rFonts w:ascii="Times New Roman" w:hAnsi="Times New Roman" w:cs="Times New Roman" w:eastAsia="Times New Roman"/>
+          <w:b w:val="0"/>
           <w:i w:val="0"/>
           <w:sz w:val="24"/>
         </w:rPr>
@@ -150,26 +178,29 @@
       <w:r>
         <w:rPr>
           <w:rFonts w:ascii="Times New Roman" w:hAnsi="Times New Roman" w:cs="Times New Roman" w:eastAsia="Times New Roman"/>
+          <w:b w:val="0"/>
           <w:i w:val="0"/>
           <w:sz w:val="24"/>
         </w:rPr>
-        <w:t xml:space="preserve">Brząkała A., </w:t>
-      </w:r>
-      <w:r>
-        <w:rPr>
-          <w:rFonts w:ascii="Times New Roman" w:hAnsi="Times New Roman" w:cs="Times New Roman" w:eastAsia="Times New Roman"/>
+        <w:t xml:space="preserve">Bujak-Lechowicz J., </w:t>
+      </w:r>
+      <w:r>
+        <w:rPr>
+          <w:rFonts w:ascii="Times New Roman" w:hAnsi="Times New Roman" w:cs="Times New Roman" w:eastAsia="Times New Roman"/>
+          <w:b w:val="0"/>
           <w:i/>
           <w:sz w:val="24"/>
         </w:rPr>
-        <w:t>Sztuka pantomimy jako metoda wspomagająca komunikację w pracy z dziećmi z zaburzeniami ze spektrum autyzmu</w:t>
-      </w:r>
-      <w:r>
-        <w:rPr>
-          <w:rFonts w:ascii="Times New Roman" w:hAnsi="Times New Roman" w:cs="Times New Roman" w:eastAsia="Times New Roman"/>
+        <w:t>Nauczyciele o dramie – przyczynek do dyskusji</w:t>
+      </w:r>
+      <w:r>
+        <w:rPr>
+          <w:rFonts w:ascii="Times New Roman" w:hAnsi="Times New Roman" w:cs="Times New Roman" w:eastAsia="Times New Roman"/>
+          <w:b w:val="0"/>
           <w:i w:val="0"/>
           <w:sz w:val="24"/>
         </w:rPr>
-        <w:t>, https://pedagogika-specjalna.edu.pl/wp-content/uploads/2018/09/Pantomima-ZSS-S%C5%82upia.pdf (dostęp: 26.04.2026).</w:t>
+        <w:t>, „Nauczyciel i Szkoła”, nr 3–4 (32–33), 2006, s. 171–179.</w:t>
       </w:r>
     </w:p>
     <w:p>
@@ -181,26 +212,29 @@
       <w:r>
         <w:rPr>
           <w:rFonts w:ascii="Times New Roman" w:hAnsi="Times New Roman" w:cs="Times New Roman" w:eastAsia="Times New Roman"/>
+          <w:b w:val="0"/>
           <w:i w:val="0"/>
           <w:sz w:val="24"/>
         </w:rPr>
-        <w:t xml:space="preserve">Bujak-Lechowicz J., </w:t>
-      </w:r>
-      <w:r>
-        <w:rPr>
-          <w:rFonts w:ascii="Times New Roman" w:hAnsi="Times New Roman" w:cs="Times New Roman" w:eastAsia="Times New Roman"/>
+        <w:t xml:space="preserve">Copik I., Szymik E., </w:t>
+      </w:r>
+      <w:r>
+        <w:rPr>
+          <w:rFonts w:ascii="Times New Roman" w:hAnsi="Times New Roman" w:cs="Times New Roman" w:eastAsia="Times New Roman"/>
+          <w:b w:val="0"/>
           <w:i/>
           <w:sz w:val="24"/>
         </w:rPr>
-        <w:t>Nauczyciele o dramie – przyczynek do dyskusji</w:t>
-      </w:r>
-      <w:r>
-        <w:rPr>
-          <w:rFonts w:ascii="Times New Roman" w:hAnsi="Times New Roman" w:cs="Times New Roman" w:eastAsia="Times New Roman"/>
+        <w:t>Drama w pracy wychowawczej nauczyciela polonisty</w:t>
+      </w:r>
+      <w:r>
+        <w:rPr>
+          <w:rFonts w:ascii="Times New Roman" w:hAnsi="Times New Roman" w:cs="Times New Roman" w:eastAsia="Times New Roman"/>
+          <w:b w:val="0"/>
           <w:i w:val="0"/>
           <w:sz w:val="24"/>
         </w:rPr>
-        <w:t>, „Nauczyciel i Szkoła”, nr 3–4 (32–33), 2006, s. 171–179.</w:t>
+        <w:t>, „Nauczyciel i Szkoła”, nr 2, 2013, s. 255–265.</w:t>
       </w:r>
     </w:p>
     <w:p>
@@ -212,26 +246,29 @@
       <w:r>
         <w:rPr>
           <w:rFonts w:ascii="Times New Roman" w:hAnsi="Times New Roman" w:cs="Times New Roman" w:eastAsia="Times New Roman"/>
+          <w:b w:val="0"/>
           <w:i w:val="0"/>
           <w:sz w:val="24"/>
         </w:rPr>
-        <w:t xml:space="preserve">Copik I., Szymik E., </w:t>
-      </w:r>
-      <w:r>
-        <w:rPr>
-          <w:rFonts w:ascii="Times New Roman" w:hAnsi="Times New Roman" w:cs="Times New Roman" w:eastAsia="Times New Roman"/>
+        <w:t xml:space="preserve">Czerepaniak-Walczak M., </w:t>
+      </w:r>
+      <w:r>
+        <w:rPr>
+          <w:rFonts w:ascii="Times New Roman" w:hAnsi="Times New Roman" w:cs="Times New Roman" w:eastAsia="Times New Roman"/>
+          <w:b w:val="0"/>
           <w:i/>
           <w:sz w:val="24"/>
         </w:rPr>
-        <w:t>Drama w pracy wychowawczej nauczyciela polonisty</w:t>
-      </w:r>
-      <w:r>
-        <w:rPr>
-          <w:rFonts w:ascii="Times New Roman" w:hAnsi="Times New Roman" w:cs="Times New Roman" w:eastAsia="Times New Roman"/>
+        <w:t>Aspekty i źródła profesjonalnej refleksji nauczyciela</w:t>
+      </w:r>
+      <w:r>
+        <w:rPr>
+          <w:rFonts w:ascii="Times New Roman" w:hAnsi="Times New Roman" w:cs="Times New Roman" w:eastAsia="Times New Roman"/>
+          <w:b w:val="0"/>
           <w:i w:val="0"/>
           <w:sz w:val="24"/>
         </w:rPr>
-        <w:t>, „Nauczyciel i Szkoła”, nr 2, 2013, s. 255–265.</w:t>
+        <w:t>, Wydawnictwo „Edytor”, Toruń 1997.</w:t>
       </w:r>
     </w:p>
     <w:p>
@@ -243,26 +280,47 @@
       <w:r>
         <w:rPr>
           <w:rFonts w:ascii="Times New Roman" w:hAnsi="Times New Roman" w:cs="Times New Roman" w:eastAsia="Times New Roman"/>
+          <w:b w:val="0"/>
           <w:i w:val="0"/>
           <w:sz w:val="24"/>
         </w:rPr>
-        <w:t xml:space="preserve">Czerepaniak-Walczak M., </w:t>
-      </w:r>
-      <w:r>
-        <w:rPr>
-          <w:rFonts w:ascii="Times New Roman" w:hAnsi="Times New Roman" w:cs="Times New Roman" w:eastAsia="Times New Roman"/>
+        <w:t xml:space="preserve">Czub M., </w:t>
+      </w:r>
+      <w:r>
+        <w:rPr>
+          <w:rFonts w:ascii="Times New Roman" w:hAnsi="Times New Roman" w:cs="Times New Roman" w:eastAsia="Times New Roman"/>
+          <w:b w:val="0"/>
           <w:i/>
           <w:sz w:val="24"/>
         </w:rPr>
-        <w:t>Aspekty i źródła profesjonalnej refleksji nauczyciela</w:t>
-      </w:r>
-      <w:r>
-        <w:rPr>
-          <w:rFonts w:ascii="Times New Roman" w:hAnsi="Times New Roman" w:cs="Times New Roman" w:eastAsia="Times New Roman"/>
+        <w:t>Rozwój kompetencji społeczno-emocjonalnych dziecka</w:t>
+      </w:r>
+      <w:r>
+        <w:rPr>
+          <w:rFonts w:ascii="Times New Roman" w:hAnsi="Times New Roman" w:cs="Times New Roman" w:eastAsia="Times New Roman"/>
+          <w:b w:val="0"/>
           <w:i w:val="0"/>
           <w:sz w:val="24"/>
         </w:rPr>
-        <w:t>, Wydawnictwo „Edytor”, Toruń 1997.</w:t>
+        <w:t xml:space="preserve">, [w:] </w:t>
+      </w:r>
+      <w:r>
+        <w:rPr>
+          <w:rFonts w:ascii="Times New Roman" w:hAnsi="Times New Roman" w:cs="Times New Roman" w:eastAsia="Times New Roman"/>
+          <w:b w:val="0"/>
+          <w:i/>
+          <w:sz w:val="24"/>
+        </w:rPr>
+        <w:t>Diagnoza funkcjonowania społeczno-emocjonalnego dziecka w wieku od 1,5 do 5,5 lat</w:t>
+      </w:r>
+      <w:r>
+        <w:rPr>
+          <w:rFonts w:ascii="Times New Roman" w:hAnsi="Times New Roman" w:cs="Times New Roman" w:eastAsia="Times New Roman"/>
+          <w:b w:val="0"/>
+          <w:i w:val="0"/>
+          <w:sz w:val="24"/>
+        </w:rPr>
+        <w:t>, M. Czub (red.), Instytut Badań Edukacyjnych, Warszawa 2014, s. 11–25.</w:t>
       </w:r>
     </w:p>
     <w:p>
@@ -274,42 +332,20 @@
       <w:r>
         <w:rPr>
           <w:rFonts w:ascii="Times New Roman" w:hAnsi="Times New Roman" w:cs="Times New Roman" w:eastAsia="Times New Roman"/>
+          <w:b w:val="0"/>
+          <w:i/>
+          <w:sz w:val="24"/>
+        </w:rPr>
+        <w:t>Drama w edukacji</w:t>
+      </w:r>
+      <w:r>
+        <w:rPr>
+          <w:rFonts w:ascii="Times New Roman" w:hAnsi="Times New Roman" w:cs="Times New Roman" w:eastAsia="Times New Roman"/>
+          <w:b w:val="0"/>
           <w:i w:val="0"/>
           <w:sz w:val="24"/>
         </w:rPr>
-        <w:t xml:space="preserve">Czub M., </w:t>
-      </w:r>
-      <w:r>
-        <w:rPr>
-          <w:rFonts w:ascii="Times New Roman" w:hAnsi="Times New Roman" w:cs="Times New Roman" w:eastAsia="Times New Roman"/>
-          <w:i/>
-          <w:sz w:val="24"/>
-        </w:rPr>
-        <w:t>Rozwój kompetencji społeczno-emocjonalnych dziecka</w:t>
-      </w:r>
-      <w:r>
-        <w:rPr>
-          <w:rFonts w:ascii="Times New Roman" w:hAnsi="Times New Roman" w:cs="Times New Roman" w:eastAsia="Times New Roman"/>
-          <w:i w:val="0"/>
-          <w:sz w:val="24"/>
-        </w:rPr>
-        <w:t xml:space="preserve">, [w:] </w:t>
-      </w:r>
-      <w:r>
-        <w:rPr>
-          <w:rFonts w:ascii="Times New Roman" w:hAnsi="Times New Roman" w:cs="Times New Roman" w:eastAsia="Times New Roman"/>
-          <w:i/>
-          <w:sz w:val="24"/>
-        </w:rPr>
-        <w:t>Diagnoza funkcjonowania społeczno-emocjonalnego dziecka w wieku od 1,5 do 5,5 lat</w:t>
-      </w:r>
-      <w:r>
-        <w:rPr>
-          <w:rFonts w:ascii="Times New Roman" w:hAnsi="Times New Roman" w:cs="Times New Roman" w:eastAsia="Times New Roman"/>
-          <w:i w:val="0"/>
-          <w:sz w:val="24"/>
-        </w:rPr>
-        <w:t>, M. Czub (red.), Instytut Badań Edukacyjnych, Warszawa 2014, s. 11–25.</w:t>
+        <w:t>, Wydawnictwo Naukowe Instytutu Filozofii Uniwersytetu im. Adama Mickiewicza, Poznań [b.r.].</w:t>
       </w:r>
     </w:p>
     <w:p>
@@ -321,18 +357,20 @@
       <w:r>
         <w:rPr>
           <w:rFonts w:ascii="Times New Roman" w:hAnsi="Times New Roman" w:cs="Times New Roman" w:eastAsia="Times New Roman"/>
+          <w:b w:val="0"/>
           <w:i/>
           <w:sz w:val="24"/>
         </w:rPr>
-        <w:t>Drama i jej walory w pracy z dziećmi</w:t>
-      </w:r>
-      <w:r>
-        <w:rPr>
-          <w:rFonts w:ascii="Times New Roman" w:hAnsi="Times New Roman" w:cs="Times New Roman" w:eastAsia="Times New Roman"/>
+        <w:t>Drama w STOP-KLATCE: w kierunku pozytywnej zmiany społecznej</w:t>
+      </w:r>
+      <w:r>
+        <w:rPr>
+          <w:rFonts w:ascii="Times New Roman" w:hAnsi="Times New Roman" w:cs="Times New Roman" w:eastAsia="Times New Roman"/>
+          <w:b w:val="0"/>
           <w:i w:val="0"/>
           <w:sz w:val="24"/>
         </w:rPr>
-        <w:t>, https://www.profesor.pl/publikacja,13690,Artykuly,Drama-i-jej-walory-w-pracy-z-dziecmi (dostęp: 12.04.2026).</w:t>
+        <w:t>, A. Jagiełło-Rusiłowski (red.), Stowarzyszenie Praktyków Dramy STOP-KLATKA, Warszawa 2010.</w:t>
       </w:r>
     </w:p>
     <w:p>
@@ -344,18 +382,29 @@
       <w:r>
         <w:rPr>
           <w:rFonts w:ascii="Times New Roman" w:hAnsi="Times New Roman" w:cs="Times New Roman" w:eastAsia="Times New Roman"/>
+          <w:b w:val="0"/>
+          <w:i w:val="0"/>
+          <w:sz w:val="24"/>
+        </w:rPr>
+        <w:t xml:space="preserve">Dutkiewicz W., </w:t>
+      </w:r>
+      <w:r>
+        <w:rPr>
+          <w:rFonts w:ascii="Times New Roman" w:hAnsi="Times New Roman" w:cs="Times New Roman" w:eastAsia="Times New Roman"/>
+          <w:b w:val="0"/>
           <w:i/>
           <w:sz w:val="24"/>
         </w:rPr>
-        <w:t>Drama – możliwości i zagrożenia. Zarys problematyki</w:t>
-      </w:r>
-      <w:r>
-        <w:rPr>
-          <w:rFonts w:ascii="Times New Roman" w:hAnsi="Times New Roman" w:cs="Times New Roman" w:eastAsia="Times New Roman"/>
+        <w:t>Podstawy metodologii badań do pracy magisterskiej i licencjackiej z pedagogiki</w:t>
+      </w:r>
+      <w:r>
+        <w:rPr>
+          <w:rFonts w:ascii="Times New Roman" w:hAnsi="Times New Roman" w:cs="Times New Roman" w:eastAsia="Times New Roman"/>
+          <w:b w:val="0"/>
           <w:i w:val="0"/>
           <w:sz w:val="24"/>
         </w:rPr>
-        <w:t>, https://open.icm.edu.pl/bitstreams/846d44e0-c526-4039-8b4a-5e6423f2e765/download (dostęp: 12.04.2026).</w:t>
+        <w:t>, Wydawnictwo Stachurski, Kielce 2004.</w:t>
       </w:r>
     </w:p>
     <w:p>
@@ -367,18 +416,29 @@
       <w:r>
         <w:rPr>
           <w:rFonts w:ascii="Times New Roman" w:hAnsi="Times New Roman" w:cs="Times New Roman" w:eastAsia="Times New Roman"/>
+          <w:b w:val="0"/>
+          <w:i w:val="0"/>
+          <w:sz w:val="24"/>
+        </w:rPr>
+        <w:t xml:space="preserve">Dziamska D., Gudro M., </w:t>
+      </w:r>
+      <w:r>
+        <w:rPr>
+          <w:rFonts w:ascii="Times New Roman" w:hAnsi="Times New Roman" w:cs="Times New Roman" w:eastAsia="Times New Roman"/>
+          <w:b w:val="0"/>
           <w:i/>
           <w:sz w:val="24"/>
         </w:rPr>
-        <w:t>Drama w edukacji</w:t>
-      </w:r>
-      <w:r>
-        <w:rPr>
-          <w:rFonts w:ascii="Times New Roman" w:hAnsi="Times New Roman" w:cs="Times New Roman" w:eastAsia="Times New Roman"/>
+        <w:t>Bawię się i uczę. Edukacja przez ruch i drama w kształceniu wczesnoszkolnym</w:t>
+      </w:r>
+      <w:r>
+        <w:rPr>
+          <w:rFonts w:ascii="Times New Roman" w:hAnsi="Times New Roman" w:cs="Times New Roman" w:eastAsia="Times New Roman"/>
+          <w:b w:val="0"/>
           <w:i w:val="0"/>
           <w:sz w:val="24"/>
         </w:rPr>
-        <w:t>, Wydawnictwo Naukowe Instytutu Filozofii Uniwersytetu im. Adama Mickiewicza, Poznań [b.r.].</w:t>
+        <w:t>, Wydawnictwo Pedagogiczne ZNP, Kielce 2010.</w:t>
       </w:r>
     </w:p>
     <w:p>
@@ -390,18 +450,29 @@
       <w:r>
         <w:rPr>
           <w:rFonts w:ascii="Times New Roman" w:hAnsi="Times New Roman" w:cs="Times New Roman" w:eastAsia="Times New Roman"/>
+          <w:b w:val="0"/>
+          <w:i w:val="0"/>
+          <w:sz w:val="24"/>
+        </w:rPr>
+        <w:t xml:space="preserve">Dziedzic A., </w:t>
+      </w:r>
+      <w:r>
+        <w:rPr>
+          <w:rFonts w:ascii="Times New Roman" w:hAnsi="Times New Roman" w:cs="Times New Roman" w:eastAsia="Times New Roman"/>
+          <w:b w:val="0"/>
           <w:i/>
           <w:sz w:val="24"/>
         </w:rPr>
-        <w:t>Drama w STOP-KLATCE: w kierunku pozytywnej zmiany społecznej</w:t>
-      </w:r>
-      <w:r>
-        <w:rPr>
-          <w:rFonts w:ascii="Times New Roman" w:hAnsi="Times New Roman" w:cs="Times New Roman" w:eastAsia="Times New Roman"/>
+        <w:t>Drama a wychowanie</w:t>
+      </w:r>
+      <w:r>
+        <w:rPr>
+          <w:rFonts w:ascii="Times New Roman" w:hAnsi="Times New Roman" w:cs="Times New Roman" w:eastAsia="Times New Roman"/>
+          <w:b w:val="0"/>
           <w:i w:val="0"/>
           <w:sz w:val="24"/>
         </w:rPr>
-        <w:t>, A. Jagiełło-Rusiłowski (red.), Stowarzyszenie Praktyków Dramy STOP-KLATKA, Warszawa 2010.</w:t>
+        <w:t>, wyd. 3, Wydawnictwa CODN – Centralny Ośrodek Doskonalenia Nauczycieli, Warszawa 2000.</w:t>
       </w:r>
     </w:p>
     <w:p>
@@ -413,34 +484,29 @@
       <w:r>
         <w:rPr>
           <w:rFonts w:ascii="Times New Roman" w:hAnsi="Times New Roman" w:cs="Times New Roman" w:eastAsia="Times New Roman"/>
+          <w:b w:val="0"/>
+          <w:i w:val="0"/>
+          <w:sz w:val="24"/>
+        </w:rPr>
+        <w:t xml:space="preserve">Gałązka A., </w:t>
+      </w:r>
+      <w:r>
+        <w:rPr>
+          <w:rFonts w:ascii="Times New Roman" w:hAnsi="Times New Roman" w:cs="Times New Roman" w:eastAsia="Times New Roman"/>
+          <w:b w:val="0"/>
           <w:i/>
           <w:sz w:val="24"/>
         </w:rPr>
-        <w:t>Drama</w:t>
-      </w:r>
-      <w:r>
-        <w:rPr>
-          <w:rFonts w:ascii="Times New Roman" w:hAnsi="Times New Roman" w:cs="Times New Roman" w:eastAsia="Times New Roman"/>
+        <w:t>Rola dramy w twórczej przyśpieszonej edukacji lingwistycznej</w:t>
+      </w:r>
+      <w:r>
+        <w:rPr>
+          <w:rFonts w:ascii="Times New Roman" w:hAnsi="Times New Roman" w:cs="Times New Roman" w:eastAsia="Times New Roman"/>
+          <w:b w:val="0"/>
           <w:i w:val="0"/>
           <w:sz w:val="24"/>
         </w:rPr>
-        <w:t xml:space="preserve">, [w:] </w:t>
-      </w:r>
-      <w:r>
-        <w:rPr>
-          <w:rFonts w:ascii="Times New Roman" w:hAnsi="Times New Roman" w:cs="Times New Roman" w:eastAsia="Times New Roman"/>
-          <w:i/>
-          <w:sz w:val="24"/>
-        </w:rPr>
-        <w:t>Słownik języka polskiego PWN</w:t>
-      </w:r>
-      <w:r>
-        <w:rPr>
-          <w:rFonts w:ascii="Times New Roman" w:hAnsi="Times New Roman" w:cs="Times New Roman" w:eastAsia="Times New Roman"/>
-          <w:i w:val="0"/>
-          <w:sz w:val="24"/>
-        </w:rPr>
-        <w:t>, https://sjp.pwn.pl/slowniki/drama.html (dostęp: 03.12.2025).</w:t>
+        <w:t>, „Chowanna”, nr 2, 2002, s. 70–86.</w:t>
       </w:r>
     </w:p>
     <w:p>
@@ -452,34 +518,29 @@
       <w:r>
         <w:rPr>
           <w:rFonts w:ascii="Times New Roman" w:hAnsi="Times New Roman" w:cs="Times New Roman" w:eastAsia="Times New Roman"/>
+          <w:b w:val="0"/>
+          <w:i w:val="0"/>
+          <w:sz w:val="24"/>
+        </w:rPr>
+        <w:t xml:space="preserve">Gałązka A., </w:t>
+      </w:r>
+      <w:r>
+        <w:rPr>
+          <w:rFonts w:ascii="Times New Roman" w:hAnsi="Times New Roman" w:cs="Times New Roman" w:eastAsia="Times New Roman"/>
+          <w:b w:val="0"/>
           <w:i/>
           <w:sz w:val="24"/>
         </w:rPr>
-        <w:t>Drama</w:t>
-      </w:r>
-      <w:r>
-        <w:rPr>
-          <w:rFonts w:ascii="Times New Roman" w:hAnsi="Times New Roman" w:cs="Times New Roman" w:eastAsia="Times New Roman"/>
+        <w:t>Drama kreatywna a inteligencja emocjonalna. Przykład wykorzystania wybranego modelu badań empirycznych</w:t>
+      </w:r>
+      <w:r>
+        <w:rPr>
+          <w:rFonts w:ascii="Times New Roman" w:hAnsi="Times New Roman" w:cs="Times New Roman" w:eastAsia="Times New Roman"/>
+          <w:b w:val="0"/>
           <w:i w:val="0"/>
           <w:sz w:val="24"/>
         </w:rPr>
-        <w:t xml:space="preserve">, [w:] </w:t>
-      </w:r>
-      <w:r>
-        <w:rPr>
-          <w:rFonts w:ascii="Times New Roman" w:hAnsi="Times New Roman" w:cs="Times New Roman" w:eastAsia="Times New Roman"/>
-          <w:i/>
-          <w:sz w:val="24"/>
-        </w:rPr>
-        <w:t>Wielki słownik języka polskiego PAN</w:t>
-      </w:r>
-      <w:r>
-        <w:rPr>
-          <w:rFonts w:ascii="Times New Roman" w:hAnsi="Times New Roman" w:cs="Times New Roman" w:eastAsia="Times New Roman"/>
-          <w:i w:val="0"/>
-          <w:sz w:val="24"/>
-        </w:rPr>
-        <w:t>, Instytut Języka Polskiego PAN, https://wsjp.pl/haslo/podglad/52454/drama/5153346/w-edukacji (dostęp: 03.12.2025).</w:t>
+        <w:t>, „Chowanna”, nr 1, 2011, s. 83–104.</w:t>
       </w:r>
     </w:p>
     <w:p>
@@ -491,26 +552,29 @@
       <w:r>
         <w:rPr>
           <w:rFonts w:ascii="Times New Roman" w:hAnsi="Times New Roman" w:cs="Times New Roman" w:eastAsia="Times New Roman"/>
+          <w:b w:val="0"/>
           <w:i w:val="0"/>
           <w:sz w:val="24"/>
         </w:rPr>
-        <w:t xml:space="preserve">Dutkiewicz W., </w:t>
-      </w:r>
-      <w:r>
-        <w:rPr>
-          <w:rFonts w:ascii="Times New Roman" w:hAnsi="Times New Roman" w:cs="Times New Roman" w:eastAsia="Times New Roman"/>
+        <w:t xml:space="preserve">Gałązka A., </w:t>
+      </w:r>
+      <w:r>
+        <w:rPr>
+          <w:rFonts w:ascii="Times New Roman" w:hAnsi="Times New Roman" w:cs="Times New Roman" w:eastAsia="Times New Roman"/>
+          <w:b w:val="0"/>
           <w:i/>
           <w:sz w:val="24"/>
         </w:rPr>
-        <w:t>Podstawy metodologii badań do pracy magisterskiej i licencjackiej z pedagogiki</w:t>
-      </w:r>
-      <w:r>
-        <w:rPr>
-          <w:rFonts w:ascii="Times New Roman" w:hAnsi="Times New Roman" w:cs="Times New Roman" w:eastAsia="Times New Roman"/>
+        <w:t>Drama w rozwijaniu kompetencji społecznych i emocjonalnych dzieci w młodszym wieku szkolnym</w:t>
+      </w:r>
+      <w:r>
+        <w:rPr>
+          <w:rFonts w:ascii="Times New Roman" w:hAnsi="Times New Roman" w:cs="Times New Roman" w:eastAsia="Times New Roman"/>
+          <w:b w:val="0"/>
           <w:i w:val="0"/>
           <w:sz w:val="24"/>
         </w:rPr>
-        <w:t>, Wydawnictwo Stachurski, Kielce 2004.</w:t>
+        <w:t>, „Chowanna”, t. 2 (53), 2019, s. 145–158, DOI: 10.31261/CHOWANNA.2019.S.08.</w:t>
       </w:r>
     </w:p>
     <w:p>
@@ -522,26 +586,47 @@
       <w:r>
         <w:rPr>
           <w:rFonts w:ascii="Times New Roman" w:hAnsi="Times New Roman" w:cs="Times New Roman" w:eastAsia="Times New Roman"/>
+          <w:b w:val="0"/>
           <w:i w:val="0"/>
           <w:sz w:val="24"/>
         </w:rPr>
-        <w:t xml:space="preserve">Dziamska D., Gudro M., </w:t>
-      </w:r>
-      <w:r>
-        <w:rPr>
-          <w:rFonts w:ascii="Times New Roman" w:hAnsi="Times New Roman" w:cs="Times New Roman" w:eastAsia="Times New Roman"/>
+        <w:t xml:space="preserve">Głowiński M., </w:t>
+      </w:r>
+      <w:r>
+        <w:rPr>
+          <w:rFonts w:ascii="Times New Roman" w:hAnsi="Times New Roman" w:cs="Times New Roman" w:eastAsia="Times New Roman"/>
+          <w:b w:val="0"/>
           <w:i/>
           <w:sz w:val="24"/>
         </w:rPr>
-        <w:t>Bawię się i uczę. Edukacja przez ruch i drama w kształceniu wczesnoszkolnym</w:t>
-      </w:r>
-      <w:r>
-        <w:rPr>
-          <w:rFonts w:ascii="Times New Roman" w:hAnsi="Times New Roman" w:cs="Times New Roman" w:eastAsia="Times New Roman"/>
+        <w:t>Drama</w:t>
+      </w:r>
+      <w:r>
+        <w:rPr>
+          <w:rFonts w:ascii="Times New Roman" w:hAnsi="Times New Roman" w:cs="Times New Roman" w:eastAsia="Times New Roman"/>
+          <w:b w:val="0"/>
           <w:i w:val="0"/>
           <w:sz w:val="24"/>
         </w:rPr>
-        <w:t>, Wydawnictwo Pedagogiczne ZNP, Kielce 2010.</w:t>
+        <w:t xml:space="preserve">, [w:] </w:t>
+      </w:r>
+      <w:r>
+        <w:rPr>
+          <w:rFonts w:ascii="Times New Roman" w:hAnsi="Times New Roman" w:cs="Times New Roman" w:eastAsia="Times New Roman"/>
+          <w:b w:val="0"/>
+          <w:i/>
+          <w:sz w:val="24"/>
+        </w:rPr>
+        <w:t>Słownik terminów literackich</w:t>
+      </w:r>
+      <w:r>
+        <w:rPr>
+          <w:rFonts w:ascii="Times New Roman" w:hAnsi="Times New Roman" w:cs="Times New Roman" w:eastAsia="Times New Roman"/>
+          <w:b w:val="0"/>
+          <w:i w:val="0"/>
+          <w:sz w:val="24"/>
+        </w:rPr>
+        <w:t>, J. Sławiński (red.), Zakład Narodowy im. Ossolińskich, Wrocław 2005, s. 104.</w:t>
       </w:r>
     </w:p>
     <w:p>
@@ -553,26 +638,29 @@
       <w:r>
         <w:rPr>
           <w:rFonts w:ascii="Times New Roman" w:hAnsi="Times New Roman" w:cs="Times New Roman" w:eastAsia="Times New Roman"/>
+          <w:b w:val="0"/>
           <w:i w:val="0"/>
           <w:sz w:val="24"/>
         </w:rPr>
-        <w:t xml:space="preserve">Dziedzic A., </w:t>
-      </w:r>
-      <w:r>
-        <w:rPr>
-          <w:rFonts w:ascii="Times New Roman" w:hAnsi="Times New Roman" w:cs="Times New Roman" w:eastAsia="Times New Roman"/>
+        <w:t xml:space="preserve">Gogolin O., Szymik E., </w:t>
+      </w:r>
+      <w:r>
+        <w:rPr>
+          <w:rFonts w:ascii="Times New Roman" w:hAnsi="Times New Roman" w:cs="Times New Roman" w:eastAsia="Times New Roman"/>
+          <w:b w:val="0"/>
           <w:i/>
           <w:sz w:val="24"/>
         </w:rPr>
-        <w:t>Drama a wychowanie</w:t>
-      </w:r>
-      <w:r>
-        <w:rPr>
-          <w:rFonts w:ascii="Times New Roman" w:hAnsi="Times New Roman" w:cs="Times New Roman" w:eastAsia="Times New Roman"/>
+        <w:t>The Role of Drama in Developing Communication Competencies of Early Primary School Students</w:t>
+      </w:r>
+      <w:r>
+        <w:rPr>
+          <w:rFonts w:ascii="Times New Roman" w:hAnsi="Times New Roman" w:cs="Times New Roman" w:eastAsia="Times New Roman"/>
+          <w:b w:val="0"/>
           <w:i w:val="0"/>
           <w:sz w:val="24"/>
         </w:rPr>
-        <w:t>, wyd. 3, Wydawnictwa CODN – Centralny Ośrodek Doskonalenia Nauczycieli, Warszawa 2000.</w:t>
+        <w:t>, „Konteksty Pedagogiczne”, nr 1 (12), 2019, s. 121–146.</w:t>
       </w:r>
     </w:p>
     <w:p>
@@ -584,26 +672,29 @@
       <w:r>
         <w:rPr>
           <w:rFonts w:ascii="Times New Roman" w:hAnsi="Times New Roman" w:cs="Times New Roman" w:eastAsia="Times New Roman"/>
+          <w:b w:val="0"/>
           <w:i w:val="0"/>
           <w:sz w:val="24"/>
         </w:rPr>
-        <w:t xml:space="preserve">Gałązka A., </w:t>
-      </w:r>
-      <w:r>
-        <w:rPr>
-          <w:rFonts w:ascii="Times New Roman" w:hAnsi="Times New Roman" w:cs="Times New Roman" w:eastAsia="Times New Roman"/>
+        <w:t xml:space="preserve">Gogolin O., Szymik E., </w:t>
+      </w:r>
+      <w:r>
+        <w:rPr>
+          <w:rFonts w:ascii="Times New Roman" w:hAnsi="Times New Roman" w:cs="Times New Roman" w:eastAsia="Times New Roman"/>
+          <w:b w:val="0"/>
           <w:i/>
           <w:sz w:val="24"/>
         </w:rPr>
-        <w:t>Rola dramy w twórczej przyśpieszonej edukacji lingwistycznej</w:t>
-      </w:r>
-      <w:r>
-        <w:rPr>
-          <w:rFonts w:ascii="Times New Roman" w:hAnsi="Times New Roman" w:cs="Times New Roman" w:eastAsia="Times New Roman"/>
+        <w:t>Drama: wybrane aspekty polonistycznej edukacji wczesnoszkolnej: koncepcje, badania, wyniki</w:t>
+      </w:r>
+      <w:r>
+        <w:rPr>
+          <w:rFonts w:ascii="Times New Roman" w:hAnsi="Times New Roman" w:cs="Times New Roman" w:eastAsia="Times New Roman"/>
+          <w:b w:val="0"/>
           <w:i w:val="0"/>
           <w:sz w:val="24"/>
         </w:rPr>
-        <w:t>, „Chowanna”, nr 2, 2002, s. 70–86.</w:t>
+        <w:t>, Łukasiewicz – Instytut Technologii Eksploatacji – Wydawnictwo Naukowe, Radom 2020.</w:t>
       </w:r>
     </w:p>
     <w:p>
@@ -615,26 +706,29 @@
       <w:r>
         <w:rPr>
           <w:rFonts w:ascii="Times New Roman" w:hAnsi="Times New Roman" w:cs="Times New Roman" w:eastAsia="Times New Roman"/>
+          <w:b w:val="0"/>
           <w:i w:val="0"/>
           <w:sz w:val="24"/>
         </w:rPr>
-        <w:t xml:space="preserve">Gałązka A., </w:t>
-      </w:r>
-      <w:r>
-        <w:rPr>
-          <w:rFonts w:ascii="Times New Roman" w:hAnsi="Times New Roman" w:cs="Times New Roman" w:eastAsia="Times New Roman"/>
+        <w:t xml:space="preserve">Gołębniak B. D., Teusz G., </w:t>
+      </w:r>
+      <w:r>
+        <w:rPr>
+          <w:rFonts w:ascii="Times New Roman" w:hAnsi="Times New Roman" w:cs="Times New Roman" w:eastAsia="Times New Roman"/>
+          <w:b w:val="0"/>
           <w:i/>
           <w:sz w:val="24"/>
         </w:rPr>
-        <w:t>Drama kreatywna a inteligencja emocjonalna. Przykład wykorzystania wybranego modelu badań empirycznych</w:t>
-      </w:r>
-      <w:r>
-        <w:rPr>
-          <w:rFonts w:ascii="Times New Roman" w:hAnsi="Times New Roman" w:cs="Times New Roman" w:eastAsia="Times New Roman"/>
+        <w:t>Edukacja poprzez język: o całościowym uczeniu się</w:t>
+      </w:r>
+      <w:r>
+        <w:rPr>
+          <w:rFonts w:ascii="Times New Roman" w:hAnsi="Times New Roman" w:cs="Times New Roman" w:eastAsia="Times New Roman"/>
+          <w:b w:val="0"/>
           <w:i w:val="0"/>
           <w:sz w:val="24"/>
         </w:rPr>
-        <w:t>, „Chowanna”, nr 1, 2011, s. 83–104.</w:t>
+        <w:t>, Wydawnictwa CODN – Centralny Ośrodek Doskonalenia Nauczycieli, Warszawa 1999.</w:t>
       </w:r>
     </w:p>
     <w:p>
@@ -646,26 +740,29 @@
       <w:r>
         <w:rPr>
           <w:rFonts w:ascii="Times New Roman" w:hAnsi="Times New Roman" w:cs="Times New Roman" w:eastAsia="Times New Roman"/>
+          <w:b w:val="0"/>
           <w:i w:val="0"/>
           <w:sz w:val="24"/>
         </w:rPr>
-        <w:t xml:space="preserve">Gałązka A., </w:t>
-      </w:r>
-      <w:r>
-        <w:rPr>
-          <w:rFonts w:ascii="Times New Roman" w:hAnsi="Times New Roman" w:cs="Times New Roman" w:eastAsia="Times New Roman"/>
+        <w:t xml:space="preserve">Grzesiak M., </w:t>
+      </w:r>
+      <w:r>
+        <w:rPr>
+          <w:rFonts w:ascii="Times New Roman" w:hAnsi="Times New Roman" w:cs="Times New Roman" w:eastAsia="Times New Roman"/>
+          <w:b w:val="0"/>
           <w:i/>
           <w:sz w:val="24"/>
         </w:rPr>
-        <w:t>Drama w rozwijaniu kompetencji społecznych i emocjonalnych dzieci w młodszym wieku szkolnym</w:t>
-      </w:r>
-      <w:r>
-        <w:rPr>
-          <w:rFonts w:ascii="Times New Roman" w:hAnsi="Times New Roman" w:cs="Times New Roman" w:eastAsia="Times New Roman"/>
+        <w:t>Zintegrowany model kompetencji społecznych w procesie rozwoju osobistego i zawodowego</w:t>
+      </w:r>
+      <w:r>
+        <w:rPr>
+          <w:rFonts w:ascii="Times New Roman" w:hAnsi="Times New Roman" w:cs="Times New Roman" w:eastAsia="Times New Roman"/>
+          <w:b w:val="0"/>
           <w:i w:val="0"/>
           <w:sz w:val="24"/>
         </w:rPr>
-        <w:t>, „Chowanna”, t. 2 (53), 2019, s. 145–158, DOI: 10.31261/CHOWANNA.2019.S.08.</w:t>
+        <w:t>, Dąbrowa Górnicza 2021.</w:t>
       </w:r>
     </w:p>
     <w:p>
@@ -677,42 +774,29 @@
       <w:r>
         <w:rPr>
           <w:rFonts w:ascii="Times New Roman" w:hAnsi="Times New Roman" w:cs="Times New Roman" w:eastAsia="Times New Roman"/>
+          <w:b w:val="0"/>
           <w:i w:val="0"/>
           <w:sz w:val="24"/>
         </w:rPr>
-        <w:t xml:space="preserve">Głowiński M., </w:t>
-      </w:r>
-      <w:r>
-        <w:rPr>
-          <w:rFonts w:ascii="Times New Roman" w:hAnsi="Times New Roman" w:cs="Times New Roman" w:eastAsia="Times New Roman"/>
+        <w:t xml:space="preserve">Grzywniak C., Sufa B., Vaškevič-Buś J., </w:t>
+      </w:r>
+      <w:r>
+        <w:rPr>
+          <w:rFonts w:ascii="Times New Roman" w:hAnsi="Times New Roman" w:cs="Times New Roman" w:eastAsia="Times New Roman"/>
+          <w:b w:val="0"/>
           <w:i/>
           <w:sz w:val="24"/>
         </w:rPr>
-        <w:t>Drama</w:t>
-      </w:r>
-      <w:r>
-        <w:rPr>
-          <w:rFonts w:ascii="Times New Roman" w:hAnsi="Times New Roman" w:cs="Times New Roman" w:eastAsia="Times New Roman"/>
+        <w:t>Kompetencje społeczne uczniów w młodszym wieku szkolnym</w:t>
+      </w:r>
+      <w:r>
+        <w:rPr>
+          <w:rFonts w:ascii="Times New Roman" w:hAnsi="Times New Roman" w:cs="Times New Roman" w:eastAsia="Times New Roman"/>
+          <w:b w:val="0"/>
           <w:i w:val="0"/>
           <w:sz w:val="24"/>
         </w:rPr>
-        <w:t xml:space="preserve">, [w:] </w:t>
-      </w:r>
-      <w:r>
-        <w:rPr>
-          <w:rFonts w:ascii="Times New Roman" w:hAnsi="Times New Roman" w:cs="Times New Roman" w:eastAsia="Times New Roman"/>
-          <w:i/>
-          <w:sz w:val="24"/>
-        </w:rPr>
-        <w:t>Słownik terminów literackich</w:t>
-      </w:r>
-      <w:r>
-        <w:rPr>
-          <w:rFonts w:ascii="Times New Roman" w:hAnsi="Times New Roman" w:cs="Times New Roman" w:eastAsia="Times New Roman"/>
-          <w:i w:val="0"/>
-          <w:sz w:val="24"/>
-        </w:rPr>
-        <w:t>, J. Sławiński (red.), Zakład Narodowy im. Ossolińskich, Wrocław 2005, s. 104.</w:t>
+        <w:t>, Wydawnictwo Naukowe Uniwersytetu Pedagogicznego, Kraków 2019.</w:t>
       </w:r>
     </w:p>
     <w:p>
@@ -724,26 +808,29 @@
       <w:r>
         <w:rPr>
           <w:rFonts w:ascii="Times New Roman" w:hAnsi="Times New Roman" w:cs="Times New Roman" w:eastAsia="Times New Roman"/>
+          <w:b w:val="0"/>
           <w:i w:val="0"/>
           <w:sz w:val="24"/>
         </w:rPr>
-        <w:t xml:space="preserve">Gogolin O., Szymik E., </w:t>
-      </w:r>
-      <w:r>
-        <w:rPr>
-          <w:rFonts w:ascii="Times New Roman" w:hAnsi="Times New Roman" w:cs="Times New Roman" w:eastAsia="Times New Roman"/>
+        <w:t xml:space="preserve">Gudro-Homicka M., </w:t>
+      </w:r>
+      <w:r>
+        <w:rPr>
+          <w:rFonts w:ascii="Times New Roman" w:hAnsi="Times New Roman" w:cs="Times New Roman" w:eastAsia="Times New Roman"/>
+          <w:b w:val="0"/>
           <w:i/>
           <w:sz w:val="24"/>
         </w:rPr>
-        <w:t>The Role of Drama in Developing Communication Competencies of Early Primary School Students</w:t>
-      </w:r>
-      <w:r>
-        <w:rPr>
-          <w:rFonts w:ascii="Times New Roman" w:hAnsi="Times New Roman" w:cs="Times New Roman" w:eastAsia="Times New Roman"/>
+        <w:t>Jak rozwijać aktywność twórczą dzieci i młodzieży. Drama w nauczaniu, wychowaniu i biblioterapii</w:t>
+      </w:r>
+      <w:r>
+        <w:rPr>
+          <w:rFonts w:ascii="Times New Roman" w:hAnsi="Times New Roman" w:cs="Times New Roman" w:eastAsia="Times New Roman"/>
+          <w:b w:val="0"/>
           <w:i w:val="0"/>
           <w:sz w:val="24"/>
         </w:rPr>
-        <w:t>, „Konteksty Pedagogiczne”, nr 1 (12), 2019, s. 121–146.</w:t>
+        <w:t>, Wydawnictwo Difin, Warszawa 2015.</w:t>
       </w:r>
     </w:p>
     <w:p>
@@ -755,26 +842,29 @@
       <w:r>
         <w:rPr>
           <w:rFonts w:ascii="Times New Roman" w:hAnsi="Times New Roman" w:cs="Times New Roman" w:eastAsia="Times New Roman"/>
+          <w:b w:val="0"/>
           <w:i w:val="0"/>
           <w:sz w:val="24"/>
         </w:rPr>
-        <w:t xml:space="preserve">Gogolin O., Szymik E., </w:t>
-      </w:r>
-      <w:r>
-        <w:rPr>
-          <w:rFonts w:ascii="Times New Roman" w:hAnsi="Times New Roman" w:cs="Times New Roman" w:eastAsia="Times New Roman"/>
+        <w:t xml:space="preserve">Hetmańczyk H., </w:t>
+      </w:r>
+      <w:r>
+        <w:rPr>
+          <w:rFonts w:ascii="Times New Roman" w:hAnsi="Times New Roman" w:cs="Times New Roman" w:eastAsia="Times New Roman"/>
+          <w:b w:val="0"/>
           <w:i/>
           <w:sz w:val="24"/>
         </w:rPr>
-        <w:t>Drama: wybrane aspekty polonistycznej edukacji wczesnoszkolnej: koncepcje, badania, wyniki</w:t>
-      </w:r>
-      <w:r>
-        <w:rPr>
-          <w:rFonts w:ascii="Times New Roman" w:hAnsi="Times New Roman" w:cs="Times New Roman" w:eastAsia="Times New Roman"/>
+        <w:t>Poczucie kompetencji społecznych uczniów w młodszym wieku szkolnym</w:t>
+      </w:r>
+      <w:r>
+        <w:rPr>
+          <w:rFonts w:ascii="Times New Roman" w:hAnsi="Times New Roman" w:cs="Times New Roman" w:eastAsia="Times New Roman"/>
+          <w:b w:val="0"/>
           <w:i w:val="0"/>
           <w:sz w:val="24"/>
         </w:rPr>
-        <w:t>, Łukasiewicz – Instytut Technologii Eksploatacji – Wydawnictwo Naukowe, Radom 2020.</w:t>
+        <w:t>, „Chowanna”, nr 1 (50), 2018, s. 161–178.</w:t>
       </w:r>
     </w:p>
     <w:p>
@@ -786,26 +876,29 @@
       <w:r>
         <w:rPr>
           <w:rFonts w:ascii="Times New Roman" w:hAnsi="Times New Roman" w:cs="Times New Roman" w:eastAsia="Times New Roman"/>
+          <w:b w:val="0"/>
           <w:i w:val="0"/>
           <w:sz w:val="24"/>
         </w:rPr>
-        <w:t xml:space="preserve">Gołębniak B. D., Teusz G., </w:t>
-      </w:r>
-      <w:r>
-        <w:rPr>
-          <w:rFonts w:ascii="Times New Roman" w:hAnsi="Times New Roman" w:cs="Times New Roman" w:eastAsia="Times New Roman"/>
+        <w:t xml:space="preserve">Jagieła J., </w:t>
+      </w:r>
+      <w:r>
+        <w:rPr>
+          <w:rFonts w:ascii="Times New Roman" w:hAnsi="Times New Roman" w:cs="Times New Roman" w:eastAsia="Times New Roman"/>
+          <w:b w:val="0"/>
           <w:i/>
           <w:sz w:val="24"/>
         </w:rPr>
-        <w:t>Edukacja poprzez język: o całościowym uczeniu się</w:t>
-      </w:r>
-      <w:r>
-        <w:rPr>
-          <w:rFonts w:ascii="Times New Roman" w:hAnsi="Times New Roman" w:cs="Times New Roman" w:eastAsia="Times New Roman"/>
+        <w:t>Socjoterapia w szkole. Krótki poradnik psychologiczny</w:t>
+      </w:r>
+      <w:r>
+        <w:rPr>
+          <w:rFonts w:ascii="Times New Roman" w:hAnsi="Times New Roman" w:cs="Times New Roman" w:eastAsia="Times New Roman"/>
+          <w:b w:val="0"/>
           <w:i w:val="0"/>
           <w:sz w:val="24"/>
         </w:rPr>
-        <w:t>, Wydawnictwa CODN – Centralny Ośrodek Doskonalenia Nauczycieli, Warszawa 1999.</w:t>
+        <w:t>, Kraków 2007.</w:t>
       </w:r>
     </w:p>
     <w:p>
@@ -817,26 +910,29 @@
       <w:r>
         <w:rPr>
           <w:rFonts w:ascii="Times New Roman" w:hAnsi="Times New Roman" w:cs="Times New Roman" w:eastAsia="Times New Roman"/>
+          <w:b w:val="0"/>
           <w:i w:val="0"/>
           <w:sz w:val="24"/>
         </w:rPr>
-        <w:t xml:space="preserve">Góralczyk K., </w:t>
-      </w:r>
-      <w:r>
-        <w:rPr>
-          <w:rFonts w:ascii="Times New Roman" w:hAnsi="Times New Roman" w:cs="Times New Roman" w:eastAsia="Times New Roman"/>
+        <w:t xml:space="preserve">Jezierska-Wiejak E., </w:t>
+      </w:r>
+      <w:r>
+        <w:rPr>
+          <w:rFonts w:ascii="Times New Roman" w:hAnsi="Times New Roman" w:cs="Times New Roman" w:eastAsia="Times New Roman"/>
+          <w:b w:val="0"/>
           <w:i/>
           <w:sz w:val="24"/>
         </w:rPr>
-        <w:t>Techniki dramy. Część 2</w:t>
-      </w:r>
-      <w:r>
-        <w:rPr>
-          <w:rFonts w:ascii="Times New Roman" w:hAnsi="Times New Roman" w:cs="Times New Roman" w:eastAsia="Times New Roman"/>
+        <w:t>Możliwości i ograniczenia dramy jako metody kształtowania rozumienia pojęć moralnych</w:t>
+      </w:r>
+      <w:r>
+        <w:rPr>
+          <w:rFonts w:ascii="Times New Roman" w:hAnsi="Times New Roman" w:cs="Times New Roman" w:eastAsia="Times New Roman"/>
+          <w:b w:val="0"/>
           <w:i w:val="0"/>
           <w:sz w:val="24"/>
         </w:rPr>
-        <w:t>, https://katarzynagoralczyk.weebly.com/blog/techniki-dramy-czesc-2 (dostęp: 30.04.2026).</w:t>
+        <w:t>, Wydawnictwo Adam Marszałek, Toruń 2004.</w:t>
       </w:r>
     </w:p>
     <w:p>
@@ -848,26 +944,47 @@
       <w:r>
         <w:rPr>
           <w:rFonts w:ascii="Times New Roman" w:hAnsi="Times New Roman" w:cs="Times New Roman" w:eastAsia="Times New Roman"/>
+          <w:b w:val="0"/>
           <w:i w:val="0"/>
           <w:sz w:val="24"/>
         </w:rPr>
-        <w:t xml:space="preserve">Grzesiak M., </w:t>
-      </w:r>
-      <w:r>
-        <w:rPr>
-          <w:rFonts w:ascii="Times New Roman" w:hAnsi="Times New Roman" w:cs="Times New Roman" w:eastAsia="Times New Roman"/>
+        <w:t xml:space="preserve">Karwowska-Struczyk M., </w:t>
+      </w:r>
+      <w:r>
+        <w:rPr>
+          <w:rFonts w:ascii="Times New Roman" w:hAnsi="Times New Roman" w:cs="Times New Roman" w:eastAsia="Times New Roman"/>
+          <w:b w:val="0"/>
           <w:i/>
           <w:sz w:val="24"/>
         </w:rPr>
-        <w:t>Zintegrowany model kompetencji społecznych w procesie rozwoju osobistego i zawodowego</w:t>
-      </w:r>
-      <w:r>
-        <w:rPr>
-          <w:rFonts w:ascii="Times New Roman" w:hAnsi="Times New Roman" w:cs="Times New Roman" w:eastAsia="Times New Roman"/>
+        <w:t>Dziecko i rówieśnicy w społecznym świecie wczesnej edukacji</w:t>
+      </w:r>
+      <w:r>
+        <w:rPr>
+          <w:rFonts w:ascii="Times New Roman" w:hAnsi="Times New Roman" w:cs="Times New Roman" w:eastAsia="Times New Roman"/>
+          <w:b w:val="0"/>
           <w:i w:val="0"/>
           <w:sz w:val="24"/>
         </w:rPr>
-        <w:t>, Dąbrowa Górnicza 2021.</w:t>
+        <w:t xml:space="preserve">, [w:] </w:t>
+      </w:r>
+      <w:r>
+        <w:rPr>
+          <w:rFonts w:ascii="Times New Roman" w:hAnsi="Times New Roman" w:cs="Times New Roman" w:eastAsia="Times New Roman"/>
+          <w:b w:val="0"/>
+          <w:i/>
+          <w:sz w:val="24"/>
+        </w:rPr>
+        <w:t>Pedagogika wczesnoszkolna – dyskursy, problemy, rozwiązania</w:t>
+      </w:r>
+      <w:r>
+        <w:rPr>
+          <w:rFonts w:ascii="Times New Roman" w:hAnsi="Times New Roman" w:cs="Times New Roman" w:eastAsia="Times New Roman"/>
+          <w:b w:val="0"/>
+          <w:i w:val="0"/>
+          <w:sz w:val="24"/>
+        </w:rPr>
+        <w:t>, D. Klus-Stańska, M. Szczepska-Pustkowska (red.), Wydawnictwa Akademickie i Profesjonalne, Warszawa 2009.</w:t>
       </w:r>
     </w:p>
     <w:p>
@@ -879,26 +996,29 @@
       <w:r>
         <w:rPr>
           <w:rFonts w:ascii="Times New Roman" w:hAnsi="Times New Roman" w:cs="Times New Roman" w:eastAsia="Times New Roman"/>
+          <w:b w:val="0"/>
           <w:i w:val="0"/>
           <w:sz w:val="24"/>
         </w:rPr>
-        <w:t xml:space="preserve">Grzywniak C., Sufa B., Vaškevič-Buś J., </w:t>
-      </w:r>
-      <w:r>
-        <w:rPr>
-          <w:rFonts w:ascii="Times New Roman" w:hAnsi="Times New Roman" w:cs="Times New Roman" w:eastAsia="Times New Roman"/>
+        <w:t xml:space="preserve">Klepacki B., </w:t>
+      </w:r>
+      <w:r>
+        <w:rPr>
+          <w:rFonts w:ascii="Times New Roman" w:hAnsi="Times New Roman" w:cs="Times New Roman" w:eastAsia="Times New Roman"/>
+          <w:b w:val="0"/>
           <w:i/>
           <w:sz w:val="24"/>
         </w:rPr>
-        <w:t>Kompetencje społeczne uczniów w młodszym wieku szkolnym</w:t>
-      </w:r>
-      <w:r>
-        <w:rPr>
-          <w:rFonts w:ascii="Times New Roman" w:hAnsi="Times New Roman" w:cs="Times New Roman" w:eastAsia="Times New Roman"/>
+        <w:t>Wybrane zagadnienia związane z metodologią badań naukowych</w:t>
+      </w:r>
+      <w:r>
+        <w:rPr>
+          <w:rFonts w:ascii="Times New Roman" w:hAnsi="Times New Roman" w:cs="Times New Roman" w:eastAsia="Times New Roman"/>
+          <w:b w:val="0"/>
           <w:i w:val="0"/>
           <w:sz w:val="24"/>
         </w:rPr>
-        <w:t>, Wydawnictwo Naukowe Uniwersytetu Pedagogicznego, Kraków 2019.</w:t>
+        <w:t>, „Roczniki Nauk Rolniczych”, seria G, t. 96, z. 2, 2009.</w:t>
       </w:r>
     </w:p>
     <w:p>
@@ -910,26 +1030,29 @@
       <w:r>
         <w:rPr>
           <w:rFonts w:ascii="Times New Roman" w:hAnsi="Times New Roman" w:cs="Times New Roman" w:eastAsia="Times New Roman"/>
+          <w:b w:val="0"/>
           <w:i w:val="0"/>
           <w:sz w:val="24"/>
         </w:rPr>
-        <w:t xml:space="preserve">Gudro-Homicka M., </w:t>
-      </w:r>
-      <w:r>
-        <w:rPr>
-          <w:rFonts w:ascii="Times New Roman" w:hAnsi="Times New Roman" w:cs="Times New Roman" w:eastAsia="Times New Roman"/>
+        <w:t xml:space="preserve">Koszewska K., </w:t>
+      </w:r>
+      <w:r>
+        <w:rPr>
+          <w:rFonts w:ascii="Times New Roman" w:hAnsi="Times New Roman" w:cs="Times New Roman" w:eastAsia="Times New Roman"/>
+          <w:b w:val="0"/>
           <w:i/>
           <w:sz w:val="24"/>
         </w:rPr>
-        <w:t>Jak rozwijać aktywność twórczą dzieci i młodzieży. Drama w nauczaniu, wychowaniu i biblioterapii</w:t>
-      </w:r>
-      <w:r>
-        <w:rPr>
-          <w:rFonts w:ascii="Times New Roman" w:hAnsi="Times New Roman" w:cs="Times New Roman" w:eastAsia="Times New Roman"/>
+        <w:t>Co to są kompetencje społeczne?</w:t>
+      </w:r>
+      <w:r>
+        <w:rPr>
+          <w:rFonts w:ascii="Times New Roman" w:hAnsi="Times New Roman" w:cs="Times New Roman" w:eastAsia="Times New Roman"/>
+          <w:b w:val="0"/>
           <w:i w:val="0"/>
           <w:sz w:val="24"/>
         </w:rPr>
-        <w:t>, Wydawnictwo Difin, Warszawa 2015.</w:t>
+        <w:t>, „Meritum. Mazowiecki Kwartalnik Edukacyjny”, nr 2 (33), 2014, s. 2–3.</w:t>
       </w:r>
     </w:p>
     <w:p>
@@ -941,26 +1064,47 @@
       <w:r>
         <w:rPr>
           <w:rFonts w:ascii="Times New Roman" w:hAnsi="Times New Roman" w:cs="Times New Roman" w:eastAsia="Times New Roman"/>
+          <w:b w:val="0"/>
           <w:i w:val="0"/>
           <w:sz w:val="24"/>
         </w:rPr>
-        <w:t xml:space="preserve">Hetmańczyk H., </w:t>
-      </w:r>
-      <w:r>
-        <w:rPr>
-          <w:rFonts w:ascii="Times New Roman" w:hAnsi="Times New Roman" w:cs="Times New Roman" w:eastAsia="Times New Roman"/>
+        <w:t xml:space="preserve">Kotarbiński T., </w:t>
+      </w:r>
+      <w:r>
+        <w:rPr>
+          <w:rFonts w:ascii="Times New Roman" w:hAnsi="Times New Roman" w:cs="Times New Roman" w:eastAsia="Times New Roman"/>
+          <w:b w:val="0"/>
           <w:i/>
           <w:sz w:val="24"/>
         </w:rPr>
-        <w:t>Poczucie kompetencji społecznych uczniów w młodszym wieku szkolnym</w:t>
-      </w:r>
-      <w:r>
-        <w:rPr>
-          <w:rFonts w:ascii="Times New Roman" w:hAnsi="Times New Roman" w:cs="Times New Roman" w:eastAsia="Times New Roman"/>
+        <w:t>O pojęciu metody</w:t>
+      </w:r>
+      <w:r>
+        <w:rPr>
+          <w:rFonts w:ascii="Times New Roman" w:hAnsi="Times New Roman" w:cs="Times New Roman" w:eastAsia="Times New Roman"/>
+          <w:b w:val="0"/>
           <w:i w:val="0"/>
           <w:sz w:val="24"/>
         </w:rPr>
-        <w:t>, „Chowanna”, nr 1 (50), 2018, s. 161–178.</w:t>
+        <w:t xml:space="preserve">, [w:] </w:t>
+      </w:r>
+      <w:r>
+        <w:rPr>
+          <w:rFonts w:ascii="Times New Roman" w:hAnsi="Times New Roman" w:cs="Times New Roman" w:eastAsia="Times New Roman"/>
+          <w:b w:val="0"/>
+          <w:i/>
+          <w:sz w:val="24"/>
+        </w:rPr>
+        <w:t>Wybór pism</w:t>
+      </w:r>
+      <w:r>
+        <w:rPr>
+          <w:rFonts w:ascii="Times New Roman" w:hAnsi="Times New Roman" w:cs="Times New Roman" w:eastAsia="Times New Roman"/>
+          <w:b w:val="0"/>
+          <w:i w:val="0"/>
+          <w:sz w:val="24"/>
+        </w:rPr>
+        <w:t>, t. I, Warszawa 1957.</w:t>
       </w:r>
     </w:p>
     <w:p>
@@ -972,26 +1116,29 @@
       <w:r>
         <w:rPr>
           <w:rFonts w:ascii="Times New Roman" w:hAnsi="Times New Roman" w:cs="Times New Roman" w:eastAsia="Times New Roman"/>
+          <w:b w:val="0"/>
           <w:i w:val="0"/>
           <w:sz w:val="24"/>
         </w:rPr>
-        <w:t xml:space="preserve">Jagieła J., </w:t>
-      </w:r>
-      <w:r>
-        <w:rPr>
-          <w:rFonts w:ascii="Times New Roman" w:hAnsi="Times New Roman" w:cs="Times New Roman" w:eastAsia="Times New Roman"/>
+        <w:t xml:space="preserve">Kováčová Z., Szymik E., </w:t>
+      </w:r>
+      <w:r>
+        <w:rPr>
+          <w:rFonts w:ascii="Times New Roman" w:hAnsi="Times New Roman" w:cs="Times New Roman" w:eastAsia="Times New Roman"/>
+          <w:b w:val="0"/>
           <w:i/>
           <w:sz w:val="24"/>
         </w:rPr>
-        <w:t>Socjoterapia w szkole. Krótki poradnik psychologiczny</w:t>
-      </w:r>
-      <w:r>
-        <w:rPr>
-          <w:rFonts w:ascii="Times New Roman" w:hAnsi="Times New Roman" w:cs="Times New Roman" w:eastAsia="Times New Roman"/>
+        <w:t>Drama (kreatywna) w szkole podstawowej na Słowacji</w:t>
+      </w:r>
+      <w:r>
+        <w:rPr>
+          <w:rFonts w:ascii="Times New Roman" w:hAnsi="Times New Roman" w:cs="Times New Roman" w:eastAsia="Times New Roman"/>
+          <w:b w:val="0"/>
           <w:i w:val="0"/>
           <w:sz w:val="24"/>
         </w:rPr>
-        <w:t>, Kraków 2007.</w:t>
+        <w:t>, „Journal of Modern Science”, nr 2 (33), 2017, s. 61–70.</w:t>
       </w:r>
     </w:p>
     <w:p>
@@ -1003,26 +1150,29 @@
       <w:r>
         <w:rPr>
           <w:rFonts w:ascii="Times New Roman" w:hAnsi="Times New Roman" w:cs="Times New Roman" w:eastAsia="Times New Roman"/>
+          <w:b w:val="0"/>
           <w:i w:val="0"/>
           <w:sz w:val="24"/>
         </w:rPr>
-        <w:t xml:space="preserve">Jezierska-Wiejak E., </w:t>
-      </w:r>
-      <w:r>
-        <w:rPr>
-          <w:rFonts w:ascii="Times New Roman" w:hAnsi="Times New Roman" w:cs="Times New Roman" w:eastAsia="Times New Roman"/>
+        <w:t xml:space="preserve">Krajewski M., </w:t>
+      </w:r>
+      <w:r>
+        <w:rPr>
+          <w:rFonts w:ascii="Times New Roman" w:hAnsi="Times New Roman" w:cs="Times New Roman" w:eastAsia="Times New Roman"/>
+          <w:b w:val="0"/>
           <w:i/>
           <w:sz w:val="24"/>
         </w:rPr>
-        <w:t>Możliwości i ograniczenia dramy jako metody kształtowania rozumienia pojęć moralnych</w:t>
-      </w:r>
-      <w:r>
-        <w:rPr>
-          <w:rFonts w:ascii="Times New Roman" w:hAnsi="Times New Roman" w:cs="Times New Roman" w:eastAsia="Times New Roman"/>
+        <w:t>O metodologii nauk i zasadach pisarstwa naukowego</w:t>
+      </w:r>
+      <w:r>
+        <w:rPr>
+          <w:rFonts w:ascii="Times New Roman" w:hAnsi="Times New Roman" w:cs="Times New Roman" w:eastAsia="Times New Roman"/>
+          <w:b w:val="0"/>
           <w:i w:val="0"/>
           <w:sz w:val="24"/>
         </w:rPr>
-        <w:t>, Wydawnictwo Adam Marszałek, Toruń 2004.</w:t>
+        <w:t>, Uniwersytet Śląski, Gliwice 2010.</w:t>
       </w:r>
     </w:p>
     <w:p>
@@ -1034,42 +1184,29 @@
       <w:r>
         <w:rPr>
           <w:rFonts w:ascii="Times New Roman" w:hAnsi="Times New Roman" w:cs="Times New Roman" w:eastAsia="Times New Roman"/>
+          <w:b w:val="0"/>
           <w:i w:val="0"/>
           <w:sz w:val="24"/>
         </w:rPr>
-        <w:t xml:space="preserve">Karwowska-Struczyk M., </w:t>
-      </w:r>
-      <w:r>
-        <w:rPr>
-          <w:rFonts w:ascii="Times New Roman" w:hAnsi="Times New Roman" w:cs="Times New Roman" w:eastAsia="Times New Roman"/>
+        <w:t xml:space="preserve">Kupiec H., </w:t>
+      </w:r>
+      <w:r>
+        <w:rPr>
+          <w:rFonts w:ascii="Times New Roman" w:hAnsi="Times New Roman" w:cs="Times New Roman" w:eastAsia="Times New Roman"/>
+          <w:b w:val="0"/>
           <w:i/>
           <w:sz w:val="24"/>
         </w:rPr>
-        <w:t>Dziecko i rówieśnicy w społecznym świecie wczesnej edukacji</w:t>
-      </w:r>
-      <w:r>
-        <w:rPr>
-          <w:rFonts w:ascii="Times New Roman" w:hAnsi="Times New Roman" w:cs="Times New Roman" w:eastAsia="Times New Roman"/>
+        <w:t>Rozwijanie kompetencji społecznych nieletnich a klimat wychowawczy placówki resocjalizacyjnej</w:t>
+      </w:r>
+      <w:r>
+        <w:rPr>
+          <w:rFonts w:ascii="Times New Roman" w:hAnsi="Times New Roman" w:cs="Times New Roman" w:eastAsia="Times New Roman"/>
+          <w:b w:val="0"/>
           <w:i w:val="0"/>
           <w:sz w:val="24"/>
         </w:rPr>
-        <w:t xml:space="preserve">, [w:] </w:t>
-      </w:r>
-      <w:r>
-        <w:rPr>
-          <w:rFonts w:ascii="Times New Roman" w:hAnsi="Times New Roman" w:cs="Times New Roman" w:eastAsia="Times New Roman"/>
-          <w:i/>
-          <w:sz w:val="24"/>
-        </w:rPr>
-        <w:t>Pedagogika wczesnoszkolna – dyskursy, problemy, rozwiązania</w:t>
-      </w:r>
-      <w:r>
-        <w:rPr>
-          <w:rFonts w:ascii="Times New Roman" w:hAnsi="Times New Roman" w:cs="Times New Roman" w:eastAsia="Times New Roman"/>
-          <w:i w:val="0"/>
-          <w:sz w:val="24"/>
-        </w:rPr>
-        <w:t>, D. Klus-Stańska, M. Szczepska-Pustkowska (red.), Wydawnictwa Akademickie i Profesjonalne, Warszawa 2009.</w:t>
+        <w:t>, „Resocjalizacja Polska”, nr 3, 2012, s. 383–398.</w:t>
       </w:r>
     </w:p>
     <w:p>
@@ -1081,26 +1218,47 @@
       <w:r>
         <w:rPr>
           <w:rFonts w:ascii="Times New Roman" w:hAnsi="Times New Roman" w:cs="Times New Roman" w:eastAsia="Times New Roman"/>
+          <w:b w:val="0"/>
           <w:i w:val="0"/>
           <w:sz w:val="24"/>
         </w:rPr>
-        <w:t xml:space="preserve">Klepacki B., </w:t>
-      </w:r>
-      <w:r>
-        <w:rPr>
-          <w:rFonts w:ascii="Times New Roman" w:hAnsi="Times New Roman" w:cs="Times New Roman" w:eastAsia="Times New Roman"/>
+        <w:t xml:space="preserve">Kupisiewicz Cz., Kupisiewicz M., </w:t>
+      </w:r>
+      <w:r>
+        <w:rPr>
+          <w:rFonts w:ascii="Times New Roman" w:hAnsi="Times New Roman" w:cs="Times New Roman" w:eastAsia="Times New Roman"/>
+          <w:b w:val="0"/>
           <w:i/>
           <w:sz w:val="24"/>
         </w:rPr>
-        <w:t>Wybrane zagadnienia związane z metodologią badań naukowych</w:t>
-      </w:r>
-      <w:r>
-        <w:rPr>
-          <w:rFonts w:ascii="Times New Roman" w:hAnsi="Times New Roman" w:cs="Times New Roman" w:eastAsia="Times New Roman"/>
+        <w:t>Drama</w:t>
+      </w:r>
+      <w:r>
+        <w:rPr>
+          <w:rFonts w:ascii="Times New Roman" w:hAnsi="Times New Roman" w:cs="Times New Roman" w:eastAsia="Times New Roman"/>
+          <w:b w:val="0"/>
           <w:i w:val="0"/>
           <w:sz w:val="24"/>
         </w:rPr>
-        <w:t>, „Roczniki Nauk Rolniczych”, seria G, t. 96, z. 2, 2009.</w:t>
+        <w:t xml:space="preserve">, [w:] </w:t>
+      </w:r>
+      <w:r>
+        <w:rPr>
+          <w:rFonts w:ascii="Times New Roman" w:hAnsi="Times New Roman" w:cs="Times New Roman" w:eastAsia="Times New Roman"/>
+          <w:b w:val="0"/>
+          <w:i/>
+          <w:sz w:val="24"/>
+        </w:rPr>
+        <w:t>Słownik pedagogiczny</w:t>
+      </w:r>
+      <w:r>
+        <w:rPr>
+          <w:rFonts w:ascii="Times New Roman" w:hAnsi="Times New Roman" w:cs="Times New Roman" w:eastAsia="Times New Roman"/>
+          <w:b w:val="0"/>
+          <w:i w:val="0"/>
+          <w:sz w:val="24"/>
+        </w:rPr>
+        <w:t>, Wydawnictwo Naukowe PWN, Warszawa 2009.</w:t>
       </w:r>
     </w:p>
     <w:p>
@@ -1112,26 +1270,29 @@
       <w:r>
         <w:rPr>
           <w:rFonts w:ascii="Times New Roman" w:hAnsi="Times New Roman" w:cs="Times New Roman" w:eastAsia="Times New Roman"/>
+          <w:b w:val="0"/>
           <w:i w:val="0"/>
           <w:sz w:val="24"/>
         </w:rPr>
-        <w:t xml:space="preserve">Knopp K. A., </w:t>
-      </w:r>
-      <w:r>
-        <w:rPr>
-          <w:rFonts w:ascii="Times New Roman" w:hAnsi="Times New Roman" w:cs="Times New Roman" w:eastAsia="Times New Roman"/>
+        <w:t xml:space="preserve">Kupisiewicz M., </w:t>
+      </w:r>
+      <w:r>
+        <w:rPr>
+          <w:rFonts w:ascii="Times New Roman" w:hAnsi="Times New Roman" w:cs="Times New Roman" w:eastAsia="Times New Roman"/>
+          <w:b w:val="0"/>
           <w:i/>
           <w:sz w:val="24"/>
         </w:rPr>
-        <w:t>Kompetencje społeczne – pomiar i aplikacja praktyczna</w:t>
-      </w:r>
-      <w:r>
-        <w:rPr>
-          <w:rFonts w:ascii="Times New Roman" w:hAnsi="Times New Roman" w:cs="Times New Roman" w:eastAsia="Times New Roman"/>
+        <w:t>Słownik pedagogiki specjalnej</w:t>
+      </w:r>
+      <w:r>
+        <w:rPr>
+          <w:rFonts w:ascii="Times New Roman" w:hAnsi="Times New Roman" w:cs="Times New Roman" w:eastAsia="Times New Roman"/>
+          <w:b w:val="0"/>
           <w:i w:val="0"/>
           <w:sz w:val="24"/>
         </w:rPr>
-        <w:t>, https://ore.edu.pl/wp-content/uploads/phocadownload/pracownie/kompetencje-spoeczne-pomiar-i-aplikacja-praktyczna.wystpienie_-k.knopp.pdf (dostęp: 12.04.2026).</w:t>
+        <w:t>, Wydawnictwo Naukowe PWN, Warszawa 2013.</w:t>
       </w:r>
     </w:p>
     <w:p>
@@ -1143,26 +1304,29 @@
       <w:r>
         <w:rPr>
           <w:rFonts w:ascii="Times New Roman" w:hAnsi="Times New Roman" w:cs="Times New Roman" w:eastAsia="Times New Roman"/>
+          <w:b w:val="0"/>
           <w:i w:val="0"/>
           <w:sz w:val="24"/>
         </w:rPr>
-        <w:t xml:space="preserve">Koszewska K., </w:t>
-      </w:r>
-      <w:r>
-        <w:rPr>
-          <w:rFonts w:ascii="Times New Roman" w:hAnsi="Times New Roman" w:cs="Times New Roman" w:eastAsia="Times New Roman"/>
+        <w:t xml:space="preserve">Leśniewska K., Szczepkowska K., </w:t>
+      </w:r>
+      <w:r>
+        <w:rPr>
+          <w:rFonts w:ascii="Times New Roman" w:hAnsi="Times New Roman" w:cs="Times New Roman" w:eastAsia="Times New Roman"/>
+          <w:b w:val="0"/>
           <w:i/>
           <w:sz w:val="24"/>
         </w:rPr>
-        <w:t>Co to są kompetencje społeczne?</w:t>
-      </w:r>
-      <w:r>
-        <w:rPr>
-          <w:rFonts w:ascii="Times New Roman" w:hAnsi="Times New Roman" w:cs="Times New Roman" w:eastAsia="Times New Roman"/>
+        <w:t>Kompetencje społeczne w aspekcie kompetencji kluczowych</w:t>
+      </w:r>
+      <w:r>
+        <w:rPr>
+          <w:rFonts w:ascii="Times New Roman" w:hAnsi="Times New Roman" w:cs="Times New Roman" w:eastAsia="Times New Roman"/>
+          <w:b w:val="0"/>
           <w:i w:val="0"/>
           <w:sz w:val="24"/>
         </w:rPr>
-        <w:t>, „Meritum. Mazowiecki Kwartalnik Edukacyjny”, nr 2 (33), 2014, s. 2–3.</w:t>
+        <w:t>, „Meritum. Mazowiecki Kwartalnik Edukacyjny”, nr 2, 2014, s. 4–6.</w:t>
       </w:r>
     </w:p>
     <w:p>
@@ -1174,42 +1338,29 @@
       <w:r>
         <w:rPr>
           <w:rFonts w:ascii="Times New Roman" w:hAnsi="Times New Roman" w:cs="Times New Roman" w:eastAsia="Times New Roman"/>
+          <w:b w:val="0"/>
           <w:i w:val="0"/>
           <w:sz w:val="24"/>
         </w:rPr>
-        <w:t xml:space="preserve">Kotarbiński T., </w:t>
-      </w:r>
-      <w:r>
-        <w:rPr>
-          <w:rFonts w:ascii="Times New Roman" w:hAnsi="Times New Roman" w:cs="Times New Roman" w:eastAsia="Times New Roman"/>
+        <w:t xml:space="preserve">Lewandowska-Kidoń T., </w:t>
+      </w:r>
+      <w:r>
+        <w:rPr>
+          <w:rFonts w:ascii="Times New Roman" w:hAnsi="Times New Roman" w:cs="Times New Roman" w:eastAsia="Times New Roman"/>
+          <w:b w:val="0"/>
           <w:i/>
           <w:sz w:val="24"/>
         </w:rPr>
-        <w:t>O pojęciu metody</w:t>
-      </w:r>
-      <w:r>
-        <w:rPr>
-          <w:rFonts w:ascii="Times New Roman" w:hAnsi="Times New Roman" w:cs="Times New Roman" w:eastAsia="Times New Roman"/>
+        <w:t>Drama w kształceniu pedagogicznym</w:t>
+      </w:r>
+      <w:r>
+        <w:rPr>
+          <w:rFonts w:ascii="Times New Roman" w:hAnsi="Times New Roman" w:cs="Times New Roman" w:eastAsia="Times New Roman"/>
+          <w:b w:val="0"/>
           <w:i w:val="0"/>
           <w:sz w:val="24"/>
         </w:rPr>
-        <w:t xml:space="preserve">, [w:] </w:t>
-      </w:r>
-      <w:r>
-        <w:rPr>
-          <w:rFonts w:ascii="Times New Roman" w:hAnsi="Times New Roman" w:cs="Times New Roman" w:eastAsia="Times New Roman"/>
-          <w:i/>
-          <w:sz w:val="24"/>
-        </w:rPr>
-        <w:t>Wybór pism</w:t>
-      </w:r>
-      <w:r>
-        <w:rPr>
-          <w:rFonts w:ascii="Times New Roman" w:hAnsi="Times New Roman" w:cs="Times New Roman" w:eastAsia="Times New Roman"/>
-          <w:i w:val="0"/>
-          <w:sz w:val="24"/>
-        </w:rPr>
-        <w:t>, t. I, Warszawa 1957.</w:t>
+        <w:t>, Wydawnictwo Uniwersytetu Marii Curie-Skłodowskiej, Lublin 2001.</w:t>
       </w:r>
     </w:p>
     <w:p>
@@ -1221,26 +1372,29 @@
       <w:r>
         <w:rPr>
           <w:rFonts w:ascii="Times New Roman" w:hAnsi="Times New Roman" w:cs="Times New Roman" w:eastAsia="Times New Roman"/>
+          <w:b w:val="0"/>
           <w:i w:val="0"/>
           <w:sz w:val="24"/>
         </w:rPr>
-        <w:t xml:space="preserve">Kováčová Z., Szymik E., </w:t>
-      </w:r>
-      <w:r>
-        <w:rPr>
-          <w:rFonts w:ascii="Times New Roman" w:hAnsi="Times New Roman" w:cs="Times New Roman" w:eastAsia="Times New Roman"/>
+        <w:t xml:space="preserve">Łobocki M., </w:t>
+      </w:r>
+      <w:r>
+        <w:rPr>
+          <w:rFonts w:ascii="Times New Roman" w:hAnsi="Times New Roman" w:cs="Times New Roman" w:eastAsia="Times New Roman"/>
+          <w:b w:val="0"/>
           <w:i/>
           <w:sz w:val="24"/>
         </w:rPr>
-        <w:t>Drama (kreatywna) w szkole podstawowej na Słowacji</w:t>
-      </w:r>
-      <w:r>
-        <w:rPr>
-          <w:rFonts w:ascii="Times New Roman" w:hAnsi="Times New Roman" w:cs="Times New Roman" w:eastAsia="Times New Roman"/>
+        <w:t>Wprowadzenie do metodologii badań pedagogicznych</w:t>
+      </w:r>
+      <w:r>
+        <w:rPr>
+          <w:rFonts w:ascii="Times New Roman" w:hAnsi="Times New Roman" w:cs="Times New Roman" w:eastAsia="Times New Roman"/>
+          <w:b w:val="0"/>
           <w:i w:val="0"/>
           <w:sz w:val="24"/>
         </w:rPr>
-        <w:t>, „Journal of Modern Science”, nr 2 (33), 2017, s. 61–70.</w:t>
+        <w:t>, Wydawnictwo Impuls, Kraków 1999.</w:t>
       </w:r>
     </w:p>
     <w:p>
@@ -1252,26 +1406,29 @@
       <w:r>
         <w:rPr>
           <w:rFonts w:ascii="Times New Roman" w:hAnsi="Times New Roman" w:cs="Times New Roman" w:eastAsia="Times New Roman"/>
+          <w:b w:val="0"/>
           <w:i w:val="0"/>
           <w:sz w:val="24"/>
         </w:rPr>
-        <w:t xml:space="preserve">Krajewski M., </w:t>
-      </w:r>
-      <w:r>
-        <w:rPr>
-          <w:rFonts w:ascii="Times New Roman" w:hAnsi="Times New Roman" w:cs="Times New Roman" w:eastAsia="Times New Roman"/>
+        <w:t xml:space="preserve">Łobocki M., </w:t>
+      </w:r>
+      <w:r>
+        <w:rPr>
+          <w:rFonts w:ascii="Times New Roman" w:hAnsi="Times New Roman" w:cs="Times New Roman" w:eastAsia="Times New Roman"/>
+          <w:b w:val="0"/>
           <w:i/>
           <w:sz w:val="24"/>
         </w:rPr>
-        <w:t>O metodologii nauk i zasadach pisarstwa naukowego</w:t>
-      </w:r>
-      <w:r>
-        <w:rPr>
-          <w:rFonts w:ascii="Times New Roman" w:hAnsi="Times New Roman" w:cs="Times New Roman" w:eastAsia="Times New Roman"/>
+        <w:t>Metody i techniki badań pedagogicznych</w:t>
+      </w:r>
+      <w:r>
+        <w:rPr>
+          <w:rFonts w:ascii="Times New Roman" w:hAnsi="Times New Roman" w:cs="Times New Roman" w:eastAsia="Times New Roman"/>
+          <w:b w:val="0"/>
           <w:i w:val="0"/>
           <w:sz w:val="24"/>
         </w:rPr>
-        <w:t>, Uniwersytet Śląski, Gliwice 2010.</w:t>
+        <w:t>, Wydawnictwo Impuls, Kraków 2009.</w:t>
       </w:r>
     </w:p>
     <w:p>
@@ -1283,26 +1440,29 @@
       <w:r>
         <w:rPr>
           <w:rFonts w:ascii="Times New Roman" w:hAnsi="Times New Roman" w:cs="Times New Roman" w:eastAsia="Times New Roman"/>
+          <w:b w:val="0"/>
           <w:i w:val="0"/>
           <w:sz w:val="24"/>
         </w:rPr>
-        <w:t xml:space="preserve">Kupiec H., </w:t>
-      </w:r>
-      <w:r>
-        <w:rPr>
-          <w:rFonts w:ascii="Times New Roman" w:hAnsi="Times New Roman" w:cs="Times New Roman" w:eastAsia="Times New Roman"/>
+        <w:t xml:space="preserve">Łoś E., Reszka A., </w:t>
+      </w:r>
+      <w:r>
+        <w:rPr>
+          <w:rFonts w:ascii="Times New Roman" w:hAnsi="Times New Roman" w:cs="Times New Roman" w:eastAsia="Times New Roman"/>
+          <w:b w:val="0"/>
           <w:i/>
           <w:sz w:val="24"/>
         </w:rPr>
-        <w:t>Rozwijanie kompetencji społecznych nieletnich a klimat wychowawczy placówki resocjalizacyjnej</w:t>
-      </w:r>
-      <w:r>
-        <w:rPr>
-          <w:rFonts w:ascii="Times New Roman" w:hAnsi="Times New Roman" w:cs="Times New Roman" w:eastAsia="Times New Roman"/>
+        <w:t>Metody nauczania stosowane w kształtowaniu kompetencji kluczowych. Przedsiębiorczość. Podręcznik metodyki operacyjnej</w:t>
+      </w:r>
+      <w:r>
+        <w:rPr>
+          <w:rFonts w:ascii="Times New Roman" w:hAnsi="Times New Roman" w:cs="Times New Roman" w:eastAsia="Times New Roman"/>
+          <w:b w:val="0"/>
           <w:i w:val="0"/>
           <w:sz w:val="24"/>
         </w:rPr>
-        <w:t>, „Resocjalizacja Polska”, nr 3, 2012, s. 383–398.</w:t>
+        <w:t>, Innovatio Press Wydawnictwo Naukowe Wyższej Szkoły Ekonomii i Innowacji, Lublin 2009.</w:t>
       </w:r>
     </w:p>
     <w:p>
@@ -1314,42 +1474,29 @@
       <w:r>
         <w:rPr>
           <w:rFonts w:ascii="Times New Roman" w:hAnsi="Times New Roman" w:cs="Times New Roman" w:eastAsia="Times New Roman"/>
+          <w:b w:val="0"/>
           <w:i w:val="0"/>
           <w:sz w:val="24"/>
         </w:rPr>
-        <w:t xml:space="preserve">Kupisiewicz Cz., Kupisiewicz M., </w:t>
-      </w:r>
-      <w:r>
-        <w:rPr>
-          <w:rFonts w:ascii="Times New Roman" w:hAnsi="Times New Roman" w:cs="Times New Roman" w:eastAsia="Times New Roman"/>
+        <w:t xml:space="preserve">Machulska H., </w:t>
+      </w:r>
+      <w:r>
+        <w:rPr>
+          <w:rFonts w:ascii="Times New Roman" w:hAnsi="Times New Roman" w:cs="Times New Roman" w:eastAsia="Times New Roman"/>
+          <w:b w:val="0"/>
           <w:i/>
           <w:sz w:val="24"/>
         </w:rPr>
-        <w:t>Drama</w:t>
-      </w:r>
-      <w:r>
-        <w:rPr>
-          <w:rFonts w:ascii="Times New Roman" w:hAnsi="Times New Roman" w:cs="Times New Roman" w:eastAsia="Times New Roman"/>
+        <w:t>Środki teatralne w procesie nauczania i wychowania</w:t>
+      </w:r>
+      <w:r>
+        <w:rPr>
+          <w:rFonts w:ascii="Times New Roman" w:hAnsi="Times New Roman" w:cs="Times New Roman" w:eastAsia="Times New Roman"/>
+          <w:b w:val="0"/>
           <w:i w:val="0"/>
           <w:sz w:val="24"/>
         </w:rPr>
-        <w:t xml:space="preserve">, [w:] </w:t>
-      </w:r>
-      <w:r>
-        <w:rPr>
-          <w:rFonts w:ascii="Times New Roman" w:hAnsi="Times New Roman" w:cs="Times New Roman" w:eastAsia="Times New Roman"/>
-          <w:i/>
-          <w:sz w:val="24"/>
-        </w:rPr>
-        <w:t>Słownik pedagogiczny</w:t>
-      </w:r>
-      <w:r>
-        <w:rPr>
-          <w:rFonts w:ascii="Times New Roman" w:hAnsi="Times New Roman" w:cs="Times New Roman" w:eastAsia="Times New Roman"/>
-          <w:i w:val="0"/>
-          <w:sz w:val="24"/>
-        </w:rPr>
-        <w:t>, Wydawnictwo Naukowe PWN, Warszawa 2009.</w:t>
+        <w:t>, „Drama. Poradnik dla nauczycieli i wychowawców”, z. 1, 1992, s. 12–16.</w:t>
       </w:r>
     </w:p>
     <w:p>
@@ -1361,26 +1508,29 @@
       <w:r>
         <w:rPr>
           <w:rFonts w:ascii="Times New Roman" w:hAnsi="Times New Roman" w:cs="Times New Roman" w:eastAsia="Times New Roman"/>
+          <w:b w:val="0"/>
           <w:i w:val="0"/>
           <w:sz w:val="24"/>
         </w:rPr>
-        <w:t xml:space="preserve">Kupisiewicz M., </w:t>
-      </w:r>
-      <w:r>
-        <w:rPr>
-          <w:rFonts w:ascii="Times New Roman" w:hAnsi="Times New Roman" w:cs="Times New Roman" w:eastAsia="Times New Roman"/>
+        <w:t xml:space="preserve">Machulska H., Pruszkowska A., Tatarowicz J., </w:t>
+      </w:r>
+      <w:r>
+        <w:rPr>
+          <w:rFonts w:ascii="Times New Roman" w:hAnsi="Times New Roman" w:cs="Times New Roman" w:eastAsia="Times New Roman"/>
+          <w:b w:val="0"/>
           <w:i/>
           <w:sz w:val="24"/>
         </w:rPr>
-        <w:t>Słownik pedagogiki specjalnej</w:t>
-      </w:r>
-      <w:r>
-        <w:rPr>
-          <w:rFonts w:ascii="Times New Roman" w:hAnsi="Times New Roman" w:cs="Times New Roman" w:eastAsia="Times New Roman"/>
+        <w:t>Drama w szkole podstawowej. Lekcje języka polskiego w klasach 4–6</w:t>
+      </w:r>
+      <w:r>
+        <w:rPr>
+          <w:rFonts w:ascii="Times New Roman" w:hAnsi="Times New Roman" w:cs="Times New Roman" w:eastAsia="Times New Roman"/>
+          <w:b w:val="0"/>
           <w:i w:val="0"/>
           <w:sz w:val="24"/>
         </w:rPr>
-        <w:t>, Wydawnictwo Naukowe PWN, Warszawa 2013.</w:t>
+        <w:t>, Wydawnictwa Szkolne i Pedagogiczne, Warszawa 1997.</w:t>
       </w:r>
     </w:p>
     <w:p>
@@ -1392,26 +1542,29 @@
       <w:r>
         <w:rPr>
           <w:rFonts w:ascii="Times New Roman" w:hAnsi="Times New Roman" w:cs="Times New Roman" w:eastAsia="Times New Roman"/>
+          <w:b w:val="0"/>
           <w:i w:val="0"/>
           <w:sz w:val="24"/>
         </w:rPr>
-        <w:t xml:space="preserve">Leśniewska K., Szczepkowska K., </w:t>
-      </w:r>
-      <w:r>
-        <w:rPr>
-          <w:rFonts w:ascii="Times New Roman" w:hAnsi="Times New Roman" w:cs="Times New Roman" w:eastAsia="Times New Roman"/>
+        <w:t xml:space="preserve">Martowska K., </w:t>
+      </w:r>
+      <w:r>
+        <w:rPr>
+          <w:rFonts w:ascii="Times New Roman" w:hAnsi="Times New Roman" w:cs="Times New Roman" w:eastAsia="Times New Roman"/>
+          <w:b w:val="0"/>
           <w:i/>
           <w:sz w:val="24"/>
         </w:rPr>
-        <w:t>Kompetencje społeczne w aspekcie kompetencji kluczowych</w:t>
-      </w:r>
-      <w:r>
-        <w:rPr>
-          <w:rFonts w:ascii="Times New Roman" w:hAnsi="Times New Roman" w:cs="Times New Roman" w:eastAsia="Times New Roman"/>
+        <w:t>Psychologiczne uwarunkowania kompetencji społecznych</w:t>
+      </w:r>
+      <w:r>
+        <w:rPr>
+          <w:rFonts w:ascii="Times New Roman" w:hAnsi="Times New Roman" w:cs="Times New Roman" w:eastAsia="Times New Roman"/>
+          <w:b w:val="0"/>
           <w:i w:val="0"/>
           <w:sz w:val="24"/>
         </w:rPr>
-        <w:t>, „Meritum. Mazowiecki Kwartalnik Edukacyjny”, nr 2, 2014, s. 4–6.</w:t>
+        <w:t>, Warszawa 2012.</w:t>
       </w:r>
     </w:p>
     <w:p>
@@ -1423,26 +1576,29 @@
       <w:r>
         <w:rPr>
           <w:rFonts w:ascii="Times New Roman" w:hAnsi="Times New Roman" w:cs="Times New Roman" w:eastAsia="Times New Roman"/>
+          <w:b w:val="0"/>
           <w:i w:val="0"/>
           <w:sz w:val="24"/>
         </w:rPr>
-        <w:t xml:space="preserve">Lewandowska-Kidoń T., </w:t>
-      </w:r>
-      <w:r>
-        <w:rPr>
-          <w:rFonts w:ascii="Times New Roman" w:hAnsi="Times New Roman" w:cs="Times New Roman" w:eastAsia="Times New Roman"/>
+        <w:t xml:space="preserve">Maszke A. W., </w:t>
+      </w:r>
+      <w:r>
+        <w:rPr>
+          <w:rFonts w:ascii="Times New Roman" w:hAnsi="Times New Roman" w:cs="Times New Roman" w:eastAsia="Times New Roman"/>
+          <w:b w:val="0"/>
           <w:i/>
           <w:sz w:val="24"/>
         </w:rPr>
-        <w:t>Drama w kształceniu pedagogicznym</w:t>
-      </w:r>
-      <w:r>
-        <w:rPr>
-          <w:rFonts w:ascii="Times New Roman" w:hAnsi="Times New Roman" w:cs="Times New Roman" w:eastAsia="Times New Roman"/>
+        <w:t>Metody i techniki badań pedagogicznych</w:t>
+      </w:r>
+      <w:r>
+        <w:rPr>
+          <w:rFonts w:ascii="Times New Roman" w:hAnsi="Times New Roman" w:cs="Times New Roman" w:eastAsia="Times New Roman"/>
+          <w:b w:val="0"/>
           <w:i w:val="0"/>
           <w:sz w:val="24"/>
         </w:rPr>
-        <w:t>, Wydawnictwo Uniwersytetu Marii Curie-Skłodowskiej, Lublin 2001.</w:t>
+        <w:t>, Wydawnictwo Uniwersytetu Rzeszowskiego, Rzeszów 2008.</w:t>
       </w:r>
     </w:p>
     <w:p>
@@ -1454,26 +1610,29 @@
       <w:r>
         <w:rPr>
           <w:rFonts w:ascii="Times New Roman" w:hAnsi="Times New Roman" w:cs="Times New Roman" w:eastAsia="Times New Roman"/>
+          <w:b w:val="0"/>
           <w:i w:val="0"/>
           <w:sz w:val="24"/>
         </w:rPr>
-        <w:t xml:space="preserve">Łobocki M., </w:t>
-      </w:r>
-      <w:r>
-        <w:rPr>
-          <w:rFonts w:ascii="Times New Roman" w:hAnsi="Times New Roman" w:cs="Times New Roman" w:eastAsia="Times New Roman"/>
+        <w:t xml:space="preserve">Matczak A., </w:t>
+      </w:r>
+      <w:r>
+        <w:rPr>
+          <w:rFonts w:ascii="Times New Roman" w:hAnsi="Times New Roman" w:cs="Times New Roman" w:eastAsia="Times New Roman"/>
+          <w:b w:val="0"/>
           <w:i/>
           <w:sz w:val="24"/>
         </w:rPr>
-        <w:t>Wprowadzenie do metodologii badań pedagogicznych</w:t>
-      </w:r>
-      <w:r>
-        <w:rPr>
-          <w:rFonts w:ascii="Times New Roman" w:hAnsi="Times New Roman" w:cs="Times New Roman" w:eastAsia="Times New Roman"/>
+        <w:t>Kwestionariusz Kompetencji Społecznych KKS. Podręcznik</w:t>
+      </w:r>
+      <w:r>
+        <w:rPr>
+          <w:rFonts w:ascii="Times New Roman" w:hAnsi="Times New Roman" w:cs="Times New Roman" w:eastAsia="Times New Roman"/>
+          <w:b w:val="0"/>
           <w:i w:val="0"/>
           <w:sz w:val="24"/>
         </w:rPr>
-        <w:t>, Wydawnictwo Impuls, Kraków 1999.</w:t>
+        <w:t>, Pracownia Testów Psychologicznych PTP, Warszawa 2001.</w:t>
       </w:r>
     </w:p>
     <w:p>
@@ -1485,26 +1644,47 @@
       <w:r>
         <w:rPr>
           <w:rFonts w:ascii="Times New Roman" w:hAnsi="Times New Roman" w:cs="Times New Roman" w:eastAsia="Times New Roman"/>
+          <w:b w:val="0"/>
           <w:i w:val="0"/>
           <w:sz w:val="24"/>
         </w:rPr>
-        <w:t xml:space="preserve">Łobocki M., </w:t>
-      </w:r>
-      <w:r>
-        <w:rPr>
-          <w:rFonts w:ascii="Times New Roman" w:hAnsi="Times New Roman" w:cs="Times New Roman" w:eastAsia="Times New Roman"/>
+        <w:t xml:space="preserve">Męczkowska A., </w:t>
+      </w:r>
+      <w:r>
+        <w:rPr>
+          <w:rFonts w:ascii="Times New Roman" w:hAnsi="Times New Roman" w:cs="Times New Roman" w:eastAsia="Times New Roman"/>
+          <w:b w:val="0"/>
           <w:i/>
           <w:sz w:val="24"/>
         </w:rPr>
-        <w:t>Metody i techniki badań pedagogicznych</w:t>
-      </w:r>
-      <w:r>
-        <w:rPr>
-          <w:rFonts w:ascii="Times New Roman" w:hAnsi="Times New Roman" w:cs="Times New Roman" w:eastAsia="Times New Roman"/>
+        <w:t>Kompetencja</w:t>
+      </w:r>
+      <w:r>
+        <w:rPr>
+          <w:rFonts w:ascii="Times New Roman" w:hAnsi="Times New Roman" w:cs="Times New Roman" w:eastAsia="Times New Roman"/>
+          <w:b w:val="0"/>
           <w:i w:val="0"/>
           <w:sz w:val="24"/>
         </w:rPr>
-        <w:t>, Wydawnictwo Impuls, Kraków 2009.</w:t>
+        <w:t xml:space="preserve">, [w:] </w:t>
+      </w:r>
+      <w:r>
+        <w:rPr>
+          <w:rFonts w:ascii="Times New Roman" w:hAnsi="Times New Roman" w:cs="Times New Roman" w:eastAsia="Times New Roman"/>
+          <w:b w:val="0"/>
+          <w:i/>
+          <w:sz w:val="24"/>
+        </w:rPr>
+        <w:t>Encyklopedia pedagogiczna XXI wieku</w:t>
+      </w:r>
+      <w:r>
+        <w:rPr>
+          <w:rFonts w:ascii="Times New Roman" w:hAnsi="Times New Roman" w:cs="Times New Roman" w:eastAsia="Times New Roman"/>
+          <w:b w:val="0"/>
+          <w:i w:val="0"/>
+          <w:sz w:val="24"/>
+        </w:rPr>
+        <w:t>, t. G–Ł, T. Pilch (red.), Wydawnictwo Akademickie „Żak”, Warszawa 2003, s. 693–696.</w:t>
       </w:r>
     </w:p>
     <w:p>
@@ -1516,26 +1696,29 @@
       <w:r>
         <w:rPr>
           <w:rFonts w:ascii="Times New Roman" w:hAnsi="Times New Roman" w:cs="Times New Roman" w:eastAsia="Times New Roman"/>
+          <w:b w:val="0"/>
           <w:i w:val="0"/>
           <w:sz w:val="24"/>
         </w:rPr>
-        <w:t xml:space="preserve">Łoś E., Reszka A., </w:t>
-      </w:r>
-      <w:r>
-        <w:rPr>
-          <w:rFonts w:ascii="Times New Roman" w:hAnsi="Times New Roman" w:cs="Times New Roman" w:eastAsia="Times New Roman"/>
+        <w:t xml:space="preserve">Michalska-Dominiak B., Grocholiński P., </w:t>
+      </w:r>
+      <w:r>
+        <w:rPr>
+          <w:rFonts w:ascii="Times New Roman" w:hAnsi="Times New Roman" w:cs="Times New Roman" w:eastAsia="Times New Roman"/>
+          <w:b w:val="0"/>
           <w:i/>
           <w:sz w:val="24"/>
         </w:rPr>
-        <w:t>Metody nauczania stosowane w kształtowaniu kompetencji kluczowych. Przedsiębiorczość. Podręcznik metodyki operacyjnej</w:t>
-      </w:r>
-      <w:r>
-        <w:rPr>
-          <w:rFonts w:ascii="Times New Roman" w:hAnsi="Times New Roman" w:cs="Times New Roman" w:eastAsia="Times New Roman"/>
+        <w:t>Poradnik design thinking – czyli jak wykorzystać myślenie projektowe w biznesie</w:t>
+      </w:r>
+      <w:r>
+        <w:rPr>
+          <w:rFonts w:ascii="Times New Roman" w:hAnsi="Times New Roman" w:cs="Times New Roman" w:eastAsia="Times New Roman"/>
+          <w:b w:val="0"/>
           <w:i w:val="0"/>
           <w:sz w:val="24"/>
         </w:rPr>
-        <w:t>, Innovatio Press Wydawnictwo Naukowe Wyższej Szkoły Ekonomii i Innowacji, Lublin 2009.</w:t>
+        <w:t>, Gliwice 2019.</w:t>
       </w:r>
     </w:p>
     <w:p>
@@ -1547,26 +1730,29 @@
       <w:r>
         <w:rPr>
           <w:rFonts w:ascii="Times New Roman" w:hAnsi="Times New Roman" w:cs="Times New Roman" w:eastAsia="Times New Roman"/>
+          <w:b w:val="0"/>
           <w:i w:val="0"/>
           <w:sz w:val="24"/>
         </w:rPr>
-        <w:t xml:space="preserve">Machulska H., </w:t>
-      </w:r>
-      <w:r>
-        <w:rPr>
-          <w:rFonts w:ascii="Times New Roman" w:hAnsi="Times New Roman" w:cs="Times New Roman" w:eastAsia="Times New Roman"/>
+        <w:t xml:space="preserve">Michałowska D., </w:t>
+      </w:r>
+      <w:r>
+        <w:rPr>
+          <w:rFonts w:ascii="Times New Roman" w:hAnsi="Times New Roman" w:cs="Times New Roman" w:eastAsia="Times New Roman"/>
+          <w:b w:val="0"/>
           <w:i/>
           <w:sz w:val="24"/>
         </w:rPr>
-        <w:t>Środki teatralne w procesie nauczania i wychowania</w:t>
-      </w:r>
-      <w:r>
-        <w:rPr>
-          <w:rFonts w:ascii="Times New Roman" w:hAnsi="Times New Roman" w:cs="Times New Roman" w:eastAsia="Times New Roman"/>
+        <w:t>Formy w dramie. Strategie i techniki w dramie</w:t>
+      </w:r>
+      <w:r>
+        <w:rPr>
+          <w:rFonts w:ascii="Times New Roman" w:hAnsi="Times New Roman" w:cs="Times New Roman" w:eastAsia="Times New Roman"/>
+          <w:b w:val="0"/>
           <w:i w:val="0"/>
           <w:sz w:val="24"/>
         </w:rPr>
-        <w:t>, „Drama. Poradnik dla nauczycieli i wychowawców”, z. 1, 1992, s. 12–16.</w:t>
+        <w:t>, Uniwersytet im. Adama Mickiewicza w Poznaniu, Poznań 2013.</w:t>
       </w:r>
     </w:p>
     <w:p>
@@ -1578,26 +1764,29 @@
       <w:r>
         <w:rPr>
           <w:rFonts w:ascii="Times New Roman" w:hAnsi="Times New Roman" w:cs="Times New Roman" w:eastAsia="Times New Roman"/>
+          <w:b w:val="0"/>
           <w:i w:val="0"/>
           <w:sz w:val="24"/>
         </w:rPr>
-        <w:t xml:space="preserve">Machulska H., Pruszkowska A., Tatarowicz J., </w:t>
-      </w:r>
-      <w:r>
-        <w:rPr>
-          <w:rFonts w:ascii="Times New Roman" w:hAnsi="Times New Roman" w:cs="Times New Roman" w:eastAsia="Times New Roman"/>
+        <w:t xml:space="preserve">Nęcka E., </w:t>
+      </w:r>
+      <w:r>
+        <w:rPr>
+          <w:rFonts w:ascii="Times New Roman" w:hAnsi="Times New Roman" w:cs="Times New Roman" w:eastAsia="Times New Roman"/>
+          <w:b w:val="0"/>
           <w:i/>
           <w:sz w:val="24"/>
         </w:rPr>
-        <w:t>Drama w szkole podstawowej. Lekcje języka polskiego w klasach 4–6</w:t>
-      </w:r>
-      <w:r>
-        <w:rPr>
-          <w:rFonts w:ascii="Times New Roman" w:hAnsi="Times New Roman" w:cs="Times New Roman" w:eastAsia="Times New Roman"/>
+        <w:t>Inteligencja. Geneza, struktura, funkcje</w:t>
+      </w:r>
+      <w:r>
+        <w:rPr>
+          <w:rFonts w:ascii="Times New Roman" w:hAnsi="Times New Roman" w:cs="Times New Roman" w:eastAsia="Times New Roman"/>
+          <w:b w:val="0"/>
           <w:i w:val="0"/>
           <w:sz w:val="24"/>
         </w:rPr>
-        <w:t>, Wydawnictwa Szkolne i Pedagogiczne, Warszawa 1997.</w:t>
+        <w:t>, Gdańskie Wydawnictwo Psychologiczne, Gdańsk 2003.</w:t>
       </w:r>
     </w:p>
     <w:p>
@@ -1609,26 +1798,29 @@
       <w:r>
         <w:rPr>
           <w:rFonts w:ascii="Times New Roman" w:hAnsi="Times New Roman" w:cs="Times New Roman" w:eastAsia="Times New Roman"/>
+          <w:b w:val="0"/>
           <w:i w:val="0"/>
           <w:sz w:val="24"/>
         </w:rPr>
-        <w:t xml:space="preserve">Martowska K., </w:t>
-      </w:r>
-      <w:r>
-        <w:rPr>
-          <w:rFonts w:ascii="Times New Roman" w:hAnsi="Times New Roman" w:cs="Times New Roman" w:eastAsia="Times New Roman"/>
+        <w:t xml:space="preserve">Nowak S., </w:t>
+      </w:r>
+      <w:r>
+        <w:rPr>
+          <w:rFonts w:ascii="Times New Roman" w:hAnsi="Times New Roman" w:cs="Times New Roman" w:eastAsia="Times New Roman"/>
+          <w:b w:val="0"/>
           <w:i/>
           <w:sz w:val="24"/>
         </w:rPr>
-        <w:t>Psychologiczne uwarunkowania kompetencji społecznych</w:t>
-      </w:r>
-      <w:r>
-        <w:rPr>
-          <w:rFonts w:ascii="Times New Roman" w:hAnsi="Times New Roman" w:cs="Times New Roman" w:eastAsia="Times New Roman"/>
+        <w:t>Metodologia badań socjologicznych</w:t>
+      </w:r>
+      <w:r>
+        <w:rPr>
+          <w:rFonts w:ascii="Times New Roman" w:hAnsi="Times New Roman" w:cs="Times New Roman" w:eastAsia="Times New Roman"/>
+          <w:b w:val="0"/>
           <w:i w:val="0"/>
           <w:sz w:val="24"/>
         </w:rPr>
-        <w:t>, Warszawa 2012.</w:t>
+        <w:t>, PWN, Warszawa 1970.</w:t>
       </w:r>
     </w:p>
     <w:p>
@@ -1640,26 +1832,29 @@
       <w:r>
         <w:rPr>
           <w:rFonts w:ascii="Times New Roman" w:hAnsi="Times New Roman" w:cs="Times New Roman" w:eastAsia="Times New Roman"/>
+          <w:b w:val="0"/>
           <w:i w:val="0"/>
           <w:sz w:val="24"/>
         </w:rPr>
-        <w:t xml:space="preserve">Maszke A. W., </w:t>
-      </w:r>
-      <w:r>
-        <w:rPr>
-          <w:rFonts w:ascii="Times New Roman" w:hAnsi="Times New Roman" w:cs="Times New Roman" w:eastAsia="Times New Roman"/>
+        <w:t xml:space="preserve">Nowak S., </w:t>
+      </w:r>
+      <w:r>
+        <w:rPr>
+          <w:rFonts w:ascii="Times New Roman" w:hAnsi="Times New Roman" w:cs="Times New Roman" w:eastAsia="Times New Roman"/>
+          <w:b w:val="0"/>
           <w:i/>
           <w:sz w:val="24"/>
         </w:rPr>
-        <w:t>Metody i techniki badań pedagogicznych</w:t>
-      </w:r>
-      <w:r>
-        <w:rPr>
-          <w:rFonts w:ascii="Times New Roman" w:hAnsi="Times New Roman" w:cs="Times New Roman" w:eastAsia="Times New Roman"/>
+        <w:t>Metodologia badań społecznych</w:t>
+      </w:r>
+      <w:r>
+        <w:rPr>
+          <w:rFonts w:ascii="Times New Roman" w:hAnsi="Times New Roman" w:cs="Times New Roman" w:eastAsia="Times New Roman"/>
+          <w:b w:val="0"/>
           <w:i w:val="0"/>
           <w:sz w:val="24"/>
         </w:rPr>
-        <w:t>, Wydawnictwo Uniwersytetu Rzeszowskiego, Rzeszów 2008.</w:t>
+        <w:t>, PWN, Warszawa 1985.</w:t>
       </w:r>
     </w:p>
     <w:p>
@@ -1671,26 +1866,29 @@
       <w:r>
         <w:rPr>
           <w:rFonts w:ascii="Times New Roman" w:hAnsi="Times New Roman" w:cs="Times New Roman" w:eastAsia="Times New Roman"/>
+          <w:b w:val="0"/>
           <w:i w:val="0"/>
           <w:sz w:val="24"/>
         </w:rPr>
-        <w:t xml:space="preserve">Matczak A., </w:t>
-      </w:r>
-      <w:r>
-        <w:rPr>
-          <w:rFonts w:ascii="Times New Roman" w:hAnsi="Times New Roman" w:cs="Times New Roman" w:eastAsia="Times New Roman"/>
+        <w:t xml:space="preserve">Okoń W., </w:t>
+      </w:r>
+      <w:r>
+        <w:rPr>
+          <w:rFonts w:ascii="Times New Roman" w:hAnsi="Times New Roman" w:cs="Times New Roman" w:eastAsia="Times New Roman"/>
+          <w:b w:val="0"/>
           <w:i/>
           <w:sz w:val="24"/>
         </w:rPr>
-        <w:t>Kwestionariusz Kompetencji Społecznych KKS. Podręcznik</w:t>
-      </w:r>
-      <w:r>
-        <w:rPr>
-          <w:rFonts w:ascii="Times New Roman" w:hAnsi="Times New Roman" w:cs="Times New Roman" w:eastAsia="Times New Roman"/>
+        <w:t>Nowy słownik pedagogiczny</w:t>
+      </w:r>
+      <w:r>
+        <w:rPr>
+          <w:rFonts w:ascii="Times New Roman" w:hAnsi="Times New Roman" w:cs="Times New Roman" w:eastAsia="Times New Roman"/>
+          <w:b w:val="0"/>
           <w:i w:val="0"/>
           <w:sz w:val="24"/>
         </w:rPr>
-        <w:t>, Pracownia Testów Psychologicznych PTP, Warszawa 2001.</w:t>
+        <w:t>, Wydawnictwo Akademickie „Żak”, Warszawa 1998.</w:t>
       </w:r>
     </w:p>
     <w:p>
@@ -1702,42 +1900,29 @@
       <w:r>
         <w:rPr>
           <w:rFonts w:ascii="Times New Roman" w:hAnsi="Times New Roman" w:cs="Times New Roman" w:eastAsia="Times New Roman"/>
+          <w:b w:val="0"/>
           <w:i w:val="0"/>
           <w:sz w:val="24"/>
         </w:rPr>
-        <w:t xml:space="preserve">Męczkowska A., </w:t>
-      </w:r>
-      <w:r>
-        <w:rPr>
-          <w:rFonts w:ascii="Times New Roman" w:hAnsi="Times New Roman" w:cs="Times New Roman" w:eastAsia="Times New Roman"/>
+        <w:t xml:space="preserve">Okoń W., </w:t>
+      </w:r>
+      <w:r>
+        <w:rPr>
+          <w:rFonts w:ascii="Times New Roman" w:hAnsi="Times New Roman" w:cs="Times New Roman" w:eastAsia="Times New Roman"/>
+          <w:b w:val="0"/>
           <w:i/>
           <w:sz w:val="24"/>
         </w:rPr>
-        <w:t>Kompetencja</w:t>
-      </w:r>
-      <w:r>
-        <w:rPr>
-          <w:rFonts w:ascii="Times New Roman" w:hAnsi="Times New Roman" w:cs="Times New Roman" w:eastAsia="Times New Roman"/>
+        <w:t>Nowy słownik pedagogiczny</w:t>
+      </w:r>
+      <w:r>
+        <w:rPr>
+          <w:rFonts w:ascii="Times New Roman" w:hAnsi="Times New Roman" w:cs="Times New Roman" w:eastAsia="Times New Roman"/>
+          <w:b w:val="0"/>
           <w:i w:val="0"/>
           <w:sz w:val="24"/>
         </w:rPr>
-        <w:t xml:space="preserve">, [w:] </w:t>
-      </w:r>
-      <w:r>
-        <w:rPr>
-          <w:rFonts w:ascii="Times New Roman" w:hAnsi="Times New Roman" w:cs="Times New Roman" w:eastAsia="Times New Roman"/>
-          <w:i/>
-          <w:sz w:val="24"/>
-        </w:rPr>
-        <w:t>Encyklopedia pedagogiczna XXI wieku</w:t>
-      </w:r>
-      <w:r>
-        <w:rPr>
-          <w:rFonts w:ascii="Times New Roman" w:hAnsi="Times New Roman" w:cs="Times New Roman" w:eastAsia="Times New Roman"/>
-          <w:i w:val="0"/>
-          <w:sz w:val="24"/>
-        </w:rPr>
-        <w:t>, t. G–Ł, T. Pilch (red.), Wydawnictwo Akademickie „Żak”, Warszawa 2003, s. 693–696.</w:t>
+        <w:t>, Wydawnictwo Akademickie „Żak”, Warszawa 2001.</w:t>
       </w:r>
     </w:p>
     <w:p>
@@ -1749,26 +1934,29 @@
       <w:r>
         <w:rPr>
           <w:rFonts w:ascii="Times New Roman" w:hAnsi="Times New Roman" w:cs="Times New Roman" w:eastAsia="Times New Roman"/>
+          <w:b w:val="0"/>
           <w:i w:val="0"/>
           <w:sz w:val="24"/>
         </w:rPr>
-        <w:t xml:space="preserve">Michalska-Dominiak B., Grocholiński P., </w:t>
-      </w:r>
-      <w:r>
-        <w:rPr>
-          <w:rFonts w:ascii="Times New Roman" w:hAnsi="Times New Roman" w:cs="Times New Roman" w:eastAsia="Times New Roman"/>
+        <w:t xml:space="preserve">Ordon U., </w:t>
+      </w:r>
+      <w:r>
+        <w:rPr>
+          <w:rFonts w:ascii="Times New Roman" w:hAnsi="Times New Roman" w:cs="Times New Roman" w:eastAsia="Times New Roman"/>
+          <w:b w:val="0"/>
           <w:i/>
           <w:sz w:val="24"/>
         </w:rPr>
-        <w:t>Poradnik design thinking – czyli jak wykorzystać myślenie projektowe w biznesie</w:t>
-      </w:r>
-      <w:r>
-        <w:rPr>
-          <w:rFonts w:ascii="Times New Roman" w:hAnsi="Times New Roman" w:cs="Times New Roman" w:eastAsia="Times New Roman"/>
+        <w:t>Wykorzystanie metod aktywizujących przez nauczycieli przedszkoli i klas I–III – raport z badań</w:t>
+      </w:r>
+      <w:r>
+        <w:rPr>
+          <w:rFonts w:ascii="Times New Roman" w:hAnsi="Times New Roman" w:cs="Times New Roman" w:eastAsia="Times New Roman"/>
+          <w:b w:val="0"/>
           <w:i w:val="0"/>
           <w:sz w:val="24"/>
         </w:rPr>
-        <w:t>, Gliwice 2019.</w:t>
+        <w:t>, „Edukacja Elementarna w Teorii i Praktyce”, nr 3 (37), 2015, s. 129–144.</w:t>
       </w:r>
     </w:p>
     <w:p>
@@ -1780,26 +1968,29 @@
       <w:r>
         <w:rPr>
           <w:rFonts w:ascii="Times New Roman" w:hAnsi="Times New Roman" w:cs="Times New Roman" w:eastAsia="Times New Roman"/>
+          <w:b w:val="0"/>
           <w:i w:val="0"/>
           <w:sz w:val="24"/>
         </w:rPr>
-        <w:t xml:space="preserve">Michałowska D., </w:t>
-      </w:r>
-      <w:r>
-        <w:rPr>
-          <w:rFonts w:ascii="Times New Roman" w:hAnsi="Times New Roman" w:cs="Times New Roman" w:eastAsia="Times New Roman"/>
+        <w:t xml:space="preserve">Pankowska K., </w:t>
+      </w:r>
+      <w:r>
+        <w:rPr>
+          <w:rFonts w:ascii="Times New Roman" w:hAnsi="Times New Roman" w:cs="Times New Roman" w:eastAsia="Times New Roman"/>
+          <w:b w:val="0"/>
           <w:i/>
           <w:sz w:val="24"/>
         </w:rPr>
-        <w:t>Formy w dramie. Strategie i techniki w dramie</w:t>
-      </w:r>
-      <w:r>
-        <w:rPr>
-          <w:rFonts w:ascii="Times New Roman" w:hAnsi="Times New Roman" w:cs="Times New Roman" w:eastAsia="Times New Roman"/>
+        <w:t>Drama – zabawa i myślenie</w:t>
+      </w:r>
+      <w:r>
+        <w:rPr>
+          <w:rFonts w:ascii="Times New Roman" w:hAnsi="Times New Roman" w:cs="Times New Roman" w:eastAsia="Times New Roman"/>
+          <w:b w:val="0"/>
           <w:i w:val="0"/>
           <w:sz w:val="24"/>
         </w:rPr>
-        <w:t>, Uniwersytet im. Adama Mickiewicza w Poznaniu, Poznań 2013.</w:t>
+        <w:t>, Centralny Ośrodek Metodyki Upowszechniania Kultury, Warszawa 1990.</w:t>
       </w:r>
     </w:p>
     <w:p>
@@ -1811,26 +2002,29 @@
       <w:r>
         <w:rPr>
           <w:rFonts w:ascii="Times New Roman" w:hAnsi="Times New Roman" w:cs="Times New Roman" w:eastAsia="Times New Roman"/>
+          <w:b w:val="0"/>
           <w:i w:val="0"/>
           <w:sz w:val="24"/>
         </w:rPr>
-        <w:t xml:space="preserve">Nęcka E., </w:t>
-      </w:r>
-      <w:r>
-        <w:rPr>
-          <w:rFonts w:ascii="Times New Roman" w:hAnsi="Times New Roman" w:cs="Times New Roman" w:eastAsia="Times New Roman"/>
+        <w:t xml:space="preserve">Pankowska K., </w:t>
+      </w:r>
+      <w:r>
+        <w:rPr>
+          <w:rFonts w:ascii="Times New Roman" w:hAnsi="Times New Roman" w:cs="Times New Roman" w:eastAsia="Times New Roman"/>
+          <w:b w:val="0"/>
           <w:i/>
           <w:sz w:val="24"/>
         </w:rPr>
-        <w:t>Inteligencja. Geneza, struktura, funkcje</w:t>
-      </w:r>
-      <w:r>
-        <w:rPr>
-          <w:rFonts w:ascii="Times New Roman" w:hAnsi="Times New Roman" w:cs="Times New Roman" w:eastAsia="Times New Roman"/>
+        <w:t>Edukacja przez dramę</w:t>
+      </w:r>
+      <w:r>
+        <w:rPr>
+          <w:rFonts w:ascii="Times New Roman" w:hAnsi="Times New Roman" w:cs="Times New Roman" w:eastAsia="Times New Roman"/>
+          <w:b w:val="0"/>
           <w:i w:val="0"/>
           <w:sz w:val="24"/>
         </w:rPr>
-        <w:t>, Gdańskie Wydawnictwo Psychologiczne, Gdańsk 2003.</w:t>
+        <w:t>, Wydawnictwa Szkolne i Pedagogiczne, Warszawa 1997.</w:t>
       </w:r>
     </w:p>
     <w:p>
@@ -1842,26 +2036,29 @@
       <w:r>
         <w:rPr>
           <w:rFonts w:ascii="Times New Roman" w:hAnsi="Times New Roman" w:cs="Times New Roman" w:eastAsia="Times New Roman"/>
+          <w:b w:val="0"/>
           <w:i w:val="0"/>
           <w:sz w:val="24"/>
         </w:rPr>
-        <w:t xml:space="preserve">Nowak S., </w:t>
-      </w:r>
-      <w:r>
-        <w:rPr>
-          <w:rFonts w:ascii="Times New Roman" w:hAnsi="Times New Roman" w:cs="Times New Roman" w:eastAsia="Times New Roman"/>
+        <w:t xml:space="preserve">Pankowska K., </w:t>
+      </w:r>
+      <w:r>
+        <w:rPr>
+          <w:rFonts w:ascii="Times New Roman" w:hAnsi="Times New Roman" w:cs="Times New Roman" w:eastAsia="Times New Roman"/>
+          <w:b w:val="0"/>
           <w:i/>
           <w:sz w:val="24"/>
         </w:rPr>
-        <w:t>Metodologia badań socjologicznych</w:t>
-      </w:r>
-      <w:r>
-        <w:rPr>
-          <w:rFonts w:ascii="Times New Roman" w:hAnsi="Times New Roman" w:cs="Times New Roman" w:eastAsia="Times New Roman"/>
+        <w:t>Pedagogika dramy: teoria i praktyka</w:t>
+      </w:r>
+      <w:r>
+        <w:rPr>
+          <w:rFonts w:ascii="Times New Roman" w:hAnsi="Times New Roman" w:cs="Times New Roman" w:eastAsia="Times New Roman"/>
+          <w:b w:val="0"/>
           <w:i w:val="0"/>
           <w:sz w:val="24"/>
         </w:rPr>
-        <w:t>, PWN, Warszawa 1970.</w:t>
+        <w:t>, Wydawnictwo Akademickie „Żak”, Warszawa 2000.</w:t>
       </w:r>
     </w:p>
     <w:p>
@@ -1873,26 +2070,29 @@
       <w:r>
         <w:rPr>
           <w:rFonts w:ascii="Times New Roman" w:hAnsi="Times New Roman" w:cs="Times New Roman" w:eastAsia="Times New Roman"/>
+          <w:b w:val="0"/>
           <w:i w:val="0"/>
           <w:sz w:val="24"/>
         </w:rPr>
-        <w:t xml:space="preserve">Nowak S., </w:t>
-      </w:r>
-      <w:r>
-        <w:rPr>
-          <w:rFonts w:ascii="Times New Roman" w:hAnsi="Times New Roman" w:cs="Times New Roman" w:eastAsia="Times New Roman"/>
+        <w:t xml:space="preserve">Pankowska K., </w:t>
+      </w:r>
+      <w:r>
+        <w:rPr>
+          <w:rFonts w:ascii="Times New Roman" w:hAnsi="Times New Roman" w:cs="Times New Roman" w:eastAsia="Times New Roman"/>
+          <w:b w:val="0"/>
           <w:i/>
           <w:sz w:val="24"/>
         </w:rPr>
-        <w:t>Metodologia badań społecznych</w:t>
-      </w:r>
-      <w:r>
-        <w:rPr>
-          <w:rFonts w:ascii="Times New Roman" w:hAnsi="Times New Roman" w:cs="Times New Roman" w:eastAsia="Times New Roman"/>
+        <w:t>Drama. Konteksty teoretyczne</w:t>
+      </w:r>
+      <w:r>
+        <w:rPr>
+          <w:rFonts w:ascii="Times New Roman" w:hAnsi="Times New Roman" w:cs="Times New Roman" w:eastAsia="Times New Roman"/>
+          <w:b w:val="0"/>
           <w:i w:val="0"/>
           <w:sz w:val="24"/>
         </w:rPr>
-        <w:t>, PWN, Warszawa 1985.</w:t>
+        <w:t>, Wydawnictwa Uniwersytetu Warszawskiego, Warszawa 2013.</w:t>
       </w:r>
     </w:p>
     <w:p>
@@ -1904,26 +2104,29 @@
       <w:r>
         <w:rPr>
           <w:rFonts w:ascii="Times New Roman" w:hAnsi="Times New Roman" w:cs="Times New Roman" w:eastAsia="Times New Roman"/>
+          <w:b w:val="0"/>
           <w:i w:val="0"/>
           <w:sz w:val="24"/>
         </w:rPr>
-        <w:t xml:space="preserve">Okoń W., </w:t>
-      </w:r>
-      <w:r>
-        <w:rPr>
-          <w:rFonts w:ascii="Times New Roman" w:hAnsi="Times New Roman" w:cs="Times New Roman" w:eastAsia="Times New Roman"/>
+        <w:t xml:space="preserve">Pemberton-Billing R. N., Clegg J. D., </w:t>
+      </w:r>
+      <w:r>
+        <w:rPr>
+          <w:rFonts w:ascii="Times New Roman" w:hAnsi="Times New Roman" w:cs="Times New Roman" w:eastAsia="Times New Roman"/>
+          <w:b w:val="0"/>
           <w:i/>
           <w:sz w:val="24"/>
         </w:rPr>
-        <w:t>Nowy słownik pedagogiczny</w:t>
-      </w:r>
-      <w:r>
-        <w:rPr>
-          <w:rFonts w:ascii="Times New Roman" w:hAnsi="Times New Roman" w:cs="Times New Roman" w:eastAsia="Times New Roman"/>
+        <w:t>Teaching Drama. An Approach to Educational Drama in the Secondary School</w:t>
+      </w:r>
+      <w:r>
+        <w:rPr>
+          <w:rFonts w:ascii="Times New Roman" w:hAnsi="Times New Roman" w:cs="Times New Roman" w:eastAsia="Times New Roman"/>
+          <w:b w:val="0"/>
           <w:i w:val="0"/>
           <w:sz w:val="24"/>
         </w:rPr>
-        <w:t>, Wydawnictwo Akademickie „Żak”, Warszawa 1998.</w:t>
+        <w:t>, London 1965.</w:t>
       </w:r>
     </w:p>
     <w:p>
@@ -1935,22 +2138,25 @@
       <w:r>
         <w:rPr>
           <w:rFonts w:ascii="Times New Roman" w:hAnsi="Times New Roman" w:cs="Times New Roman" w:eastAsia="Times New Roman"/>
+          <w:b w:val="0"/>
           <w:i w:val="0"/>
           <w:sz w:val="24"/>
         </w:rPr>
-        <w:t xml:space="preserve">Okoń W., </w:t>
-      </w:r>
-      <w:r>
-        <w:rPr>
-          <w:rFonts w:ascii="Times New Roman" w:hAnsi="Times New Roman" w:cs="Times New Roman" w:eastAsia="Times New Roman"/>
+        <w:t xml:space="preserve">Pilch T., Bauman T., </w:t>
+      </w:r>
+      <w:r>
+        <w:rPr>
+          <w:rFonts w:ascii="Times New Roman" w:hAnsi="Times New Roman" w:cs="Times New Roman" w:eastAsia="Times New Roman"/>
+          <w:b w:val="0"/>
           <w:i/>
           <w:sz w:val="24"/>
         </w:rPr>
-        <w:t>Nowy słownik pedagogiczny</w:t>
-      </w:r>
-      <w:r>
-        <w:rPr>
-          <w:rFonts w:ascii="Times New Roman" w:hAnsi="Times New Roman" w:cs="Times New Roman" w:eastAsia="Times New Roman"/>
+        <w:t>Zasady badań pedagogicznych. Strategie ilościowe i jakościowe</w:t>
+      </w:r>
+      <w:r>
+        <w:rPr>
+          <w:rFonts w:ascii="Times New Roman" w:hAnsi="Times New Roman" w:cs="Times New Roman" w:eastAsia="Times New Roman"/>
+          <w:b w:val="0"/>
           <w:i w:val="0"/>
           <w:sz w:val="24"/>
         </w:rPr>
@@ -1966,26 +2172,29 @@
       <w:r>
         <w:rPr>
           <w:rFonts w:ascii="Times New Roman" w:hAnsi="Times New Roman" w:cs="Times New Roman" w:eastAsia="Times New Roman"/>
+          <w:b w:val="0"/>
           <w:i w:val="0"/>
           <w:sz w:val="24"/>
         </w:rPr>
-        <w:t xml:space="preserve">Ordon U., </w:t>
-      </w:r>
-      <w:r>
-        <w:rPr>
-          <w:rFonts w:ascii="Times New Roman" w:hAnsi="Times New Roman" w:cs="Times New Roman" w:eastAsia="Times New Roman"/>
+        <w:t xml:space="preserve">Pindera P., Pindera M., </w:t>
+      </w:r>
+      <w:r>
+        <w:rPr>
+          <w:rFonts w:ascii="Times New Roman" w:hAnsi="Times New Roman" w:cs="Times New Roman" w:eastAsia="Times New Roman"/>
+          <w:b w:val="0"/>
           <w:i/>
           <w:sz w:val="24"/>
         </w:rPr>
-        <w:t>Wykorzystanie metod aktywizujących przez nauczycieli przedszkoli i klas I–III – raport z badań</w:t>
-      </w:r>
-      <w:r>
-        <w:rPr>
-          <w:rFonts w:ascii="Times New Roman" w:hAnsi="Times New Roman" w:cs="Times New Roman" w:eastAsia="Times New Roman"/>
+        <w:t>Drama w procesie edukacji wczesnoszkolnej</w:t>
+      </w:r>
+      <w:r>
+        <w:rPr>
+          <w:rFonts w:ascii="Times New Roman" w:hAnsi="Times New Roman" w:cs="Times New Roman" w:eastAsia="Times New Roman"/>
+          <w:b w:val="0"/>
           <w:i w:val="0"/>
           <w:sz w:val="24"/>
         </w:rPr>
-        <w:t>, „Edukacja Elementarna w Teorii i Praktyce”, nr 3 (37), 2015, s. 129–144.</w:t>
+        <w:t>, „Nauczyciel i Szkoła”, nr 3–4, 2002, s. 161–174.</w:t>
       </w:r>
     </w:p>
     <w:p>
@@ -1997,26 +2206,47 @@
       <w:r>
         <w:rPr>
           <w:rFonts w:ascii="Times New Roman" w:hAnsi="Times New Roman" w:cs="Times New Roman" w:eastAsia="Times New Roman"/>
+          <w:b w:val="0"/>
           <w:i w:val="0"/>
           <w:sz w:val="24"/>
         </w:rPr>
-        <w:t xml:space="preserve">Pankowska K., </w:t>
-      </w:r>
-      <w:r>
-        <w:rPr>
-          <w:rFonts w:ascii="Times New Roman" w:hAnsi="Times New Roman" w:cs="Times New Roman" w:eastAsia="Times New Roman"/>
+        <w:t xml:space="preserve">Reber A. S., Reber E. S., </w:t>
+      </w:r>
+      <w:r>
+        <w:rPr>
+          <w:rFonts w:ascii="Times New Roman" w:hAnsi="Times New Roman" w:cs="Times New Roman" w:eastAsia="Times New Roman"/>
+          <w:b w:val="0"/>
           <w:i/>
           <w:sz w:val="24"/>
         </w:rPr>
-        <w:t>Drama – zabawa i myślenie</w:t>
-      </w:r>
-      <w:r>
-        <w:rPr>
-          <w:rFonts w:ascii="Times New Roman" w:hAnsi="Times New Roman" w:cs="Times New Roman" w:eastAsia="Times New Roman"/>
+        <w:t>Kompetencja</w:t>
+      </w:r>
+      <w:r>
+        <w:rPr>
+          <w:rFonts w:ascii="Times New Roman" w:hAnsi="Times New Roman" w:cs="Times New Roman" w:eastAsia="Times New Roman"/>
+          <w:b w:val="0"/>
           <w:i w:val="0"/>
           <w:sz w:val="24"/>
         </w:rPr>
-        <w:t>, Centralny Ośrodek Metodyki Upowszechniania Kultury, Warszawa 1990.</w:t>
+        <w:t xml:space="preserve">, [w:] </w:t>
+      </w:r>
+      <w:r>
+        <w:rPr>
+          <w:rFonts w:ascii="Times New Roman" w:hAnsi="Times New Roman" w:cs="Times New Roman" w:eastAsia="Times New Roman"/>
+          <w:b w:val="0"/>
+          <w:i/>
+          <w:sz w:val="24"/>
+        </w:rPr>
+        <w:t>Słownik psychologii</w:t>
+      </w:r>
+      <w:r>
+        <w:rPr>
+          <w:rFonts w:ascii="Times New Roman" w:hAnsi="Times New Roman" w:cs="Times New Roman" w:eastAsia="Times New Roman"/>
+          <w:b w:val="0"/>
+          <w:i w:val="0"/>
+          <w:sz w:val="24"/>
+        </w:rPr>
+        <w:t>, I. Kurcz, K. Skarżyńska (red.), Wydawnictwo Naukowe „Scholar”, Warszawa 2008.</w:t>
       </w:r>
     </w:p>
     <w:p>
@@ -2028,26 +2258,29 @@
       <w:r>
         <w:rPr>
           <w:rFonts w:ascii="Times New Roman" w:hAnsi="Times New Roman" w:cs="Times New Roman" w:eastAsia="Times New Roman"/>
+          <w:b w:val="0"/>
           <w:i w:val="0"/>
           <w:sz w:val="24"/>
         </w:rPr>
-        <w:t xml:space="preserve">Pankowska K., </w:t>
-      </w:r>
-      <w:r>
-        <w:rPr>
-          <w:rFonts w:ascii="Times New Roman" w:hAnsi="Times New Roman" w:cs="Times New Roman" w:eastAsia="Times New Roman"/>
+        <w:t xml:space="preserve">Skarbek W. W., </w:t>
+      </w:r>
+      <w:r>
+        <w:rPr>
+          <w:rFonts w:ascii="Times New Roman" w:hAnsi="Times New Roman" w:cs="Times New Roman" w:eastAsia="Times New Roman"/>
+          <w:b w:val="0"/>
           <w:i/>
           <w:sz w:val="24"/>
         </w:rPr>
-        <w:t>Edukacja przez dramę</w:t>
-      </w:r>
-      <w:r>
-        <w:rPr>
-          <w:rFonts w:ascii="Times New Roman" w:hAnsi="Times New Roman" w:cs="Times New Roman" w:eastAsia="Times New Roman"/>
+        <w:t>Wybrane zagadnienia metodologii nauk społecznych</w:t>
+      </w:r>
+      <w:r>
+        <w:rPr>
+          <w:rFonts w:ascii="Times New Roman" w:hAnsi="Times New Roman" w:cs="Times New Roman" w:eastAsia="Times New Roman"/>
+          <w:b w:val="0"/>
           <w:i w:val="0"/>
           <w:sz w:val="24"/>
         </w:rPr>
-        <w:t>, Wydawnictwa Szkolne i Pedagogiczne, Warszawa 1997.</w:t>
+        <w:t>, Naukowe Wydawnictwo Piotrkowskie, Piotrków Trybunalski 2013.</w:t>
       </w:r>
     </w:p>
     <w:p>
@@ -2059,26 +2292,47 @@
       <w:r>
         <w:rPr>
           <w:rFonts w:ascii="Times New Roman" w:hAnsi="Times New Roman" w:cs="Times New Roman" w:eastAsia="Times New Roman"/>
+          <w:b w:val="0"/>
           <w:i w:val="0"/>
           <w:sz w:val="24"/>
         </w:rPr>
-        <w:t xml:space="preserve">Pankowska K., </w:t>
-      </w:r>
-      <w:r>
-        <w:rPr>
-          <w:rFonts w:ascii="Times New Roman" w:hAnsi="Times New Roman" w:cs="Times New Roman" w:eastAsia="Times New Roman"/>
+        <w:t xml:space="preserve">Sobol E., </w:t>
+      </w:r>
+      <w:r>
+        <w:rPr>
+          <w:rFonts w:ascii="Times New Roman" w:hAnsi="Times New Roman" w:cs="Times New Roman" w:eastAsia="Times New Roman"/>
+          <w:b w:val="0"/>
           <w:i/>
           <w:sz w:val="24"/>
         </w:rPr>
-        <w:t>Pedagogika dramy: teoria i praktyka</w:t>
-      </w:r>
-      <w:r>
-        <w:rPr>
-          <w:rFonts w:ascii="Times New Roman" w:hAnsi="Times New Roman" w:cs="Times New Roman" w:eastAsia="Times New Roman"/>
+        <w:t>Kompetencja</w:t>
+      </w:r>
+      <w:r>
+        <w:rPr>
+          <w:rFonts w:ascii="Times New Roman" w:hAnsi="Times New Roman" w:cs="Times New Roman" w:eastAsia="Times New Roman"/>
+          <w:b w:val="0"/>
           <w:i w:val="0"/>
           <w:sz w:val="24"/>
         </w:rPr>
-        <w:t>, Wydawnictwo Akademickie „Żak”, Warszawa 2000.</w:t>
+        <w:t xml:space="preserve">, [w:] </w:t>
+      </w:r>
+      <w:r>
+        <w:rPr>
+          <w:rFonts w:ascii="Times New Roman" w:hAnsi="Times New Roman" w:cs="Times New Roman" w:eastAsia="Times New Roman"/>
+          <w:b w:val="0"/>
+          <w:i/>
+          <w:sz w:val="24"/>
+        </w:rPr>
+        <w:t>Mały słownik języka polskiego</w:t>
+      </w:r>
+      <w:r>
+        <w:rPr>
+          <w:rFonts w:ascii="Times New Roman" w:hAnsi="Times New Roman" w:cs="Times New Roman" w:eastAsia="Times New Roman"/>
+          <w:b w:val="0"/>
+          <w:i w:val="0"/>
+          <w:sz w:val="24"/>
+        </w:rPr>
+        <w:t>, Wydawnictwo Naukowe PWN, Warszawa 1996.</w:t>
       </w:r>
     </w:p>
     <w:p>
@@ -2090,26 +2344,29 @@
       <w:r>
         <w:rPr>
           <w:rFonts w:ascii="Times New Roman" w:hAnsi="Times New Roman" w:cs="Times New Roman" w:eastAsia="Times New Roman"/>
+          <w:b w:val="0"/>
           <w:i w:val="0"/>
           <w:sz w:val="24"/>
         </w:rPr>
-        <w:t xml:space="preserve">Pankowska K., </w:t>
-      </w:r>
-      <w:r>
-        <w:rPr>
-          <w:rFonts w:ascii="Times New Roman" w:hAnsi="Times New Roman" w:cs="Times New Roman" w:eastAsia="Times New Roman"/>
+        <w:t xml:space="preserve">Sztumski J., </w:t>
+      </w:r>
+      <w:r>
+        <w:rPr>
+          <w:rFonts w:ascii="Times New Roman" w:hAnsi="Times New Roman" w:cs="Times New Roman" w:eastAsia="Times New Roman"/>
+          <w:b w:val="0"/>
           <w:i/>
           <w:sz w:val="24"/>
         </w:rPr>
-        <w:t>Drama. Konteksty teoretyczne</w:t>
-      </w:r>
-      <w:r>
-        <w:rPr>
-          <w:rFonts w:ascii="Times New Roman" w:hAnsi="Times New Roman" w:cs="Times New Roman" w:eastAsia="Times New Roman"/>
+        <w:t>Wstęp do metod i technik badań społecznych</w:t>
+      </w:r>
+      <w:r>
+        <w:rPr>
+          <w:rFonts w:ascii="Times New Roman" w:hAnsi="Times New Roman" w:cs="Times New Roman" w:eastAsia="Times New Roman"/>
+          <w:b w:val="0"/>
           <w:i w:val="0"/>
           <w:sz w:val="24"/>
         </w:rPr>
-        <w:t>, Wydawnictwa Uniwersytetu Warszawskiego, Warszawa 2013.</w:t>
+        <w:t>, Wydawnictwo „Śląsk”, Katowice 2004.</w:t>
       </w:r>
     </w:p>
     <w:p>
@@ -2121,26 +2378,47 @@
       <w:r>
         <w:rPr>
           <w:rFonts w:ascii="Times New Roman" w:hAnsi="Times New Roman" w:cs="Times New Roman" w:eastAsia="Times New Roman"/>
+          <w:b w:val="0"/>
           <w:i w:val="0"/>
           <w:sz w:val="24"/>
         </w:rPr>
-        <w:t xml:space="preserve">Pemberton-Billing R. N., Clegg J. D., </w:t>
-      </w:r>
-      <w:r>
-        <w:rPr>
-          <w:rFonts w:ascii="Times New Roman" w:hAnsi="Times New Roman" w:cs="Times New Roman" w:eastAsia="Times New Roman"/>
+        <w:t xml:space="preserve">Szymik E., </w:t>
+      </w:r>
+      <w:r>
+        <w:rPr>
+          <w:rFonts w:ascii="Times New Roman" w:hAnsi="Times New Roman" w:cs="Times New Roman" w:eastAsia="Times New Roman"/>
+          <w:b w:val="0"/>
           <w:i/>
           <w:sz w:val="24"/>
         </w:rPr>
-        <w:t>Teaching Drama. An Approach to Educational Drama in the Secondary School</w:t>
-      </w:r>
-      <w:r>
-        <w:rPr>
-          <w:rFonts w:ascii="Times New Roman" w:hAnsi="Times New Roman" w:cs="Times New Roman" w:eastAsia="Times New Roman"/>
+        <w:t>Drama w edukacji wczesnoszkolnej (na przykładzie tekstów dla dzieci)</w:t>
+      </w:r>
+      <w:r>
+        <w:rPr>
+          <w:rFonts w:ascii="Times New Roman" w:hAnsi="Times New Roman" w:cs="Times New Roman" w:eastAsia="Times New Roman"/>
+          <w:b w:val="0"/>
           <w:i w:val="0"/>
           <w:sz w:val="24"/>
         </w:rPr>
-        <w:t>, London 1965.</w:t>
+        <w:t xml:space="preserve">, [w:] </w:t>
+      </w:r>
+      <w:r>
+        <w:rPr>
+          <w:rFonts w:ascii="Times New Roman" w:hAnsi="Times New Roman" w:cs="Times New Roman" w:eastAsia="Times New Roman"/>
+          <w:b w:val="0"/>
+          <w:i/>
+          <w:sz w:val="24"/>
+        </w:rPr>
+        <w:t>Dziecko – język – tekst</w:t>
+      </w:r>
+      <w:r>
+        <w:rPr>
+          <w:rFonts w:ascii="Times New Roman" w:hAnsi="Times New Roman" w:cs="Times New Roman" w:eastAsia="Times New Roman"/>
+          <w:b w:val="0"/>
+          <w:i w:val="0"/>
+          <w:sz w:val="24"/>
+        </w:rPr>
+        <w:t>, B. Niesporek-Szamburska, M. Wójcik-Dudek (red.), Wydawnictwo Uniwersytetu Śląskiego, Katowice 2010, s. 380–390.</w:t>
       </w:r>
     </w:p>
     <w:p>
@@ -2152,26 +2430,29 @@
       <w:r>
         <w:rPr>
           <w:rFonts w:ascii="Times New Roman" w:hAnsi="Times New Roman" w:cs="Times New Roman" w:eastAsia="Times New Roman"/>
+          <w:b w:val="0"/>
           <w:i w:val="0"/>
           <w:sz w:val="24"/>
         </w:rPr>
-        <w:t xml:space="preserve">Pilch T., Bauman T., </w:t>
-      </w:r>
-      <w:r>
-        <w:rPr>
-          <w:rFonts w:ascii="Times New Roman" w:hAnsi="Times New Roman" w:cs="Times New Roman" w:eastAsia="Times New Roman"/>
+        <w:t xml:space="preserve">Szymik E., </w:t>
+      </w:r>
+      <w:r>
+        <w:rPr>
+          <w:rFonts w:ascii="Times New Roman" w:hAnsi="Times New Roman" w:cs="Times New Roman" w:eastAsia="Times New Roman"/>
+          <w:b w:val="0"/>
           <w:i/>
           <w:sz w:val="24"/>
         </w:rPr>
-        <w:t>Zasady badań pedagogicznych. Strategie ilościowe i jakościowe</w:t>
-      </w:r>
-      <w:r>
-        <w:rPr>
-          <w:rFonts w:ascii="Times New Roman" w:hAnsi="Times New Roman" w:cs="Times New Roman" w:eastAsia="Times New Roman"/>
+        <w:t>Znaczenie dramy w procesie wychowania</w:t>
+      </w:r>
+      <w:r>
+        <w:rPr>
+          <w:rFonts w:ascii="Times New Roman" w:hAnsi="Times New Roman" w:cs="Times New Roman" w:eastAsia="Times New Roman"/>
+          <w:b w:val="0"/>
           <w:i w:val="0"/>
           <w:sz w:val="24"/>
         </w:rPr>
-        <w:t>, Wydawnictwo Akademickie „Żak”, Warszawa 2001.</w:t>
+        <w:t>, „Studia i Prace Pedagogiczne”, nr 1, 2014, s. 133–142.</w:t>
       </w:r>
     </w:p>
     <w:p>
@@ -2183,26 +2464,29 @@
       <w:r>
         <w:rPr>
           <w:rFonts w:ascii="Times New Roman" w:hAnsi="Times New Roman" w:cs="Times New Roman" w:eastAsia="Times New Roman"/>
+          <w:b w:val="0"/>
           <w:i w:val="0"/>
           <w:sz w:val="24"/>
         </w:rPr>
-        <w:t xml:space="preserve">Pindera P., Pindera M., </w:t>
-      </w:r>
-      <w:r>
-        <w:rPr>
-          <w:rFonts w:ascii="Times New Roman" w:hAnsi="Times New Roman" w:cs="Times New Roman" w:eastAsia="Times New Roman"/>
+        <w:t xml:space="preserve">Szymik E., </w:t>
+      </w:r>
+      <w:r>
+        <w:rPr>
+          <w:rFonts w:ascii="Times New Roman" w:hAnsi="Times New Roman" w:cs="Times New Roman" w:eastAsia="Times New Roman"/>
+          <w:b w:val="0"/>
           <w:i/>
           <w:sz w:val="24"/>
         </w:rPr>
-        <w:t>Drama w procesie edukacji wczesnoszkolnej</w:t>
-      </w:r>
-      <w:r>
-        <w:rPr>
-          <w:rFonts w:ascii="Times New Roman" w:hAnsi="Times New Roman" w:cs="Times New Roman" w:eastAsia="Times New Roman"/>
+        <w:t>Drama jako remedium na problemy wychowawcze</w:t>
+      </w:r>
+      <w:r>
+        <w:rPr>
+          <w:rFonts w:ascii="Times New Roman" w:hAnsi="Times New Roman" w:cs="Times New Roman" w:eastAsia="Times New Roman"/>
+          <w:b w:val="0"/>
           <w:i w:val="0"/>
           <w:sz w:val="24"/>
         </w:rPr>
-        <w:t>, „Nauczyciel i Szkoła”, nr 3–4, 2002, s. 161–174.</w:t>
+        <w:t>, „Nauczyciel i Szkoła”, nr 3, 2017, s. 105–113.</w:t>
       </w:r>
     </w:p>
     <w:p>
@@ -2214,42 +2498,29 @@
       <w:r>
         <w:rPr>
           <w:rFonts w:ascii="Times New Roman" w:hAnsi="Times New Roman" w:cs="Times New Roman" w:eastAsia="Times New Roman"/>
+          <w:b w:val="0"/>
           <w:i w:val="0"/>
           <w:sz w:val="24"/>
         </w:rPr>
-        <w:t xml:space="preserve">Reber A. S., Reber E. S., </w:t>
-      </w:r>
-      <w:r>
-        <w:rPr>
-          <w:rFonts w:ascii="Times New Roman" w:hAnsi="Times New Roman" w:cs="Times New Roman" w:eastAsia="Times New Roman"/>
+        <w:t xml:space="preserve">Szymik E., </w:t>
+      </w:r>
+      <w:r>
+        <w:rPr>
+          <w:rFonts w:ascii="Times New Roman" w:hAnsi="Times New Roman" w:cs="Times New Roman" w:eastAsia="Times New Roman"/>
+          <w:b w:val="0"/>
           <w:i/>
           <w:sz w:val="24"/>
         </w:rPr>
-        <w:t>Kompetencja</w:t>
-      </w:r>
-      <w:r>
-        <w:rPr>
-          <w:rFonts w:ascii="Times New Roman" w:hAnsi="Times New Roman" w:cs="Times New Roman" w:eastAsia="Times New Roman"/>
+        <w:t>Dramowa interpretacja baśni w kontekście kształtowania relacji interpersonalnych dzieci w wieku wczesnoszkolnym</w:t>
+      </w:r>
+      <w:r>
+        <w:rPr>
+          <w:rFonts w:ascii="Times New Roman" w:hAnsi="Times New Roman" w:cs="Times New Roman" w:eastAsia="Times New Roman"/>
+          <w:b w:val="0"/>
           <w:i w:val="0"/>
           <w:sz w:val="24"/>
         </w:rPr>
-        <w:t xml:space="preserve">, [w:] </w:t>
-      </w:r>
-      <w:r>
-        <w:rPr>
-          <w:rFonts w:ascii="Times New Roman" w:hAnsi="Times New Roman" w:cs="Times New Roman" w:eastAsia="Times New Roman"/>
-          <w:i/>
-          <w:sz w:val="24"/>
-        </w:rPr>
-        <w:t>Słownik psychologii</w:t>
-      </w:r>
-      <w:r>
-        <w:rPr>
-          <w:rFonts w:ascii="Times New Roman" w:hAnsi="Times New Roman" w:cs="Times New Roman" w:eastAsia="Times New Roman"/>
-          <w:i w:val="0"/>
-          <w:sz w:val="24"/>
-        </w:rPr>
-        <w:t>, I. Kurcz, K. Skarżyńska (red.), Wydawnictwo Naukowe „Scholar”, Warszawa 2008.</w:t>
+        <w:t>, Radom 2021.</w:t>
       </w:r>
     </w:p>
     <w:p>
@@ -2261,10 +2532,29 @@
       <w:r>
         <w:rPr>
           <w:rFonts w:ascii="Times New Roman" w:hAnsi="Times New Roman" w:cs="Times New Roman" w:eastAsia="Times New Roman"/>
+          <w:b w:val="0"/>
           <w:i w:val="0"/>
           <w:sz w:val="24"/>
         </w:rPr>
-        <w:t>Rozporządzenie Ministra Edukacji Narodowej z dnia 14 lutego 2017 r. w sprawie podstawy programowej wychowania przedszkolnego oraz podstawy programowej kształcenia ogólnego dla szkoły podstawowej (Dz.U. 2017 poz. 356).</w:t>
+        <w:t xml:space="preserve">Świeca M., </w:t>
+      </w:r>
+      <w:r>
+        <w:rPr>
+          <w:rFonts w:ascii="Times New Roman" w:hAnsi="Times New Roman" w:cs="Times New Roman" w:eastAsia="Times New Roman"/>
+          <w:b w:val="0"/>
+          <w:i/>
+          <w:sz w:val="24"/>
+        </w:rPr>
+        <w:t>Znaczenie wychowawcze ekspresyjnych form edukacji teatralnej</w:t>
+      </w:r>
+      <w:r>
+        <w:rPr>
+          <w:rFonts w:ascii="Times New Roman" w:hAnsi="Times New Roman" w:cs="Times New Roman" w:eastAsia="Times New Roman"/>
+          <w:b w:val="0"/>
+          <w:i w:val="0"/>
+          <w:sz w:val="24"/>
+        </w:rPr>
+        <w:t>, maszynopis pracy doktorskiej, Uniwersytet Warszawski, Warszawa 1993.</w:t>
       </w:r>
     </w:p>
     <w:p>
@@ -2276,10 +2566,29 @@
       <w:r>
         <w:rPr>
           <w:rFonts w:ascii="Times New Roman" w:hAnsi="Times New Roman" w:cs="Times New Roman" w:eastAsia="Times New Roman"/>
+          <w:b w:val="0"/>
           <w:i w:val="0"/>
           <w:sz w:val="24"/>
         </w:rPr>
-        <w:t>Rozporządzenie Ministra Edukacji z dnia 11 marca 2026 r. w sprawie podstawy programowej wychowania przedszkolnego oraz podstawy programowej kształcenia ogólnego dla szkoły podstawowej, w tym dla uczniów z niepełnosprawnością intelektualną w stopniu umiarkowanym lub znacznym (Dz.U. 2026 poz. 378).</w:t>
+        <w:t xml:space="preserve">Świeca M., </w:t>
+      </w:r>
+      <w:r>
+        <w:rPr>
+          <w:rFonts w:ascii="Times New Roman" w:hAnsi="Times New Roman" w:cs="Times New Roman" w:eastAsia="Times New Roman"/>
+          <w:b w:val="0"/>
+          <w:i/>
+          <w:sz w:val="24"/>
+        </w:rPr>
+        <w:t>Drama w praktyce edukacyjnej</w:t>
+      </w:r>
+      <w:r>
+        <w:rPr>
+          <w:rFonts w:ascii="Times New Roman" w:hAnsi="Times New Roman" w:cs="Times New Roman" w:eastAsia="Times New Roman"/>
+          <w:b w:val="0"/>
+          <w:i w:val="0"/>
+          <w:sz w:val="24"/>
+        </w:rPr>
+        <w:t>, Stowarzyszenie „Nauka Edukacja Rozwój”, Ostrowiec Świętokrzyski 2012.</w:t>
       </w:r>
     </w:p>
     <w:p>
@@ -2291,26 +2600,29 @@
       <w:r>
         <w:rPr>
           <w:rFonts w:ascii="Times New Roman" w:hAnsi="Times New Roman" w:cs="Times New Roman" w:eastAsia="Times New Roman"/>
+          <w:b w:val="0"/>
           <w:i w:val="0"/>
           <w:sz w:val="24"/>
         </w:rPr>
-        <w:t xml:space="preserve">Skarbek W. W., </w:t>
-      </w:r>
-      <w:r>
-        <w:rPr>
-          <w:rFonts w:ascii="Times New Roman" w:hAnsi="Times New Roman" w:cs="Times New Roman" w:eastAsia="Times New Roman"/>
+        <w:t xml:space="preserve">Tarasiewicz P., </w:t>
+      </w:r>
+      <w:r>
+        <w:rPr>
+          <w:rFonts w:ascii="Times New Roman" w:hAnsi="Times New Roman" w:cs="Times New Roman" w:eastAsia="Times New Roman"/>
+          <w:b w:val="0"/>
           <w:i/>
           <w:sz w:val="24"/>
         </w:rPr>
-        <w:t>Wybrane zagadnienia metodologii nauk społecznych</w:t>
-      </w:r>
-      <w:r>
-        <w:rPr>
-          <w:rFonts w:ascii="Times New Roman" w:hAnsi="Times New Roman" w:cs="Times New Roman" w:eastAsia="Times New Roman"/>
+        <w:t>„Kultura” i „cywilizacja” – próba korelacji</w:t>
+      </w:r>
+      <w:r>
+        <w:rPr>
+          <w:rFonts w:ascii="Times New Roman" w:hAnsi="Times New Roman" w:cs="Times New Roman" w:eastAsia="Times New Roman"/>
+          <w:b w:val="0"/>
           <w:i w:val="0"/>
           <w:sz w:val="24"/>
         </w:rPr>
-        <w:t>, Naukowe Wydawnictwo Piotrkowskie, Piotrków Trybunalski 2013.</w:t>
+        <w:t>, „Roczniki Kulturoznawcze”, t. 2, 2011, s. 71–88.</w:t>
       </w:r>
     </w:p>
     <w:p>
@@ -2322,42 +2634,29 @@
       <w:r>
         <w:rPr>
           <w:rFonts w:ascii="Times New Roman" w:hAnsi="Times New Roman" w:cs="Times New Roman" w:eastAsia="Times New Roman"/>
+          <w:b w:val="0"/>
           <w:i w:val="0"/>
           <w:sz w:val="24"/>
         </w:rPr>
-        <w:t xml:space="preserve">Sobol E., </w:t>
-      </w:r>
-      <w:r>
-        <w:rPr>
-          <w:rFonts w:ascii="Times New Roman" w:hAnsi="Times New Roman" w:cs="Times New Roman" w:eastAsia="Times New Roman"/>
+        <w:t xml:space="preserve">Way B., </w:t>
+      </w:r>
+      <w:r>
+        <w:rPr>
+          <w:rFonts w:ascii="Times New Roman" w:hAnsi="Times New Roman" w:cs="Times New Roman" w:eastAsia="Times New Roman"/>
+          <w:b w:val="0"/>
           <w:i/>
           <w:sz w:val="24"/>
         </w:rPr>
-        <w:t>Kompetencja</w:t>
-      </w:r>
-      <w:r>
-        <w:rPr>
-          <w:rFonts w:ascii="Times New Roman" w:hAnsi="Times New Roman" w:cs="Times New Roman" w:eastAsia="Times New Roman"/>
+        <w:t>Drama w wychowaniu dzieci i młodzieży</w:t>
+      </w:r>
+      <w:r>
+        <w:rPr>
+          <w:rFonts w:ascii="Times New Roman" w:hAnsi="Times New Roman" w:cs="Times New Roman" w:eastAsia="Times New Roman"/>
+          <w:b w:val="0"/>
           <w:i w:val="0"/>
           <w:sz w:val="24"/>
         </w:rPr>
-        <w:t xml:space="preserve">, [w:] </w:t>
-      </w:r>
-      <w:r>
-        <w:rPr>
-          <w:rFonts w:ascii="Times New Roman" w:hAnsi="Times New Roman" w:cs="Times New Roman" w:eastAsia="Times New Roman"/>
-          <w:i/>
-          <w:sz w:val="24"/>
-        </w:rPr>
-        <w:t>Mały słownik języka polskiego</w:t>
-      </w:r>
-      <w:r>
-        <w:rPr>
-          <w:rFonts w:ascii="Times New Roman" w:hAnsi="Times New Roman" w:cs="Times New Roman" w:eastAsia="Times New Roman"/>
-          <w:i w:val="0"/>
-          <w:sz w:val="24"/>
-        </w:rPr>
-        <w:t>, Wydawnictwo Naukowe PWN, Warszawa 1996.</w:t>
+        <w:t>, tłum. K. Pankowska, E. Nerwińska, Wydawnictwa Szkolne i Pedagogiczne, Warszawa 1995.</w:t>
       </w:r>
     </w:p>
     <w:p>
@@ -2369,26 +2668,47 @@
       <w:r>
         <w:rPr>
           <w:rFonts w:ascii="Times New Roman" w:hAnsi="Times New Roman" w:cs="Times New Roman" w:eastAsia="Times New Roman"/>
+          <w:b w:val="0"/>
           <w:i w:val="0"/>
           <w:sz w:val="24"/>
         </w:rPr>
-        <w:t xml:space="preserve">Sztumski J., </w:t>
-      </w:r>
-      <w:r>
-        <w:rPr>
-          <w:rFonts w:ascii="Times New Roman" w:hAnsi="Times New Roman" w:cs="Times New Roman" w:eastAsia="Times New Roman"/>
+        <w:t xml:space="preserve">Winiarek-Kołucka M., </w:t>
+      </w:r>
+      <w:r>
+        <w:rPr>
+          <w:rFonts w:ascii="Times New Roman" w:hAnsi="Times New Roman" w:cs="Times New Roman" w:eastAsia="Times New Roman"/>
+          <w:b w:val="0"/>
           <w:i/>
           <w:sz w:val="24"/>
         </w:rPr>
-        <w:t>Wstęp do metod i technik badań społecznych</w:t>
-      </w:r>
-      <w:r>
-        <w:rPr>
-          <w:rFonts w:ascii="Times New Roman" w:hAnsi="Times New Roman" w:cs="Times New Roman" w:eastAsia="Times New Roman"/>
+        <w:t>Drama wzmacnia</w:t>
+      </w:r>
+      <w:r>
+        <w:rPr>
+          <w:rFonts w:ascii="Times New Roman" w:hAnsi="Times New Roman" w:cs="Times New Roman" w:eastAsia="Times New Roman"/>
+          <w:b w:val="0"/>
           <w:i w:val="0"/>
           <w:sz w:val="24"/>
         </w:rPr>
-        <w:t>, Wydawnictwo „Śląsk”, Katowice 2004.</w:t>
+        <w:t xml:space="preserve">, [w:] </w:t>
+      </w:r>
+      <w:r>
+        <w:rPr>
+          <w:rFonts w:ascii="Times New Roman" w:hAnsi="Times New Roman" w:cs="Times New Roman" w:eastAsia="Times New Roman"/>
+          <w:b w:val="0"/>
+          <w:i/>
+          <w:sz w:val="24"/>
+        </w:rPr>
+        <w:t>Drama wzmacnia. Metoda dramy w edukacji antydyskryminacyjnej i obywatelskiej</w:t>
+      </w:r>
+      <w:r>
+        <w:rPr>
+          <w:rFonts w:ascii="Times New Roman" w:hAnsi="Times New Roman" w:cs="Times New Roman" w:eastAsia="Times New Roman"/>
+          <w:b w:val="0"/>
+          <w:i w:val="0"/>
+          <w:sz w:val="24"/>
+        </w:rPr>
+        <w:t>, M. Winiarek-Kołucka (red.), Stowarzyszenie Praktyków Dramy Stop-Klatka, Warszawa 2016.</w:t>
       </w:r>
     </w:p>
     <w:p>
@@ -2400,42 +2720,29 @@
       <w:r>
         <w:rPr>
           <w:rFonts w:ascii="Times New Roman" w:hAnsi="Times New Roman" w:cs="Times New Roman" w:eastAsia="Times New Roman"/>
+          <w:b w:val="0"/>
           <w:i w:val="0"/>
           <w:sz w:val="24"/>
         </w:rPr>
-        <w:t xml:space="preserve">Szymik E., </w:t>
-      </w:r>
-      <w:r>
-        <w:rPr>
-          <w:rFonts w:ascii="Times New Roman" w:hAnsi="Times New Roman" w:cs="Times New Roman" w:eastAsia="Times New Roman"/>
+        <w:t xml:space="preserve">Witerska K., </w:t>
+      </w:r>
+      <w:r>
+        <w:rPr>
+          <w:rFonts w:ascii="Times New Roman" w:hAnsi="Times New Roman" w:cs="Times New Roman" w:eastAsia="Times New Roman"/>
+          <w:b w:val="0"/>
           <w:i/>
           <w:sz w:val="24"/>
         </w:rPr>
-        <w:t>Drama w edukacji wczesnoszkolnej (na przykładzie tekstów dla dzieci)</w:t>
-      </w:r>
-      <w:r>
-        <w:rPr>
-          <w:rFonts w:ascii="Times New Roman" w:hAnsi="Times New Roman" w:cs="Times New Roman" w:eastAsia="Times New Roman"/>
+        <w:t>Proces poszukiwania, formułowania i rozwiązywania problemów w dramie</w:t>
+      </w:r>
+      <w:r>
+        <w:rPr>
+          <w:rFonts w:ascii="Times New Roman" w:hAnsi="Times New Roman" w:cs="Times New Roman" w:eastAsia="Times New Roman"/>
+          <w:b w:val="0"/>
           <w:i w:val="0"/>
           <w:sz w:val="24"/>
         </w:rPr>
-        <w:t xml:space="preserve">, [w:] </w:t>
-      </w:r>
-      <w:r>
-        <w:rPr>
-          <w:rFonts w:ascii="Times New Roman" w:hAnsi="Times New Roman" w:cs="Times New Roman" w:eastAsia="Times New Roman"/>
-          <w:i/>
-          <w:sz w:val="24"/>
-        </w:rPr>
-        <w:t>Dziecko – język – tekst</w:t>
-      </w:r>
-      <w:r>
-        <w:rPr>
-          <w:rFonts w:ascii="Times New Roman" w:hAnsi="Times New Roman" w:cs="Times New Roman" w:eastAsia="Times New Roman"/>
-          <w:i w:val="0"/>
-          <w:sz w:val="24"/>
-        </w:rPr>
-        <w:t>, B. Niesporek-Szamburska, M. Wójcik-Dudek (red.), Wydawnictwo Uniwersytetu Śląskiego, Katowice 2010, s. 380–390.</w:t>
+        <w:t>, „Polski w Praktyce”, nr 5, 2009, s. 4–6.</w:t>
       </w:r>
     </w:p>
     <w:p>
@@ -2447,26 +2754,29 @@
       <w:r>
         <w:rPr>
           <w:rFonts w:ascii="Times New Roman" w:hAnsi="Times New Roman" w:cs="Times New Roman" w:eastAsia="Times New Roman"/>
+          <w:b w:val="0"/>
           <w:i w:val="0"/>
           <w:sz w:val="24"/>
         </w:rPr>
-        <w:t xml:space="preserve">Szymik E., </w:t>
-      </w:r>
-      <w:r>
-        <w:rPr>
-          <w:rFonts w:ascii="Times New Roman" w:hAnsi="Times New Roman" w:cs="Times New Roman" w:eastAsia="Times New Roman"/>
+        <w:t xml:space="preserve">Witerska K., </w:t>
+      </w:r>
+      <w:r>
+        <w:rPr>
+          <w:rFonts w:ascii="Times New Roman" w:hAnsi="Times New Roman" w:cs="Times New Roman" w:eastAsia="Times New Roman"/>
+          <w:b w:val="0"/>
           <w:i/>
           <w:sz w:val="24"/>
         </w:rPr>
-        <w:t>Znaczenie dramy w procesie wychowania</w:t>
-      </w:r>
-      <w:r>
-        <w:rPr>
-          <w:rFonts w:ascii="Times New Roman" w:hAnsi="Times New Roman" w:cs="Times New Roman" w:eastAsia="Times New Roman"/>
+        <w:t>Drama kreatywna – perspektywa rozwojowa</w:t>
+      </w:r>
+      <w:r>
+        <w:rPr>
+          <w:rFonts w:ascii="Times New Roman" w:hAnsi="Times New Roman" w:cs="Times New Roman" w:eastAsia="Times New Roman"/>
+          <w:b w:val="0"/>
           <w:i w:val="0"/>
           <w:sz w:val="24"/>
         </w:rPr>
-        <w:t>, „Studia i Prace Pedagogiczne”, nr 1, 2014, s. 133–142.</w:t>
+        <w:t>, „Chowanna”, t. 1 (36), 2011, s. 71–82.</w:t>
       </w:r>
     </w:p>
     <w:p>
@@ -2478,26 +2788,29 @@
       <w:r>
         <w:rPr>
           <w:rFonts w:ascii="Times New Roman" w:hAnsi="Times New Roman" w:cs="Times New Roman" w:eastAsia="Times New Roman"/>
+          <w:b w:val="0"/>
           <w:i w:val="0"/>
           <w:sz w:val="24"/>
         </w:rPr>
-        <w:t xml:space="preserve">Szymik E., </w:t>
-      </w:r>
-      <w:r>
-        <w:rPr>
-          <w:rFonts w:ascii="Times New Roman" w:hAnsi="Times New Roman" w:cs="Times New Roman" w:eastAsia="Times New Roman"/>
+        <w:t xml:space="preserve">Witerska K., </w:t>
+      </w:r>
+      <w:r>
+        <w:rPr>
+          <w:rFonts w:ascii="Times New Roman" w:hAnsi="Times New Roman" w:cs="Times New Roman" w:eastAsia="Times New Roman"/>
+          <w:b w:val="0"/>
           <w:i/>
           <w:sz w:val="24"/>
         </w:rPr>
-        <w:t>Drama jako remedium na problemy wychowawcze</w:t>
-      </w:r>
-      <w:r>
-        <w:rPr>
-          <w:rFonts w:ascii="Times New Roman" w:hAnsi="Times New Roman" w:cs="Times New Roman" w:eastAsia="Times New Roman"/>
+        <w:t>Drama. Techniki, strategie, scenariusze</w:t>
+      </w:r>
+      <w:r>
+        <w:rPr>
+          <w:rFonts w:ascii="Times New Roman" w:hAnsi="Times New Roman" w:cs="Times New Roman" w:eastAsia="Times New Roman"/>
+          <w:b w:val="0"/>
           <w:i w:val="0"/>
           <w:sz w:val="24"/>
         </w:rPr>
-        <w:t>, „Nauczyciel i Szkoła”, nr 3, 2017, s. 105–113.</w:t>
+        <w:t>, Difin, Warszawa 2011.</w:t>
       </w:r>
     </w:p>
     <w:p>
@@ -2509,26 +2822,29 @@
       <w:r>
         <w:rPr>
           <w:rFonts w:ascii="Times New Roman" w:hAnsi="Times New Roman" w:cs="Times New Roman" w:eastAsia="Times New Roman"/>
+          <w:b w:val="0"/>
           <w:i w:val="0"/>
           <w:sz w:val="24"/>
         </w:rPr>
-        <w:t xml:space="preserve">Szymik E., </w:t>
-      </w:r>
-      <w:r>
-        <w:rPr>
-          <w:rFonts w:ascii="Times New Roman" w:hAnsi="Times New Roman" w:cs="Times New Roman" w:eastAsia="Times New Roman"/>
+        <w:t xml:space="preserve">Witerska K., </w:t>
+      </w:r>
+      <w:r>
+        <w:rPr>
+          <w:rFonts w:ascii="Times New Roman" w:hAnsi="Times New Roman" w:cs="Times New Roman" w:eastAsia="Times New Roman"/>
+          <w:b w:val="0"/>
           <w:i/>
           <w:sz w:val="24"/>
         </w:rPr>
-        <w:t>Dramowa interpretacja baśni w kontekście kształtowania relacji interpersonalnych dzieci w wieku wczesnoszkolnym</w:t>
-      </w:r>
-      <w:r>
-        <w:rPr>
-          <w:rFonts w:ascii="Times New Roman" w:hAnsi="Times New Roman" w:cs="Times New Roman" w:eastAsia="Times New Roman"/>
+        <w:t>Drama. Przewodnik po koncepcjach, technikach i miejscach</w:t>
+      </w:r>
+      <w:r>
+        <w:rPr>
+          <w:rFonts w:ascii="Times New Roman" w:hAnsi="Times New Roman" w:cs="Times New Roman" w:eastAsia="Times New Roman"/>
+          <w:b w:val="0"/>
           <w:i w:val="0"/>
           <w:sz w:val="24"/>
         </w:rPr>
-        <w:t>, Radom 2021.</w:t>
+        <w:t>, Difin, Warszawa 2014.</w:t>
       </w:r>
     </w:p>
     <w:p>
@@ -2540,26 +2856,29 @@
       <w:r>
         <w:rPr>
           <w:rFonts w:ascii="Times New Roman" w:hAnsi="Times New Roman" w:cs="Times New Roman" w:eastAsia="Times New Roman"/>
+          <w:b w:val="0"/>
           <w:i w:val="0"/>
           <w:sz w:val="24"/>
         </w:rPr>
-        <w:t xml:space="preserve">Świeca M., </w:t>
-      </w:r>
-      <w:r>
-        <w:rPr>
-          <w:rFonts w:ascii="Times New Roman" w:hAnsi="Times New Roman" w:cs="Times New Roman" w:eastAsia="Times New Roman"/>
+        <w:t xml:space="preserve">Witerska K., </w:t>
+      </w:r>
+      <w:r>
+        <w:rPr>
+          <w:rFonts w:ascii="Times New Roman" w:hAnsi="Times New Roman" w:cs="Times New Roman" w:eastAsia="Times New Roman"/>
+          <w:b w:val="0"/>
           <w:i/>
           <w:sz w:val="24"/>
         </w:rPr>
-        <w:t>Znaczenie wychowawcze ekspresyjnych form edukacji teatralnej</w:t>
-      </w:r>
-      <w:r>
-        <w:rPr>
-          <w:rFonts w:ascii="Times New Roman" w:hAnsi="Times New Roman" w:cs="Times New Roman" w:eastAsia="Times New Roman"/>
+        <w:t>Drama procesualna w pracy z dziećmi w przedszkolu i klasach I–III</w:t>
+      </w:r>
+      <w:r>
+        <w:rPr>
+          <w:rFonts w:ascii="Times New Roman" w:hAnsi="Times New Roman" w:cs="Times New Roman" w:eastAsia="Times New Roman"/>
+          <w:b w:val="0"/>
           <w:i w:val="0"/>
           <w:sz w:val="24"/>
         </w:rPr>
-        <w:t>, maszynopis pracy doktorskiej, Uniwersytet Warszawski, Warszawa 1993.</w:t>
+        <w:t>, Difin, Warszawa 2021.</w:t>
       </w:r>
     </w:p>
     <w:p>
@@ -2571,26 +2890,29 @@
       <w:r>
         <w:rPr>
           <w:rFonts w:ascii="Times New Roman" w:hAnsi="Times New Roman" w:cs="Times New Roman" w:eastAsia="Times New Roman"/>
+          <w:b w:val="0"/>
           <w:i w:val="0"/>
           <w:sz w:val="24"/>
         </w:rPr>
-        <w:t xml:space="preserve">Świeca M., </w:t>
-      </w:r>
-      <w:r>
-        <w:rPr>
-          <w:rFonts w:ascii="Times New Roman" w:hAnsi="Times New Roman" w:cs="Times New Roman" w:eastAsia="Times New Roman"/>
+        <w:t xml:space="preserve">Witerska K., </w:t>
+      </w:r>
+      <w:r>
+        <w:rPr>
+          <w:rFonts w:ascii="Times New Roman" w:hAnsi="Times New Roman" w:cs="Times New Roman" w:eastAsia="Times New Roman"/>
+          <w:b w:val="0"/>
           <w:i/>
           <w:sz w:val="24"/>
         </w:rPr>
-        <w:t>Drama w praktyce edukacyjnej</w:t>
-      </w:r>
-      <w:r>
-        <w:rPr>
-          <w:rFonts w:ascii="Times New Roman" w:hAnsi="Times New Roman" w:cs="Times New Roman" w:eastAsia="Times New Roman"/>
+        <w:t>Play it Out Loud. The Use of Drama When Working with Shy Children</w:t>
+      </w:r>
+      <w:r>
+        <w:rPr>
+          <w:rFonts w:ascii="Times New Roman" w:hAnsi="Times New Roman" w:cs="Times New Roman" w:eastAsia="Times New Roman"/>
+          <w:b w:val="0"/>
           <w:i w:val="0"/>
           <w:sz w:val="24"/>
         </w:rPr>
-        <w:t>, Stowarzyszenie „Nauka Edukacja Rozwój”, Ostrowiec Świętokrzyski 2012.</w:t>
+        <w:t>, „Kultura i Wychowanie”, nr 2 (20), 2021, s. 87–104.</w:t>
       </w:r>
     </w:p>
     <w:p>
@@ -2602,26 +2924,29 @@
       <w:r>
         <w:rPr>
           <w:rFonts w:ascii="Times New Roman" w:hAnsi="Times New Roman" w:cs="Times New Roman" w:eastAsia="Times New Roman"/>
+          <w:b w:val="0"/>
           <w:i w:val="0"/>
           <w:sz w:val="24"/>
         </w:rPr>
-        <w:t xml:space="preserve">Tarasiewicz P., </w:t>
-      </w:r>
-      <w:r>
-        <w:rPr>
-          <w:rFonts w:ascii="Times New Roman" w:hAnsi="Times New Roman" w:cs="Times New Roman" w:eastAsia="Times New Roman"/>
+        <w:t xml:space="preserve">Wróblewska H. M., </w:t>
+      </w:r>
+      <w:r>
+        <w:rPr>
+          <w:rFonts w:ascii="Times New Roman" w:hAnsi="Times New Roman" w:cs="Times New Roman" w:eastAsia="Times New Roman"/>
+          <w:b w:val="0"/>
           <w:i/>
           <w:sz w:val="24"/>
         </w:rPr>
-        <w:t>„Kultura” i „cywilizacja” – próba korelacji</w:t>
-      </w:r>
-      <w:r>
-        <w:rPr>
-          <w:rFonts w:ascii="Times New Roman" w:hAnsi="Times New Roman" w:cs="Times New Roman" w:eastAsia="Times New Roman"/>
+        <w:t>Kompetencje społeczne przestrzenią i doświadczaniem dialogu</w:t>
+      </w:r>
+      <w:r>
+        <w:rPr>
+          <w:rFonts w:ascii="Times New Roman" w:hAnsi="Times New Roman" w:cs="Times New Roman" w:eastAsia="Times New Roman"/>
+          <w:b w:val="0"/>
           <w:i w:val="0"/>
           <w:sz w:val="24"/>
         </w:rPr>
-        <w:t>, „Roczniki Kulturoznawcze”, t. 2, 2011, s. 71–88.</w:t>
+        <w:t>, „Studia z Teorii Wychowania”, t. IX, nr 2 (23), 2018, s. 41–60.</w:t>
       </w:r>
     </w:p>
     <w:p>
@@ -2633,26 +2958,29 @@
       <w:r>
         <w:rPr>
           <w:rFonts w:ascii="Times New Roman" w:hAnsi="Times New Roman" w:cs="Times New Roman" w:eastAsia="Times New Roman"/>
+          <w:b w:val="0"/>
           <w:i w:val="0"/>
           <w:sz w:val="24"/>
         </w:rPr>
-        <w:t xml:space="preserve">Way B., </w:t>
-      </w:r>
-      <w:r>
-        <w:rPr>
-          <w:rFonts w:ascii="Times New Roman" w:hAnsi="Times New Roman" w:cs="Times New Roman" w:eastAsia="Times New Roman"/>
+        <w:t xml:space="preserve">Zaczyński W., </w:t>
+      </w:r>
+      <w:r>
+        <w:rPr>
+          <w:rFonts w:ascii="Times New Roman" w:hAnsi="Times New Roman" w:cs="Times New Roman" w:eastAsia="Times New Roman"/>
+          <w:b w:val="0"/>
           <w:i/>
           <w:sz w:val="24"/>
         </w:rPr>
-        <w:t>Drama w wychowaniu dzieci i młodzieży</w:t>
-      </w:r>
-      <w:r>
-        <w:rPr>
-          <w:rFonts w:ascii="Times New Roman" w:hAnsi="Times New Roman" w:cs="Times New Roman" w:eastAsia="Times New Roman"/>
+        <w:t>Praca badawcza nauczyciela</w:t>
+      </w:r>
+      <w:r>
+        <w:rPr>
+          <w:rFonts w:ascii="Times New Roman" w:hAnsi="Times New Roman" w:cs="Times New Roman" w:eastAsia="Times New Roman"/>
+          <w:b w:val="0"/>
           <w:i w:val="0"/>
           <w:sz w:val="24"/>
         </w:rPr>
-        <w:t>, tłum. K. Pankowska, E. Nerwińska, Wydawnictwa Szkolne i Pedagogiczne, Warszawa 1995.</w:t>
+        <w:t>, Wydawnictwa Szkolne i Pedagogiczne, Warszawa 1995.</w:t>
       </w:r>
     </w:p>
     <w:p>
@@ -2664,42 +2992,29 @@
       <w:r>
         <w:rPr>
           <w:rFonts w:ascii="Times New Roman" w:hAnsi="Times New Roman" w:cs="Times New Roman" w:eastAsia="Times New Roman"/>
+          <w:b w:val="0"/>
           <w:i w:val="0"/>
           <w:sz w:val="24"/>
         </w:rPr>
-        <w:t xml:space="preserve">Winiarek-Kołucka M., </w:t>
-      </w:r>
-      <w:r>
-        <w:rPr>
-          <w:rFonts w:ascii="Times New Roman" w:hAnsi="Times New Roman" w:cs="Times New Roman" w:eastAsia="Times New Roman"/>
+        <w:t xml:space="preserve">Ziółkowski P., </w:t>
+      </w:r>
+      <w:r>
+        <w:rPr>
+          <w:rFonts w:ascii="Times New Roman" w:hAnsi="Times New Roman" w:cs="Times New Roman" w:eastAsia="Times New Roman"/>
+          <w:b w:val="0"/>
           <w:i/>
           <w:sz w:val="24"/>
         </w:rPr>
-        <w:t>Drama wzmacnia</w:t>
-      </w:r>
-      <w:r>
-        <w:rPr>
-          <w:rFonts w:ascii="Times New Roman" w:hAnsi="Times New Roman" w:cs="Times New Roman" w:eastAsia="Times New Roman"/>
+        <w:t>Wybrane kompetencje społeczne. Skrypt dla studentów</w:t>
+      </w:r>
+      <w:r>
+        <w:rPr>
+          <w:rFonts w:ascii="Times New Roman" w:hAnsi="Times New Roman" w:cs="Times New Roman" w:eastAsia="Times New Roman"/>
+          <w:b w:val="0"/>
           <w:i w:val="0"/>
           <w:sz w:val="24"/>
         </w:rPr>
-        <w:t xml:space="preserve">, [w:] </w:t>
-      </w:r>
-      <w:r>
-        <w:rPr>
-          <w:rFonts w:ascii="Times New Roman" w:hAnsi="Times New Roman" w:cs="Times New Roman" w:eastAsia="Times New Roman"/>
-          <w:i/>
-          <w:sz w:val="24"/>
-        </w:rPr>
-        <w:t>Drama wzmacnia. Metoda dramy w edukacji antydyskryminacyjnej i obywatelskiej</w:t>
-      </w:r>
-      <w:r>
-        <w:rPr>
-          <w:rFonts w:ascii="Times New Roman" w:hAnsi="Times New Roman" w:cs="Times New Roman" w:eastAsia="Times New Roman"/>
-          <w:i w:val="0"/>
-          <w:sz w:val="24"/>
-        </w:rPr>
-        <w:t>, M. Winiarek-Kołucka (red.), Stowarzyszenie Praktyków Dramy Stop-Klatka, Warszawa 2016.</w:t>
+        <w:t>, Wydawnictwo Uczelniane Wyższej Szkoły Gospodarki, Bydgoszcz 2014.</w:t>
       </w:r>
     </w:p>
     <w:p>
@@ -2711,26 +3026,63 @@
       <w:r>
         <w:rPr>
           <w:rFonts w:ascii="Times New Roman" w:hAnsi="Times New Roman" w:cs="Times New Roman" w:eastAsia="Times New Roman"/>
+          <w:b w:val="0"/>
           <w:i w:val="0"/>
           <w:sz w:val="24"/>
         </w:rPr>
-        <w:t xml:space="preserve">Witerska K., </w:t>
-      </w:r>
-      <w:r>
-        <w:rPr>
-          <w:rFonts w:ascii="Times New Roman" w:hAnsi="Times New Roman" w:cs="Times New Roman" w:eastAsia="Times New Roman"/>
+        <w:t xml:space="preserve">Zyzik E., </w:t>
+      </w:r>
+      <w:r>
+        <w:rPr>
+          <w:rFonts w:ascii="Times New Roman" w:hAnsi="Times New Roman" w:cs="Times New Roman" w:eastAsia="Times New Roman"/>
+          <w:b w:val="0"/>
           <w:i/>
           <w:sz w:val="24"/>
         </w:rPr>
-        <w:t>Proces poszukiwania, formułowania i rozwiązywania problemów w dramie</w:t>
-      </w:r>
-      <w:r>
-        <w:rPr>
-          <w:rFonts w:ascii="Times New Roman" w:hAnsi="Times New Roman" w:cs="Times New Roman" w:eastAsia="Times New Roman"/>
+        <w:t>Kompetencja</w:t>
+      </w:r>
+      <w:r>
+        <w:rPr>
+          <w:rFonts w:ascii="Times New Roman" w:hAnsi="Times New Roman" w:cs="Times New Roman" w:eastAsia="Times New Roman"/>
+          <w:b w:val="0"/>
           <w:i w:val="0"/>
           <w:sz w:val="24"/>
         </w:rPr>
-        <w:t>, „Polski w Praktyce”, nr 5, 2009, s. 4–6.</w:t>
+        <w:t xml:space="preserve">, [w:] </w:t>
+      </w:r>
+      <w:r>
+        <w:rPr>
+          <w:rFonts w:ascii="Times New Roman" w:hAnsi="Times New Roman" w:cs="Times New Roman" w:eastAsia="Times New Roman"/>
+          <w:b w:val="0"/>
+          <w:i/>
+          <w:sz w:val="24"/>
+        </w:rPr>
+        <w:t>Mały leksykon pedagoga wczesnoszkolnego</w:t>
+      </w:r>
+      <w:r>
+        <w:rPr>
+          <w:rFonts w:ascii="Times New Roman" w:hAnsi="Times New Roman" w:cs="Times New Roman" w:eastAsia="Times New Roman"/>
+          <w:b w:val="0"/>
+          <w:i w:val="0"/>
+          <w:sz w:val="24"/>
+        </w:rPr>
+        <w:t>, J. Karbowniczek (red.), Instytut Wydawniczy Erica, Warszawa 2014.</w:t>
+      </w:r>
+    </w:p>
+    <w:p>
+      <w:pPr>
+        <w:keepNext/>
+        <w:spacing w:line="360" w:lineRule="auto" w:before="360" w:after="240"/>
+        <w:jc w:val="left"/>
+      </w:pPr>
+      <w:r>
+        <w:rPr>
+          <w:rFonts w:ascii="Times New Roman" w:hAnsi="Times New Roman" w:cs="Times New Roman" w:eastAsia="Times New Roman"/>
+          <w:b/>
+          <w:i w:val="0"/>
+          <w:sz w:val="24"/>
+        </w:rPr>
+        <w:t>Akty prawne</w:t>
       </w:r>
     </w:p>
     <w:p>
@@ -2742,26 +3094,11 @@
       <w:r>
         <w:rPr>
           <w:rFonts w:ascii="Times New Roman" w:hAnsi="Times New Roman" w:cs="Times New Roman" w:eastAsia="Times New Roman"/>
+          <w:b w:val="0"/>
           <w:i w:val="0"/>
           <w:sz w:val="24"/>
         </w:rPr>
-        <w:t xml:space="preserve">Witerska K., </w:t>
-      </w:r>
-      <w:r>
-        <w:rPr>
-          <w:rFonts w:ascii="Times New Roman" w:hAnsi="Times New Roman" w:cs="Times New Roman" w:eastAsia="Times New Roman"/>
-          <w:i/>
-          <w:sz w:val="24"/>
-        </w:rPr>
-        <w:t>Drama kreatywna – perspektywa rozwojowa</w:t>
-      </w:r>
-      <w:r>
-        <w:rPr>
-          <w:rFonts w:ascii="Times New Roman" w:hAnsi="Times New Roman" w:cs="Times New Roman" w:eastAsia="Times New Roman"/>
-          <w:i w:val="0"/>
-          <w:sz w:val="24"/>
-        </w:rPr>
-        <w:t>, „Chowanna”, t. 1 (36), 2011, s. 71–82.</w:t>
+        <w:t>Zalecenie Parlamentu Europejskiego i Rady z dnia 18 grudnia 2006 r. w sprawie kompetencji kluczowych w procesie uczenia się przez całe życie (Dz. Urz. UE L 394 z 30.12.2006).</w:t>
       </w:r>
     </w:p>
     <w:p>
@@ -2773,26 +3110,11 @@
       <w:r>
         <w:rPr>
           <w:rFonts w:ascii="Times New Roman" w:hAnsi="Times New Roman" w:cs="Times New Roman" w:eastAsia="Times New Roman"/>
+          <w:b w:val="0"/>
           <w:i w:val="0"/>
           <w:sz w:val="24"/>
         </w:rPr>
-        <w:t xml:space="preserve">Witerska K., </w:t>
-      </w:r>
-      <w:r>
-        <w:rPr>
-          <w:rFonts w:ascii="Times New Roman" w:hAnsi="Times New Roman" w:cs="Times New Roman" w:eastAsia="Times New Roman"/>
-          <w:i/>
-          <w:sz w:val="24"/>
-        </w:rPr>
-        <w:t>Drama. Techniki, strategie, scenariusze</w:t>
-      </w:r>
-      <w:r>
-        <w:rPr>
-          <w:rFonts w:ascii="Times New Roman" w:hAnsi="Times New Roman" w:cs="Times New Roman" w:eastAsia="Times New Roman"/>
-          <w:i w:val="0"/>
-          <w:sz w:val="24"/>
-        </w:rPr>
-        <w:t>, Difin, Warszawa 2011.</w:t>
+        <w:t>Rozporządzenie Ministra Edukacji Narodowej z dnia 14 lutego 2017 r. w sprawie podstawy programowej wychowania przedszkolnego oraz podstawy programowej kształcenia ogólnego dla szkoły podstawowej (Dz.U. 2017 poz. 356).</w:t>
       </w:r>
     </w:p>
     <w:p>
@@ -2804,26 +3126,27 @@
       <w:r>
         <w:rPr>
           <w:rFonts w:ascii="Times New Roman" w:hAnsi="Times New Roman" w:cs="Times New Roman" w:eastAsia="Times New Roman"/>
+          <w:b w:val="0"/>
           <w:i w:val="0"/>
           <w:sz w:val="24"/>
         </w:rPr>
-        <w:t xml:space="preserve">Witerska K., </w:t>
-      </w:r>
-      <w:r>
-        <w:rPr>
-          <w:rFonts w:ascii="Times New Roman" w:hAnsi="Times New Roman" w:cs="Times New Roman" w:eastAsia="Times New Roman"/>
-          <w:i/>
-          <w:sz w:val="24"/>
-        </w:rPr>
-        <w:t>Drama. Przewodnik po koncepcjach, technikach i miejscach</w:t>
-      </w:r>
-      <w:r>
-        <w:rPr>
-          <w:rFonts w:ascii="Times New Roman" w:hAnsi="Times New Roman" w:cs="Times New Roman" w:eastAsia="Times New Roman"/>
+        <w:t>Rozporządzenie Ministra Edukacji z dnia 11 marca 2026 r. w sprawie podstawy programowej wychowania przedszkolnego oraz podstawy programowej kształcenia ogólnego dla szkoły podstawowej, w tym dla uczniów z niepełnosprawnością intelektualną w stopniu umiarkowanym lub znacznym (Dz.U. 2026 poz. 378).</w:t>
+      </w:r>
+    </w:p>
+    <w:p>
+      <w:pPr>
+        <w:keepNext/>
+        <w:spacing w:line="360" w:lineRule="auto" w:before="360" w:after="240"/>
+        <w:jc w:val="left"/>
+      </w:pPr>
+      <w:r>
+        <w:rPr>
+          <w:rFonts w:ascii="Times New Roman" w:hAnsi="Times New Roman" w:cs="Times New Roman" w:eastAsia="Times New Roman"/>
+          <w:b/>
           <w:i w:val="0"/>
           <w:sz w:val="24"/>
         </w:rPr>
-        <w:t>, Difin, Warszawa 2014.</w:t>
+        <w:t>Netografia</w:t>
       </w:r>
     </w:p>
     <w:p>
@@ -2835,26 +3158,29 @@
       <w:r>
         <w:rPr>
           <w:rFonts w:ascii="Times New Roman" w:hAnsi="Times New Roman" w:cs="Times New Roman" w:eastAsia="Times New Roman"/>
+          <w:b w:val="0"/>
           <w:i w:val="0"/>
           <w:sz w:val="24"/>
         </w:rPr>
-        <w:t xml:space="preserve">Witerska K., </w:t>
-      </w:r>
-      <w:r>
-        <w:rPr>
-          <w:rFonts w:ascii="Times New Roman" w:hAnsi="Times New Roman" w:cs="Times New Roman" w:eastAsia="Times New Roman"/>
+        <w:t xml:space="preserve">Brząkała A., </w:t>
+      </w:r>
+      <w:r>
+        <w:rPr>
+          <w:rFonts w:ascii="Times New Roman" w:hAnsi="Times New Roman" w:cs="Times New Roman" w:eastAsia="Times New Roman"/>
+          <w:b w:val="0"/>
           <w:i/>
           <w:sz w:val="24"/>
         </w:rPr>
-        <w:t>Drama procesualna w pracy z dziećmi w przedszkolu i klasach I–III</w:t>
-      </w:r>
-      <w:r>
-        <w:rPr>
-          <w:rFonts w:ascii="Times New Roman" w:hAnsi="Times New Roman" w:cs="Times New Roman" w:eastAsia="Times New Roman"/>
+        <w:t>Sztuka pantomimy jako metoda wspomagająca komunikację w pracy z dziećmi z zaburzeniami ze spektrum autyzmu</w:t>
+      </w:r>
+      <w:r>
+        <w:rPr>
+          <w:rFonts w:ascii="Times New Roman" w:hAnsi="Times New Roman" w:cs="Times New Roman" w:eastAsia="Times New Roman"/>
+          <w:b w:val="0"/>
           <w:i w:val="0"/>
           <w:sz w:val="24"/>
         </w:rPr>
-        <w:t>, Difin, Warszawa 2021.</w:t>
+        <w:t>, https://pedagogika-specjalna.edu.pl/wp-content/uploads/2018/09/Pantomima-ZSS-S%C5%82upia.pdf (dostęp: 26.04.2026).</w:t>
       </w:r>
     </w:p>
     <w:p>
@@ -2866,26 +3192,20 @@
       <w:r>
         <w:rPr>
           <w:rFonts w:ascii="Times New Roman" w:hAnsi="Times New Roman" w:cs="Times New Roman" w:eastAsia="Times New Roman"/>
+          <w:b w:val="0"/>
+          <w:i/>
+          <w:sz w:val="24"/>
+        </w:rPr>
+        <w:t>Drama i jej walory w pracy z dziećmi</w:t>
+      </w:r>
+      <w:r>
+        <w:rPr>
+          <w:rFonts w:ascii="Times New Roman" w:hAnsi="Times New Roman" w:cs="Times New Roman" w:eastAsia="Times New Roman"/>
+          <w:b w:val="0"/>
           <w:i w:val="0"/>
           <w:sz w:val="24"/>
         </w:rPr>
-        <w:t xml:space="preserve">Witerska K., </w:t>
-      </w:r>
-      <w:r>
-        <w:rPr>
-          <w:rFonts w:ascii="Times New Roman" w:hAnsi="Times New Roman" w:cs="Times New Roman" w:eastAsia="Times New Roman"/>
-          <w:i/>
-          <w:sz w:val="24"/>
-        </w:rPr>
-        <w:t>Play it Out Loud. The Use of Drama When Working with Shy Children</w:t>
-      </w:r>
-      <w:r>
-        <w:rPr>
-          <w:rFonts w:ascii="Times New Roman" w:hAnsi="Times New Roman" w:cs="Times New Roman" w:eastAsia="Times New Roman"/>
-          <w:i w:val="0"/>
-          <w:sz w:val="24"/>
-        </w:rPr>
-        <w:t>, „Kultura i Wychowanie”, nr 2 (20), 2021, s. 87–104.</w:t>
+        <w:t>, https://www.profesor.pl/publikacja,13690,Artykuly,Drama-i-jej-walory-w-pracy-z-dziecmi (dostęp: 12.04.2026).</w:t>
       </w:r>
     </w:p>
     <w:p>
@@ -2897,26 +3217,20 @@
       <w:r>
         <w:rPr>
           <w:rFonts w:ascii="Times New Roman" w:hAnsi="Times New Roman" w:cs="Times New Roman" w:eastAsia="Times New Roman"/>
+          <w:b w:val="0"/>
+          <w:i/>
+          <w:sz w:val="24"/>
+        </w:rPr>
+        <w:t>Drama – możliwości i zagrożenia. Zarys problematyki</w:t>
+      </w:r>
+      <w:r>
+        <w:rPr>
+          <w:rFonts w:ascii="Times New Roman" w:hAnsi="Times New Roman" w:cs="Times New Roman" w:eastAsia="Times New Roman"/>
+          <w:b w:val="0"/>
           <w:i w:val="0"/>
           <w:sz w:val="24"/>
         </w:rPr>
-        <w:t xml:space="preserve">Wróblewska H. M., </w:t>
-      </w:r>
-      <w:r>
-        <w:rPr>
-          <w:rFonts w:ascii="Times New Roman" w:hAnsi="Times New Roman" w:cs="Times New Roman" w:eastAsia="Times New Roman"/>
-          <w:i/>
-          <w:sz w:val="24"/>
-        </w:rPr>
-        <w:t>Kompetencje społeczne przestrzenią i doświadczaniem dialogu</w:t>
-      </w:r>
-      <w:r>
-        <w:rPr>
-          <w:rFonts w:ascii="Times New Roman" w:hAnsi="Times New Roman" w:cs="Times New Roman" w:eastAsia="Times New Roman"/>
-          <w:i w:val="0"/>
-          <w:sz w:val="24"/>
-        </w:rPr>
-        <w:t>, „Studia z Teorii Wychowania”, t. IX, nr 2 (23), 2018, s. 41–60.</w:t>
+        <w:t>, https://open.icm.edu.pl/bitstreams/846d44e0-c526-4039-8b4a-5e6423f2e765/download (dostęp: 12.04.2026).</w:t>
       </w:r>
     </w:p>
     <w:p>
@@ -2928,26 +3242,38 @@
       <w:r>
         <w:rPr>
           <w:rFonts w:ascii="Times New Roman" w:hAnsi="Times New Roman" w:cs="Times New Roman" w:eastAsia="Times New Roman"/>
+          <w:b w:val="0"/>
+          <w:i/>
+          <w:sz w:val="24"/>
+        </w:rPr>
+        <w:t>Drama</w:t>
+      </w:r>
+      <w:r>
+        <w:rPr>
+          <w:rFonts w:ascii="Times New Roman" w:hAnsi="Times New Roman" w:cs="Times New Roman" w:eastAsia="Times New Roman"/>
+          <w:b w:val="0"/>
           <w:i w:val="0"/>
           <w:sz w:val="24"/>
         </w:rPr>
-        <w:t xml:space="preserve">Zaczyński W., </w:t>
-      </w:r>
-      <w:r>
-        <w:rPr>
-          <w:rFonts w:ascii="Times New Roman" w:hAnsi="Times New Roman" w:cs="Times New Roman" w:eastAsia="Times New Roman"/>
+        <w:t xml:space="preserve">, [w:] </w:t>
+      </w:r>
+      <w:r>
+        <w:rPr>
+          <w:rFonts w:ascii="Times New Roman" w:hAnsi="Times New Roman" w:cs="Times New Roman" w:eastAsia="Times New Roman"/>
+          <w:b w:val="0"/>
           <w:i/>
           <w:sz w:val="24"/>
         </w:rPr>
-        <w:t>Praca badawcza nauczyciela</w:t>
-      </w:r>
-      <w:r>
-        <w:rPr>
-          <w:rFonts w:ascii="Times New Roman" w:hAnsi="Times New Roman" w:cs="Times New Roman" w:eastAsia="Times New Roman"/>
+        <w:t>Słownik języka polskiego PWN</w:t>
+      </w:r>
+      <w:r>
+        <w:rPr>
+          <w:rFonts w:ascii="Times New Roman" w:hAnsi="Times New Roman" w:cs="Times New Roman" w:eastAsia="Times New Roman"/>
+          <w:b w:val="0"/>
           <w:i w:val="0"/>
           <w:sz w:val="24"/>
         </w:rPr>
-        <w:t>, Wydawnictwa Szkolne i Pedagogiczne, Warszawa 1995.</w:t>
+        <w:t>, https://sjp.pwn.pl/slowniki/drama.html (dostęp: 03.12.2025).</w:t>
       </w:r>
     </w:p>
     <w:p>
@@ -2959,10 +3285,38 @@
       <w:r>
         <w:rPr>
           <w:rFonts w:ascii="Times New Roman" w:hAnsi="Times New Roman" w:cs="Times New Roman" w:eastAsia="Times New Roman"/>
+          <w:b w:val="0"/>
+          <w:i/>
+          <w:sz w:val="24"/>
+        </w:rPr>
+        <w:t>Drama</w:t>
+      </w:r>
+      <w:r>
+        <w:rPr>
+          <w:rFonts w:ascii="Times New Roman" w:hAnsi="Times New Roman" w:cs="Times New Roman" w:eastAsia="Times New Roman"/>
+          <w:b w:val="0"/>
           <w:i w:val="0"/>
           <w:sz w:val="24"/>
         </w:rPr>
-        <w:t>Zalecenie Parlamentu Europejskiego i Rady z dnia 18 grudnia 2006 r. w sprawie kompetencji kluczowych w procesie uczenia się przez całe życie (Dz. Urz. UE L 394 z 30.12.2006).</w:t>
+        <w:t xml:space="preserve">, [w:] </w:t>
+      </w:r>
+      <w:r>
+        <w:rPr>
+          <w:rFonts w:ascii="Times New Roman" w:hAnsi="Times New Roman" w:cs="Times New Roman" w:eastAsia="Times New Roman"/>
+          <w:b w:val="0"/>
+          <w:i/>
+          <w:sz w:val="24"/>
+        </w:rPr>
+        <w:t>Wielki słownik języka polskiego PAN</w:t>
+      </w:r>
+      <w:r>
+        <w:rPr>
+          <w:rFonts w:ascii="Times New Roman" w:hAnsi="Times New Roman" w:cs="Times New Roman" w:eastAsia="Times New Roman"/>
+          <w:b w:val="0"/>
+          <w:i w:val="0"/>
+          <w:sz w:val="24"/>
+        </w:rPr>
+        <w:t>, Instytut Języka Polskiego PAN, https://wsjp.pl/haslo/podglad/52454/drama/5153346/w-edukacji (dostęp: 03.12.2025).</w:t>
       </w:r>
     </w:p>
     <w:p>
@@ -2974,26 +3328,29 @@
       <w:r>
         <w:rPr>
           <w:rFonts w:ascii="Times New Roman" w:hAnsi="Times New Roman" w:cs="Times New Roman" w:eastAsia="Times New Roman"/>
+          <w:b w:val="0"/>
           <w:i w:val="0"/>
           <w:sz w:val="24"/>
         </w:rPr>
-        <w:t xml:space="preserve">Ziółkowski P., </w:t>
-      </w:r>
-      <w:r>
-        <w:rPr>
-          <w:rFonts w:ascii="Times New Roman" w:hAnsi="Times New Roman" w:cs="Times New Roman" w:eastAsia="Times New Roman"/>
+        <w:t xml:space="preserve">Góralczyk K., </w:t>
+      </w:r>
+      <w:r>
+        <w:rPr>
+          <w:rFonts w:ascii="Times New Roman" w:hAnsi="Times New Roman" w:cs="Times New Roman" w:eastAsia="Times New Roman"/>
+          <w:b w:val="0"/>
           <w:i/>
           <w:sz w:val="24"/>
         </w:rPr>
-        <w:t>Wybrane kompetencje społeczne. Skrypt dla studentów</w:t>
-      </w:r>
-      <w:r>
-        <w:rPr>
-          <w:rFonts w:ascii="Times New Roman" w:hAnsi="Times New Roman" w:cs="Times New Roman" w:eastAsia="Times New Roman"/>
+        <w:t>Techniki dramy. Część 2</w:t>
+      </w:r>
+      <w:r>
+        <w:rPr>
+          <w:rFonts w:ascii="Times New Roman" w:hAnsi="Times New Roman" w:cs="Times New Roman" w:eastAsia="Times New Roman"/>
+          <w:b w:val="0"/>
           <w:i w:val="0"/>
           <w:sz w:val="24"/>
         </w:rPr>
-        <w:t>, Wydawnictwo Uczelniane Wyższej Szkoły Gospodarki, Bydgoszcz 2014.</w:t>
+        <w:t>, https://katarzynagoralczyk.weebly.com/blog/techniki-dramy-czesc-2 (dostęp: 30.04.2026).</w:t>
       </w:r>
     </w:p>
     <w:p>
@@ -3005,42 +3362,29 @@
       <w:r>
         <w:rPr>
           <w:rFonts w:ascii="Times New Roman" w:hAnsi="Times New Roman" w:cs="Times New Roman" w:eastAsia="Times New Roman"/>
+          <w:b w:val="0"/>
           <w:i w:val="0"/>
           <w:sz w:val="24"/>
         </w:rPr>
-        <w:t xml:space="preserve">Zyzik E., </w:t>
-      </w:r>
-      <w:r>
-        <w:rPr>
-          <w:rFonts w:ascii="Times New Roman" w:hAnsi="Times New Roman" w:cs="Times New Roman" w:eastAsia="Times New Roman"/>
+        <w:t xml:space="preserve">Knopp K. A., </w:t>
+      </w:r>
+      <w:r>
+        <w:rPr>
+          <w:rFonts w:ascii="Times New Roman" w:hAnsi="Times New Roman" w:cs="Times New Roman" w:eastAsia="Times New Roman"/>
+          <w:b w:val="0"/>
           <w:i/>
           <w:sz w:val="24"/>
         </w:rPr>
-        <w:t>Kompetencja</w:t>
-      </w:r>
-      <w:r>
-        <w:rPr>
-          <w:rFonts w:ascii="Times New Roman" w:hAnsi="Times New Roman" w:cs="Times New Roman" w:eastAsia="Times New Roman"/>
+        <w:t>Kompetencje społeczne – pomiar i aplikacja praktyczna</w:t>
+      </w:r>
+      <w:r>
+        <w:rPr>
+          <w:rFonts w:ascii="Times New Roman" w:hAnsi="Times New Roman" w:cs="Times New Roman" w:eastAsia="Times New Roman"/>
+          <w:b w:val="0"/>
           <w:i w:val="0"/>
           <w:sz w:val="24"/>
         </w:rPr>
-        <w:t xml:space="preserve">, [w:] </w:t>
-      </w:r>
-      <w:r>
-        <w:rPr>
-          <w:rFonts w:ascii="Times New Roman" w:hAnsi="Times New Roman" w:cs="Times New Roman" w:eastAsia="Times New Roman"/>
-          <w:i/>
-          <w:sz w:val="24"/>
-        </w:rPr>
-        <w:t>Mały leksykon pedagoga wczesnoszkolnego</w:t>
-      </w:r>
-      <w:r>
-        <w:rPr>
-          <w:rFonts w:ascii="Times New Roman" w:hAnsi="Times New Roman" w:cs="Times New Roman" w:eastAsia="Times New Roman"/>
-          <w:i w:val="0"/>
-          <w:sz w:val="24"/>
-        </w:rPr>
-        <w:t>, J. Karbowniczek (red.), Instytut Wydawniczy Erica, Warszawa 2014.</w:t>
+        <w:t>, https://ore.edu.pl/wp-content/uploads/phocadownload/pracownie/kompetencje-spoeczne-pomiar-i-aplikacja-praktyczna.wystpienie_-k.knopp.pdf (dostęp: 12.04.2026).</w:t>
       </w:r>
     </w:p>
     <w:sectPr>
@@ -3422,7 +3766,6 @@
     <w:rPr>
       <w:rFonts w:ascii="Times New Roman" w:hAnsi="Times New Roman" w:cs="Times New Roman" w:eastAsia="Times New Roman"/>
       <w:sz w:val="24"/>
-      <w:lang w:val="pl-PL"/>
     </w:rPr>
   </w:style>
   <w:style w:type="paragraph" w:styleId="Header">

</xml_diff>